<commit_message>
upload class 9 chapter 2,3,4,5
</commit_message>
<xml_diff>
--- a/pdf/class 9/Class 9 ch-3 _ Elementary concept of object and class.docx
+++ b/pdf/class 9/Class 9 ch-3 _ Elementary concept of object and class.docx
@@ -1,10 +1,11 @@
 
 <file path=word/document.xml><?xml version="1.0" encoding="utf-8"?>
-<w:document xmlns:wpc="http://schemas.microsoft.com/office/word/2010/wordprocessingCanvas" xmlns:mc="http://schemas.openxmlformats.org/markup-compatibility/2006" xmlns:o="urn:schemas-microsoft-com:office:office" xmlns:r="http://schemas.openxmlformats.org/officeDocument/2006/relationships" xmlns:m="http://schemas.openxmlformats.org/officeDocument/2006/math" xmlns:v="urn:schemas-microsoft-com:vml" xmlns:wp14="http://schemas.microsoft.com/office/word/2010/wordprocessingDrawing" xmlns:wp="http://schemas.openxmlformats.org/drawingml/2006/wordprocessingDrawing" xmlns:w10="urn:schemas-microsoft-com:office:word" xmlns:w="http://schemas.openxmlformats.org/wordprocessingml/2006/main" xmlns:w14="http://schemas.microsoft.com/office/word/2010/wordml" xmlns:wpg="http://schemas.microsoft.com/office/word/2010/wordprocessingGroup" xmlns:wpi="http://schemas.microsoft.com/office/word/2010/wordprocessingInk" xmlns:wne="http://schemas.microsoft.com/office/word/2006/wordml" xmlns:wps="http://schemas.microsoft.com/office/word/2010/wordprocessingShape" mc:Ignorable="w14 wp14">
+<w:document xmlns:wpc="http://schemas.microsoft.com/office/word/2010/wordprocessingCanvas" xmlns:mc="http://schemas.openxmlformats.org/markup-compatibility/2006" xmlns:o="urn:schemas-microsoft-com:office:office" xmlns:r="http://schemas.openxmlformats.org/officeDocument/2006/relationships" xmlns:m="http://schemas.openxmlformats.org/officeDocument/2006/math" xmlns:v="urn:schemas-microsoft-com:vml" xmlns:wp14="http://schemas.microsoft.com/office/word/2010/wordprocessingDrawing" xmlns:wp="http://schemas.openxmlformats.org/drawingml/2006/wordprocessingDrawing" xmlns:w10="urn:schemas-microsoft-com:office:word" xmlns:w="http://schemas.openxmlformats.org/wordprocessingml/2006/main" xmlns:w14="http://schemas.microsoft.com/office/word/2010/wordml" xmlns:w15="http://schemas.microsoft.com/office/word/2012/wordml" xmlns:wpg="http://schemas.microsoft.com/office/word/2010/wordprocessingGroup" xmlns:wpi="http://schemas.microsoft.com/office/word/2010/wordprocessingInk" xmlns:wne="http://schemas.microsoft.com/office/word/2006/wordml" xmlns:wps="http://schemas.microsoft.com/office/word/2010/wordprocessingShape" mc:Ignorable="w14 w15 wp14">
   <w:background w:color="DBE5F1" w:themeColor="accent1" w:themeTint="33"/>
   <w:body>
     <w:p>
       <w:pPr>
+        <w:spacing w:after="0"/>
         <w:jc w:val="center"/>
         <w:rPr>
           <w:rFonts w:ascii="Times New Roman" w:hAnsi="Times New Roman" w:cs="Times New Roman"/>
@@ -22,9 +23,19 @@
         </w:rPr>
         <w:t>Class 9 chapter 3</w:t>
       </w:r>
-    </w:p>
-    <w:p>
-      <w:pPr>
+      <w:r>
+        <w:rPr>
+          <w:rFonts w:ascii="Times New Roman" w:hAnsi="Times New Roman" w:cs="Times New Roman"/>
+          <w:b/>
+          <w:color w:val="FF0000"/>
+          <w:sz w:val="48"/>
+        </w:rPr>
+        <w:t>(2026-27)</w:t>
+      </w:r>
+    </w:p>
+    <w:p>
+      <w:pPr>
+        <w:spacing w:after="0"/>
         <w:jc w:val="center"/>
         <w:rPr>
           <w:rFonts w:ascii="Times New Roman" w:hAnsi="Times New Roman" w:cs="Times New Roman"/>
@@ -47,7 +58,2763 @@
     </w:p>
     <w:p>
       <w:pPr>
-        <w:spacing w:before="100" w:beforeAutospacing="1" w:after="100" w:afterAutospacing="1" w:line="240" w:lineRule="auto"/>
+        <w:pStyle w:val="Heading1"/>
+        <w:rPr>
+          <w:color w:val="00B0F0"/>
+          <w:sz w:val="36"/>
+        </w:rPr>
+      </w:pPr>
+      <w:r>
+        <w:rPr>
+          <w:rFonts w:ascii="Segoe UI Symbol" w:hAnsi="Segoe UI Symbol" w:cs="Segoe UI Symbol"/>
+          <w:color w:val="00B0F0"/>
+          <w:sz w:val="36"/>
+        </w:rPr>
+        <w:t>✅</w:t>
+      </w:r>
+      <w:r>
+        <w:rPr>
+          <w:color w:val="00B0F0"/>
+          <w:sz w:val="36"/>
+        </w:rPr>
+        <w:t xml:space="preserve"> </w:t>
+      </w:r>
+      <w:r>
+        <w:rPr>
+          <w:rStyle w:val="Strong"/>
+          <w:bCs w:val="0"/>
+          <w:color w:val="00B0F0"/>
+          <w:sz w:val="36"/>
+        </w:rPr>
+        <w:t>A. Tick (</w:t>
+      </w:r>
+      <w:r>
+        <w:rPr>
+          <w:rStyle w:val="Strong"/>
+          <w:rFonts w:ascii="Segoe UI Symbol" w:hAnsi="Segoe UI Symbol" w:cs="Segoe UI Symbol"/>
+          <w:bCs w:val="0"/>
+          <w:color w:val="00B0F0"/>
+          <w:sz w:val="36"/>
+        </w:rPr>
+        <w:t>✓</w:t>
+      </w:r>
+      <w:r>
+        <w:rPr>
+          <w:rStyle w:val="Strong"/>
+          <w:bCs w:val="0"/>
+          <w:color w:val="00B0F0"/>
+          <w:sz w:val="36"/>
+        </w:rPr>
+        <w:t>) the correct answer</w:t>
+      </w:r>
+    </w:p>
+    <w:p>
+      <w:pPr>
+        <w:pStyle w:val="Heading3"/>
+        <w:spacing w:after="0" w:afterAutospacing="0"/>
+        <w:rPr>
+          <w:color w:val="00B050"/>
+        </w:rPr>
+      </w:pPr>
+      <w:r>
+        <w:rPr>
+          <w:rStyle w:val="Strong"/>
+          <w:b/>
+          <w:bCs/>
+          <w:color w:val="00B050"/>
+        </w:rPr>
+        <w:t xml:space="preserve">1. A class consists of ______ and </w:t>
+      </w:r>
+      <w:proofErr w:type="spellStart"/>
+      <w:r>
+        <w:rPr>
+          <w:rStyle w:val="Strong"/>
+          <w:b/>
+          <w:bCs/>
+          <w:color w:val="00B050"/>
+        </w:rPr>
+        <w:t>behaviour</w:t>
+      </w:r>
+      <w:proofErr w:type="spellEnd"/>
+      <w:r>
+        <w:rPr>
+          <w:rStyle w:val="Strong"/>
+          <w:b/>
+          <w:bCs/>
+          <w:color w:val="00B050"/>
+        </w:rPr>
+        <w:t xml:space="preserve"> which are used to create objects.</w:t>
+      </w:r>
+    </w:p>
+    <w:p>
+      <w:pPr>
+        <w:pStyle w:val="NormalWeb"/>
+        <w:spacing w:after="0" w:afterAutospacing="0"/>
+        <w:ind w:left="360"/>
+      </w:pPr>
+      <w:r>
+        <w:t>a. Characteristics</w:t>
+      </w:r>
+      <w:r>
+        <w:br/>
+        <w:t>b. blueprint</w:t>
+      </w:r>
+      <w:r>
+        <w:br/>
+        <w:t>c. function</w:t>
+      </w:r>
+      <w:r>
+        <w:br/>
+        <w:t>d. methods</w:t>
+      </w:r>
+    </w:p>
+    <w:p>
+      <w:pPr>
+        <w:pStyle w:val="NormalWeb"/>
+        <w:spacing w:after="0" w:afterAutospacing="0"/>
+        <w:rPr>
+          <w:color w:val="FF0000"/>
+        </w:rPr>
+      </w:pPr>
+      <w:r>
+        <w:rPr>
+          <w:rStyle w:val="Strong"/>
+          <w:color w:val="FF0000"/>
+        </w:rPr>
+        <w:t>Answer:</w:t>
+      </w:r>
+      <w:r>
+        <w:rPr>
+          <w:color w:val="FF0000"/>
+        </w:rPr>
+        <w:t xml:space="preserve"> a. Characteristics </w:t>
+      </w:r>
+      <w:r>
+        <w:rPr>
+          <w:rFonts w:ascii="Segoe UI Symbol" w:hAnsi="Segoe UI Symbol" w:cs="Segoe UI Symbol"/>
+          <w:color w:val="FF0000"/>
+        </w:rPr>
+        <w:t>✅</w:t>
+      </w:r>
+    </w:p>
+    <w:p>
+      <w:pPr>
+        <w:pStyle w:val="Heading3"/>
+        <w:spacing w:after="0" w:afterAutospacing="0"/>
+        <w:rPr>
+          <w:color w:val="00B050"/>
+        </w:rPr>
+      </w:pPr>
+      <w:r>
+        <w:rPr>
+          <w:rStyle w:val="Strong"/>
+          <w:b/>
+          <w:bCs/>
+          <w:color w:val="00B050"/>
+        </w:rPr>
+        <w:t>2. ______ primitive data types are ______.</w:t>
+      </w:r>
+    </w:p>
+    <w:p>
+      <w:pPr>
+        <w:pStyle w:val="NormalWeb"/>
+        <w:spacing w:after="0" w:afterAutospacing="0"/>
+        <w:ind w:left="360"/>
+      </w:pPr>
+      <w:proofErr w:type="gramStart"/>
+      <w:r>
+        <w:t>a</w:t>
+      </w:r>
+      <w:proofErr w:type="gramEnd"/>
+      <w:r>
+        <w:t xml:space="preserve">. </w:t>
+      </w:r>
+      <w:proofErr w:type="spellStart"/>
+      <w:r>
+        <w:t>int</w:t>
+      </w:r>
+      <w:proofErr w:type="spellEnd"/>
+      <w:r>
+        <w:t>, double</w:t>
+      </w:r>
+      <w:r>
+        <w:br/>
+        <w:t xml:space="preserve">b. </w:t>
+      </w:r>
+      <w:proofErr w:type="spellStart"/>
+      <w:r>
+        <w:t>int</w:t>
+      </w:r>
+      <w:proofErr w:type="spellEnd"/>
+      <w:r>
+        <w:t>, class</w:t>
+      </w:r>
+      <w:r>
+        <w:br/>
+        <w:t>c. interface, array</w:t>
+      </w:r>
+      <w:r>
+        <w:br/>
+        <w:t>d. interface, object</w:t>
+      </w:r>
+    </w:p>
+    <w:p>
+      <w:pPr>
+        <w:pStyle w:val="NormalWeb"/>
+        <w:spacing w:after="0" w:afterAutospacing="0"/>
+        <w:rPr>
+          <w:color w:val="FF0000"/>
+        </w:rPr>
+      </w:pPr>
+      <w:r>
+        <w:rPr>
+          <w:rStyle w:val="Strong"/>
+          <w:color w:val="FF0000"/>
+        </w:rPr>
+        <w:t>Answer:</w:t>
+      </w:r>
+      <w:r>
+        <w:rPr>
+          <w:color w:val="FF0000"/>
+        </w:rPr>
+        <w:t xml:space="preserve"> a. </w:t>
+      </w:r>
+      <w:proofErr w:type="spellStart"/>
+      <w:r>
+        <w:rPr>
+          <w:color w:val="FF0000"/>
+        </w:rPr>
+        <w:t>int</w:t>
+      </w:r>
+      <w:proofErr w:type="spellEnd"/>
+      <w:r>
+        <w:rPr>
+          <w:color w:val="FF0000"/>
+        </w:rPr>
+        <w:t xml:space="preserve">, double </w:t>
+      </w:r>
+      <w:r>
+        <w:rPr>
+          <w:rFonts w:ascii="Segoe UI Symbol" w:hAnsi="Segoe UI Symbol" w:cs="Segoe UI Symbol"/>
+          <w:color w:val="FF0000"/>
+        </w:rPr>
+        <w:t>✅</w:t>
+      </w:r>
+    </w:p>
+    <w:p>
+      <w:pPr>
+        <w:pStyle w:val="Heading3"/>
+        <w:spacing w:after="0" w:afterAutospacing="0"/>
+        <w:rPr>
+          <w:color w:val="00B050"/>
+        </w:rPr>
+      </w:pPr>
+      <w:r>
+        <w:rPr>
+          <w:rStyle w:val="Strong"/>
+          <w:b/>
+          <w:bCs/>
+          <w:color w:val="00B050"/>
+        </w:rPr>
+        <w:t>3. Another class is also called an/a ______.</w:t>
+      </w:r>
+    </w:p>
+    <w:p>
+      <w:pPr>
+        <w:pStyle w:val="NormalWeb"/>
+        <w:spacing w:after="0" w:afterAutospacing="0"/>
+        <w:ind w:left="360"/>
+      </w:pPr>
+      <w:proofErr w:type="gramStart"/>
+      <w:r>
+        <w:t>a</w:t>
+      </w:r>
+      <w:proofErr w:type="gramEnd"/>
+      <w:r>
+        <w:t>. object</w:t>
+      </w:r>
+      <w:r>
+        <w:br/>
+        <w:t>b. Java</w:t>
+      </w:r>
+      <w:r>
+        <w:br/>
+        <w:t>c. class</w:t>
+      </w:r>
+      <w:r>
+        <w:br/>
+        <w:t>d. Access specifier</w:t>
+      </w:r>
+    </w:p>
+    <w:p>
+      <w:pPr>
+        <w:pStyle w:val="NormalWeb"/>
+        <w:spacing w:after="0" w:afterAutospacing="0"/>
+        <w:rPr>
+          <w:color w:val="FF0000"/>
+        </w:rPr>
+      </w:pPr>
+      <w:r>
+        <w:rPr>
+          <w:rStyle w:val="Strong"/>
+          <w:color w:val="FF0000"/>
+        </w:rPr>
+        <w:t>Answer:</w:t>
+      </w:r>
+      <w:r>
+        <w:rPr>
+          <w:color w:val="FF0000"/>
+        </w:rPr>
+        <w:t xml:space="preserve"> c. class </w:t>
+      </w:r>
+      <w:r>
+        <w:rPr>
+          <w:rFonts w:ascii="Segoe UI Symbol" w:hAnsi="Segoe UI Symbol" w:cs="Segoe UI Symbol"/>
+          <w:color w:val="FF0000"/>
+        </w:rPr>
+        <w:t>✅</w:t>
+      </w:r>
+    </w:p>
+    <w:p>
+      <w:pPr>
+        <w:pStyle w:val="Heading3"/>
+        <w:spacing w:after="0" w:afterAutospacing="0"/>
+        <w:rPr>
+          <w:color w:val="00B050"/>
+        </w:rPr>
+      </w:pPr>
+      <w:r>
+        <w:rPr>
+          <w:rStyle w:val="Strong"/>
+          <w:b/>
+          <w:bCs/>
+          <w:color w:val="00B050"/>
+        </w:rPr>
+        <w:t>4. What is class in Java?</w:t>
+      </w:r>
+    </w:p>
+    <w:p>
+      <w:pPr>
+        <w:pStyle w:val="NormalWeb"/>
+        <w:spacing w:after="0" w:afterAutospacing="0"/>
+        <w:ind w:left="360"/>
+      </w:pPr>
+      <w:r>
+        <w:t>a. A runtime instance of an object</w:t>
+      </w:r>
+      <w:r>
+        <w:br/>
+        <w:t>b. A template or blueprint to create objects</w:t>
+      </w:r>
+      <w:r>
+        <w:br/>
+        <w:t>c. A method to execute specific logic</w:t>
+      </w:r>
+      <w:r>
+        <w:br/>
+        <w:t>d. A collection of unrelated methods</w:t>
+      </w:r>
+    </w:p>
+    <w:p>
+      <w:pPr>
+        <w:pStyle w:val="NormalWeb"/>
+        <w:spacing w:after="0" w:afterAutospacing="0"/>
+        <w:rPr>
+          <w:color w:val="FF0000"/>
+        </w:rPr>
+      </w:pPr>
+      <w:r>
+        <w:rPr>
+          <w:rStyle w:val="Strong"/>
+          <w:color w:val="FF0000"/>
+        </w:rPr>
+        <w:t>Answer:</w:t>
+      </w:r>
+      <w:r>
+        <w:rPr>
+          <w:color w:val="FF0000"/>
+        </w:rPr>
+        <w:t xml:space="preserve"> b. </w:t>
+      </w:r>
+      <w:proofErr w:type="gramStart"/>
+      <w:r>
+        <w:rPr>
+          <w:color w:val="FF0000"/>
+        </w:rPr>
+        <w:t>A</w:t>
+      </w:r>
+      <w:proofErr w:type="gramEnd"/>
+      <w:r>
+        <w:rPr>
+          <w:color w:val="FF0000"/>
+        </w:rPr>
+        <w:t xml:space="preserve"> template or blueprint to create objects </w:t>
+      </w:r>
+      <w:r>
+        <w:rPr>
+          <w:rFonts w:ascii="Segoe UI Symbol" w:hAnsi="Segoe UI Symbol" w:cs="Segoe UI Symbol"/>
+          <w:color w:val="FF0000"/>
+        </w:rPr>
+        <w:t>✅</w:t>
+      </w:r>
+    </w:p>
+    <w:p>
+      <w:pPr>
+        <w:pStyle w:val="Heading3"/>
+        <w:spacing w:after="0" w:afterAutospacing="0"/>
+        <w:rPr>
+          <w:color w:val="00B050"/>
+        </w:rPr>
+      </w:pPr>
+      <w:r>
+        <w:rPr>
+          <w:rStyle w:val="Strong"/>
+          <w:b/>
+          <w:bCs/>
+          <w:color w:val="00B050"/>
+        </w:rPr>
+        <w:t>5. ______ defines the properties or state of an object.</w:t>
+      </w:r>
+    </w:p>
+    <w:p>
+      <w:pPr>
+        <w:pStyle w:val="NormalWeb"/>
+        <w:spacing w:after="0" w:afterAutospacing="0"/>
+        <w:ind w:left="360"/>
+      </w:pPr>
+      <w:r>
+        <w:lastRenderedPageBreak/>
+        <w:t xml:space="preserve">a. Data </w:t>
+      </w:r>
+      <w:proofErr w:type="gramStart"/>
+      <w:r>
+        <w:t>members</w:t>
+      </w:r>
+      <w:proofErr w:type="gramEnd"/>
+      <w:r>
+        <w:br/>
+        <w:t>b. Methods</w:t>
+      </w:r>
+      <w:r>
+        <w:br/>
+        <w:t xml:space="preserve">c. Both </w:t>
+      </w:r>
+      <w:proofErr w:type="gramStart"/>
+      <w:r>
+        <w:t>a and</w:t>
+      </w:r>
+      <w:proofErr w:type="gramEnd"/>
+      <w:r>
+        <w:t xml:space="preserve"> b</w:t>
+      </w:r>
+      <w:r>
+        <w:br/>
+        <w:t>d. None of these</w:t>
+      </w:r>
+    </w:p>
+    <w:p>
+      <w:pPr>
+        <w:pStyle w:val="NormalWeb"/>
+        <w:spacing w:after="0" w:afterAutospacing="0"/>
+        <w:rPr>
+          <w:color w:val="FF0000"/>
+        </w:rPr>
+      </w:pPr>
+      <w:r>
+        <w:rPr>
+          <w:rStyle w:val="Strong"/>
+          <w:color w:val="FF0000"/>
+        </w:rPr>
+        <w:t>Answer:</w:t>
+      </w:r>
+      <w:r>
+        <w:rPr>
+          <w:color w:val="FF0000"/>
+        </w:rPr>
+        <w:t xml:space="preserve"> a. Data </w:t>
+      </w:r>
+      <w:proofErr w:type="gramStart"/>
+      <w:r>
+        <w:rPr>
+          <w:color w:val="FF0000"/>
+        </w:rPr>
+        <w:t>members</w:t>
+      </w:r>
+      <w:proofErr w:type="gramEnd"/>
+      <w:r>
+        <w:rPr>
+          <w:color w:val="FF0000"/>
+        </w:rPr>
+        <w:t xml:space="preserve"> </w:t>
+      </w:r>
+      <w:r>
+        <w:rPr>
+          <w:rFonts w:ascii="Segoe UI Symbol" w:hAnsi="Segoe UI Symbol" w:cs="Segoe UI Symbol"/>
+          <w:color w:val="FF0000"/>
+        </w:rPr>
+        <w:t>✅</w:t>
+      </w:r>
+    </w:p>
+    <w:p>
+      <w:pPr>
+        <w:spacing w:after="0"/>
+      </w:pPr>
+      <w:r>
+        <w:pict>
+          <v:rect id="_x0000_i1028" style="width:0;height:1.5pt" o:hralign="center" o:hrstd="t" o:hr="t" fillcolor="#a0a0a0" stroked="f"/>
+        </w:pict>
+      </w:r>
+    </w:p>
+    <w:p>
+      <w:pPr>
+        <w:pStyle w:val="Heading3"/>
+        <w:spacing w:after="0" w:afterAutospacing="0"/>
+        <w:rPr>
+          <w:color w:val="00B050"/>
+        </w:rPr>
+      </w:pPr>
+      <w:r>
+        <w:rPr>
+          <w:rStyle w:val="Strong"/>
+          <w:b/>
+          <w:bCs/>
+          <w:color w:val="00B050"/>
+        </w:rPr>
+        <w:t>6. ______ is used to invoke methods and pass messages between objects.</w:t>
+      </w:r>
+    </w:p>
+    <w:p>
+      <w:pPr>
+        <w:pStyle w:val="NormalWeb"/>
+        <w:spacing w:after="0" w:afterAutospacing="0"/>
+        <w:ind w:left="360"/>
+      </w:pPr>
+      <w:proofErr w:type="gramStart"/>
+      <w:r>
+        <w:t>a</w:t>
+      </w:r>
+      <w:proofErr w:type="gramEnd"/>
+      <w:r>
+        <w:t>. hash operator (#)</w:t>
+      </w:r>
+      <w:r>
+        <w:br/>
+        <w:t>b. dot operator (.)</w:t>
+      </w:r>
+      <w:r>
+        <w:br/>
+      </w:r>
+      <w:proofErr w:type="gramStart"/>
+      <w:r>
+        <w:t>c</w:t>
+      </w:r>
+      <w:proofErr w:type="gramEnd"/>
+      <w:r>
+        <w:t>. comma operator (,)</w:t>
+      </w:r>
+      <w:r>
+        <w:br/>
+        <w:t>d. asterisk operator (*)</w:t>
+      </w:r>
+    </w:p>
+    <w:p>
+      <w:pPr>
+        <w:pStyle w:val="NormalWeb"/>
+        <w:spacing w:after="0" w:afterAutospacing="0"/>
+        <w:rPr>
+          <w:color w:val="FF0000"/>
+        </w:rPr>
+      </w:pPr>
+      <w:r>
+        <w:rPr>
+          <w:rStyle w:val="Strong"/>
+          <w:color w:val="FF0000"/>
+        </w:rPr>
+        <w:t>Answer:</w:t>
+      </w:r>
+      <w:r>
+        <w:rPr>
+          <w:color w:val="FF0000"/>
+        </w:rPr>
+        <w:t xml:space="preserve"> b. dot operator (.) </w:t>
+      </w:r>
+      <w:r>
+        <w:rPr>
+          <w:rFonts w:ascii="Segoe UI Symbol" w:hAnsi="Segoe UI Symbol" w:cs="Segoe UI Symbol"/>
+          <w:color w:val="FF0000"/>
+        </w:rPr>
+        <w:t>✅</w:t>
+      </w:r>
+    </w:p>
+    <w:p>
+      <w:pPr>
+        <w:pStyle w:val="Heading1"/>
+        <w:rPr>
+          <w:b/>
+          <w:color w:val="00B0F0"/>
+          <w:sz w:val="36"/>
+        </w:rPr>
+      </w:pPr>
+      <w:r>
+        <w:rPr>
+          <w:rFonts w:ascii="Segoe UI Symbol" w:hAnsi="Segoe UI Symbol" w:cs="Segoe UI Symbol"/>
+          <w:b/>
+          <w:color w:val="00B0F0"/>
+          <w:sz w:val="36"/>
+        </w:rPr>
+        <w:t>✅</w:t>
+      </w:r>
+      <w:r>
+        <w:rPr>
+          <w:b/>
+          <w:color w:val="00B0F0"/>
+          <w:sz w:val="36"/>
+        </w:rPr>
+        <w:t xml:space="preserve"> </w:t>
+      </w:r>
+      <w:r>
+        <w:rPr>
+          <w:rStyle w:val="Strong"/>
+          <w:b w:val="0"/>
+          <w:bCs w:val="0"/>
+          <w:color w:val="00B0F0"/>
+          <w:sz w:val="36"/>
+        </w:rPr>
+        <w:t>B. Fill in the blanks</w:t>
+      </w:r>
+    </w:p>
+    <w:p>
+      <w:pPr>
+        <w:pStyle w:val="Heading3"/>
+        <w:spacing w:after="0" w:afterAutospacing="0"/>
+        <w:rPr>
+          <w:color w:val="00B050"/>
+        </w:rPr>
+      </w:pPr>
+      <w:r>
+        <w:rPr>
+          <w:rStyle w:val="Strong"/>
+          <w:b/>
+          <w:bCs/>
+          <w:color w:val="00B050"/>
+        </w:rPr>
+        <w:t>1. ______ occurs when an object calls the method of another object.</w:t>
+      </w:r>
+    </w:p>
+    <w:p>
+      <w:pPr>
+        <w:pStyle w:val="NormalWeb"/>
+        <w:spacing w:after="0" w:afterAutospacing="0"/>
+        <w:ind w:left="360"/>
+        <w:rPr>
+          <w:color w:val="FF0000"/>
+        </w:rPr>
+      </w:pPr>
+      <w:r>
+        <w:rPr>
+          <w:rStyle w:val="Strong"/>
+          <w:color w:val="FF0000"/>
+        </w:rPr>
+        <w:t>Answer:</w:t>
+      </w:r>
+      <w:r>
+        <w:rPr>
+          <w:color w:val="FF0000"/>
+        </w:rPr>
+        <w:t xml:space="preserve"> Message passing</w:t>
+      </w:r>
+    </w:p>
+    <w:p>
+      <w:pPr>
+        <w:pStyle w:val="Heading3"/>
+        <w:spacing w:after="0" w:afterAutospacing="0"/>
+        <w:rPr>
+          <w:color w:val="00B050"/>
+        </w:rPr>
+      </w:pPr>
+      <w:r>
+        <w:rPr>
+          <w:rStyle w:val="Strong"/>
+          <w:b/>
+          <w:bCs/>
+          <w:color w:val="00B050"/>
+        </w:rPr>
+        <w:t xml:space="preserve">2. Memory space is allocated when </w:t>
+      </w:r>
+      <w:proofErr w:type="gramStart"/>
+      <w:r>
+        <w:rPr>
+          <w:rStyle w:val="Strong"/>
+          <w:b/>
+          <w:bCs/>
+          <w:color w:val="00B050"/>
+        </w:rPr>
+        <w:t>an</w:t>
+      </w:r>
+      <w:proofErr w:type="gramEnd"/>
+      <w:r>
+        <w:rPr>
+          <w:rStyle w:val="Strong"/>
+          <w:b/>
+          <w:bCs/>
+          <w:color w:val="00B050"/>
+        </w:rPr>
+        <w:t xml:space="preserve"> ______ is created.</w:t>
+      </w:r>
+    </w:p>
+    <w:p>
+      <w:pPr>
+        <w:pStyle w:val="NormalWeb"/>
+        <w:spacing w:after="0" w:afterAutospacing="0"/>
+        <w:ind w:left="360"/>
+        <w:rPr>
+          <w:color w:val="FF0000"/>
+        </w:rPr>
+      </w:pPr>
+      <w:r>
+        <w:rPr>
+          <w:rStyle w:val="Strong"/>
+          <w:color w:val="FF0000"/>
+        </w:rPr>
+        <w:t>Answer:</w:t>
+      </w:r>
+      <w:r>
+        <w:rPr>
+          <w:color w:val="FF0000"/>
+        </w:rPr>
+        <w:t xml:space="preserve"> object</w:t>
+      </w:r>
+    </w:p>
+    <w:p>
+      <w:pPr>
+        <w:pStyle w:val="Heading3"/>
+        <w:spacing w:after="0" w:afterAutospacing="0"/>
+        <w:rPr>
+          <w:color w:val="00B050"/>
+        </w:rPr>
+      </w:pPr>
+      <w:r>
+        <w:rPr>
+          <w:rStyle w:val="Strong"/>
+          <w:b/>
+          <w:bCs/>
+          <w:color w:val="00B050"/>
+        </w:rPr>
+        <w:t>3. ______ contains data members and methods.</w:t>
+      </w:r>
+    </w:p>
+    <w:p>
+      <w:pPr>
+        <w:pStyle w:val="NormalWeb"/>
+        <w:spacing w:after="0" w:afterAutospacing="0"/>
+        <w:ind w:left="360"/>
+        <w:rPr>
+          <w:color w:val="FF0000"/>
+        </w:rPr>
+      </w:pPr>
+      <w:r>
+        <w:rPr>
+          <w:rStyle w:val="Strong"/>
+          <w:color w:val="FF0000"/>
+        </w:rPr>
+        <w:t>Answer:</w:t>
+      </w:r>
+      <w:r>
+        <w:rPr>
+          <w:color w:val="FF0000"/>
+        </w:rPr>
+        <w:t xml:space="preserve"> Class</w:t>
+      </w:r>
+    </w:p>
+    <w:p>
+      <w:pPr>
+        <w:spacing w:after="0"/>
+      </w:pPr>
+      <w:r>
+        <w:pict>
+          <v:rect id="_x0000_i1029" style="width:0;height:1.5pt" o:hralign="center" o:hrstd="t" o:hr="t" fillcolor="#a0a0a0" stroked="f"/>
+        </w:pict>
+      </w:r>
+    </w:p>
+    <w:p>
+      <w:pPr>
+        <w:pStyle w:val="Heading3"/>
+        <w:spacing w:after="0" w:afterAutospacing="0"/>
+        <w:rPr>
+          <w:color w:val="00B050"/>
+        </w:rPr>
+      </w:pPr>
+      <w:r>
+        <w:rPr>
+          <w:rStyle w:val="Strong"/>
+          <w:b/>
+          <w:bCs/>
+          <w:color w:val="00B050"/>
+        </w:rPr>
+        <w:t>4. The state of an object is represented by the ______ of that object.</w:t>
+      </w:r>
+    </w:p>
+    <w:p>
+      <w:pPr>
+        <w:pStyle w:val="NormalWeb"/>
+        <w:spacing w:after="0" w:afterAutospacing="0"/>
+        <w:ind w:left="360"/>
+        <w:rPr>
+          <w:color w:val="FF0000"/>
+        </w:rPr>
+      </w:pPr>
+      <w:r>
+        <w:rPr>
+          <w:rStyle w:val="Strong"/>
+          <w:color w:val="FF0000"/>
+        </w:rPr>
+        <w:t>Answer:</w:t>
+      </w:r>
+      <w:r>
+        <w:rPr>
+          <w:color w:val="FF0000"/>
+        </w:rPr>
+        <w:t xml:space="preserve"> data members</w:t>
+      </w:r>
+    </w:p>
+    <w:p>
+      <w:pPr>
+        <w:pStyle w:val="Heading3"/>
+        <w:spacing w:after="0" w:afterAutospacing="0"/>
+        <w:rPr>
+          <w:color w:val="00B050"/>
+        </w:rPr>
+      </w:pPr>
+      <w:r>
+        <w:rPr>
+          <w:rStyle w:val="Strong"/>
+          <w:b/>
+          <w:bCs/>
+          <w:color w:val="00B050"/>
+        </w:rPr>
+        <w:t>5. A class acts as a ______ as by using it similar types of objects are created.</w:t>
+      </w:r>
+    </w:p>
+    <w:p>
+      <w:pPr>
+        <w:pStyle w:val="NormalWeb"/>
+        <w:spacing w:after="0" w:afterAutospacing="0"/>
+        <w:ind w:left="360"/>
+        <w:rPr>
+          <w:color w:val="FF0000"/>
+        </w:rPr>
+      </w:pPr>
+      <w:r>
+        <w:rPr>
+          <w:rStyle w:val="Strong"/>
+          <w:color w:val="FF0000"/>
+        </w:rPr>
+        <w:t>Answer:</w:t>
+      </w:r>
+      <w:r>
+        <w:rPr>
+          <w:color w:val="FF0000"/>
+        </w:rPr>
+        <w:t xml:space="preserve"> blueprint</w:t>
+      </w:r>
+    </w:p>
+    <w:p>
+      <w:pPr>
+        <w:pStyle w:val="Heading3"/>
+        <w:spacing w:after="0" w:afterAutospacing="0"/>
+        <w:rPr>
+          <w:color w:val="00B050"/>
+        </w:rPr>
+      </w:pPr>
+      <w:r>
+        <w:rPr>
+          <w:rStyle w:val="Strong"/>
+          <w:b/>
+          <w:bCs/>
+          <w:color w:val="00B050"/>
+        </w:rPr>
+        <w:t>6. Refer a class structure as shown below.</w:t>
+      </w:r>
+    </w:p>
+    <w:p>
+      <w:pPr>
+        <w:pStyle w:val="NormalWeb"/>
+        <w:spacing w:after="0" w:afterAutospacing="0"/>
+      </w:pPr>
+      <w:r>
+        <w:t xml:space="preserve">Class </w:t>
+      </w:r>
+      <w:proofErr w:type="gramStart"/>
+      <w:r>
+        <w:t>subject</w:t>
+      </w:r>
+      <w:proofErr w:type="gramEnd"/>
+      <w:r>
+        <w:br/>
+        <w:t>{</w:t>
+      </w:r>
+      <w:r>
+        <w:br/>
+      </w:r>
+      <w:r>
+        <w:lastRenderedPageBreak/>
+        <w:t> </w:t>
+      </w:r>
+      <w:r>
+        <w:t> </w:t>
+      </w:r>
+      <w:r>
+        <w:t>String name</w:t>
+      </w:r>
+      <w:r>
+        <w:br/>
+      </w:r>
+      <w:r>
+        <w:t> </w:t>
+      </w:r>
+      <w:r>
+        <w:t> </w:t>
+      </w:r>
+      <w:proofErr w:type="spellStart"/>
+      <w:r>
+        <w:t>book_name</w:t>
+      </w:r>
+      <w:proofErr w:type="spellEnd"/>
+      <w:r>
+        <w:br/>
+      </w:r>
+      <w:r>
+        <w:t> </w:t>
+      </w:r>
+      <w:r>
+        <w:t> </w:t>
+      </w:r>
+      <w:proofErr w:type="spellStart"/>
+      <w:r>
+        <w:t>getData</w:t>
+      </w:r>
+      <w:proofErr w:type="spellEnd"/>
+      <w:r>
+        <w:t>()</w:t>
+      </w:r>
+      <w:r>
+        <w:br/>
+      </w:r>
+      <w:r>
+        <w:t> </w:t>
+      </w:r>
+      <w:r>
+        <w:t> </w:t>
+      </w:r>
+      <w:proofErr w:type="spellStart"/>
+      <w:r>
+        <w:t>setData</w:t>
+      </w:r>
+      <w:proofErr w:type="spellEnd"/>
+      <w:r>
+        <w:t>()</w:t>
+      </w:r>
+      <w:r>
+        <w:br/>
+        <w:t>}</w:t>
+      </w:r>
+    </w:p>
+    <w:p>
+      <w:pPr>
+        <w:pStyle w:val="NormalWeb"/>
+        <w:spacing w:after="0" w:afterAutospacing="0"/>
+      </w:pPr>
+      <w:r>
+        <w:t xml:space="preserve">Subject obj1 = new </w:t>
+      </w:r>
+      <w:proofErr w:type="gramStart"/>
+      <w:r>
+        <w:t>subject(</w:t>
+      </w:r>
+      <w:proofErr w:type="gramEnd"/>
+      <w:r>
+        <w:t>);</w:t>
+      </w:r>
+    </w:p>
+    <w:p>
+      <w:pPr>
+        <w:pStyle w:val="Heading4"/>
+        <w:spacing w:after="0" w:afterAutospacing="0"/>
+      </w:pPr>
+      <w:r>
+        <w:t>Fill in the blanks:</w:t>
+      </w:r>
+    </w:p>
+    <w:p>
+      <w:pPr>
+        <w:pStyle w:val="NormalWeb"/>
+        <w:numPr>
+          <w:ilvl w:val="0"/>
+          <w:numId w:val="5"/>
+        </w:numPr>
+        <w:spacing w:after="0" w:afterAutospacing="0"/>
+        <w:rPr>
+          <w:color w:val="FF0000"/>
+        </w:rPr>
+      </w:pPr>
+      <w:r>
+        <w:rPr>
+          <w:rStyle w:val="Strong"/>
+          <w:color w:val="00B050"/>
+        </w:rPr>
+        <w:t xml:space="preserve">______ is the characteristic of the class that starts with </w:t>
+      </w:r>
+      <w:proofErr w:type="gramStart"/>
+      <w:r>
+        <w:rPr>
+          <w:rStyle w:val="Strong"/>
+          <w:color w:val="00B050"/>
+        </w:rPr>
+        <w:t>letter 's'</w:t>
+      </w:r>
+      <w:proofErr w:type="gramEnd"/>
+      <w:r>
+        <w:rPr>
+          <w:rStyle w:val="Strong"/>
+          <w:color w:val="00B050"/>
+        </w:rPr>
+        <w:t>.</w:t>
+      </w:r>
+      <w:r>
+        <w:rPr>
+          <w:color w:val="00B050"/>
+        </w:rPr>
+        <w:br/>
+      </w:r>
+      <w:r>
+        <w:rPr>
+          <w:rStyle w:val="Strong"/>
+          <w:color w:val="FF0000"/>
+        </w:rPr>
+        <w:t>Answer:</w:t>
+      </w:r>
+      <w:r>
+        <w:rPr>
+          <w:color w:val="FF0000"/>
+        </w:rPr>
+        <w:t xml:space="preserve"> subject</w:t>
+      </w:r>
+    </w:p>
+    <w:p>
+      <w:pPr>
+        <w:pStyle w:val="Heading3"/>
+        <w:spacing w:before="0" w:beforeAutospacing="0" w:after="0" w:afterAutospacing="0"/>
+        <w:ind w:left="360"/>
+        <w:rPr>
+          <w:color w:val="00B050"/>
+        </w:rPr>
+      </w:pPr>
+      <w:r>
+        <w:rPr>
+          <w:rStyle w:val="Strong"/>
+          <w:b/>
+          <w:bCs/>
+          <w:color w:val="00B050"/>
+        </w:rPr>
+        <w:t xml:space="preserve">b. </w:t>
+      </w:r>
+      <w:proofErr w:type="spellStart"/>
+      <w:r>
+        <w:rPr>
+          <w:rStyle w:val="Strong"/>
+          <w:b/>
+          <w:bCs/>
+          <w:color w:val="00B050"/>
+        </w:rPr>
+        <w:t>book_name</w:t>
+      </w:r>
+      <w:proofErr w:type="spellEnd"/>
+      <w:r>
+        <w:rPr>
+          <w:rStyle w:val="Strong"/>
+          <w:b/>
+          <w:bCs/>
+          <w:color w:val="00B050"/>
+        </w:rPr>
+        <w:t xml:space="preserve"> is ______ of the class.</w:t>
+      </w:r>
+    </w:p>
+    <w:p>
+      <w:pPr>
+        <w:pStyle w:val="NormalWeb"/>
+        <w:spacing w:before="0" w:beforeAutospacing="0" w:after="0" w:afterAutospacing="0"/>
+        <w:ind w:left="720"/>
+        <w:rPr>
+          <w:color w:val="FF0000"/>
+        </w:rPr>
+      </w:pPr>
+      <w:r>
+        <w:rPr>
+          <w:rStyle w:val="Strong"/>
+          <w:color w:val="FF0000"/>
+        </w:rPr>
+        <w:t>Answer:</w:t>
+      </w:r>
+      <w:r>
+        <w:rPr>
+          <w:color w:val="FF0000"/>
+        </w:rPr>
+        <w:t xml:space="preserve"> </w:t>
+      </w:r>
+      <w:r>
+        <w:rPr>
+          <w:rStyle w:val="Strong"/>
+          <w:color w:val="FF0000"/>
+        </w:rPr>
+        <w:t>data member (attribute)</w:t>
+      </w:r>
+    </w:p>
+    <w:p>
+      <w:pPr>
+        <w:spacing w:after="0"/>
+        <w:ind w:left="360"/>
+      </w:pPr>
+      <w:r>
+        <w:pict>
+          <v:rect id="_x0000_i1030" style="width:0;height:1.5pt" o:hralign="center" o:hrstd="t" o:hr="t" fillcolor="#a0a0a0" stroked="f"/>
+        </w:pict>
+      </w:r>
+    </w:p>
+    <w:p>
+      <w:pPr>
+        <w:pStyle w:val="Heading3"/>
+        <w:spacing w:before="0" w:beforeAutospacing="0" w:after="0" w:afterAutospacing="0"/>
+        <w:ind w:left="360"/>
+        <w:rPr>
+          <w:color w:val="00B050"/>
+        </w:rPr>
+      </w:pPr>
+      <w:r>
+        <w:rPr>
+          <w:rStyle w:val="Strong"/>
+          <w:b/>
+          <w:bCs/>
+          <w:color w:val="00B050"/>
+        </w:rPr>
+        <w:t xml:space="preserve">c. ______ and ______ are the common </w:t>
+      </w:r>
+      <w:proofErr w:type="spellStart"/>
+      <w:r>
+        <w:rPr>
+          <w:rStyle w:val="Strong"/>
+          <w:b/>
+          <w:bCs/>
+          <w:color w:val="00B050"/>
+        </w:rPr>
+        <w:t>behaviour</w:t>
+      </w:r>
+      <w:proofErr w:type="spellEnd"/>
+      <w:r>
+        <w:rPr>
+          <w:rStyle w:val="Strong"/>
+          <w:b/>
+          <w:bCs/>
+          <w:color w:val="00B050"/>
+        </w:rPr>
+        <w:t xml:space="preserve"> of the objects of class ‘subject’.</w:t>
+      </w:r>
+    </w:p>
+    <w:p>
+      <w:pPr>
+        <w:pStyle w:val="NormalWeb"/>
+        <w:spacing w:before="0" w:beforeAutospacing="0" w:after="0" w:afterAutospacing="0"/>
+        <w:ind w:left="720"/>
+        <w:rPr>
+          <w:color w:val="FF0000"/>
+        </w:rPr>
+      </w:pPr>
+      <w:r>
+        <w:rPr>
+          <w:rStyle w:val="Strong"/>
+          <w:color w:val="FF0000"/>
+        </w:rPr>
+        <w:t>Answer:</w:t>
+      </w:r>
+      <w:r>
+        <w:rPr>
+          <w:color w:val="FF0000"/>
+        </w:rPr>
+        <w:t xml:space="preserve"> </w:t>
+      </w:r>
+      <w:proofErr w:type="spellStart"/>
+      <w:proofErr w:type="gramStart"/>
+      <w:r>
+        <w:rPr>
+          <w:rStyle w:val="Strong"/>
+          <w:color w:val="FF0000"/>
+        </w:rPr>
+        <w:t>getData</w:t>
+      </w:r>
+      <w:proofErr w:type="spellEnd"/>
+      <w:r>
+        <w:rPr>
+          <w:rStyle w:val="Strong"/>
+          <w:color w:val="FF0000"/>
+        </w:rPr>
+        <w:t>(</w:t>
+      </w:r>
+      <w:proofErr w:type="gramEnd"/>
+      <w:r>
+        <w:rPr>
+          <w:rStyle w:val="Strong"/>
+          <w:color w:val="FF0000"/>
+        </w:rPr>
+        <w:t xml:space="preserve">) and </w:t>
+      </w:r>
+      <w:proofErr w:type="spellStart"/>
+      <w:r>
+        <w:rPr>
+          <w:rStyle w:val="Strong"/>
+          <w:color w:val="FF0000"/>
+        </w:rPr>
+        <w:t>setData</w:t>
+      </w:r>
+      <w:proofErr w:type="spellEnd"/>
+      <w:r>
+        <w:rPr>
+          <w:rStyle w:val="Strong"/>
+          <w:color w:val="FF0000"/>
+        </w:rPr>
+        <w:t>()</w:t>
+      </w:r>
+    </w:p>
+    <w:p>
+      <w:pPr>
+        <w:spacing w:after="0"/>
+        <w:ind w:left="360"/>
+      </w:pPr>
+      <w:r>
+        <w:pict>
+          <v:rect id="_x0000_i1031" style="width:0;height:1.5pt" o:hralign="center" o:hrstd="t" o:hr="t" fillcolor="#a0a0a0" stroked="f"/>
+        </w:pict>
+      </w:r>
+    </w:p>
+    <w:p>
+      <w:pPr>
+        <w:pStyle w:val="Heading3"/>
+        <w:spacing w:before="0" w:beforeAutospacing="0" w:after="0" w:afterAutospacing="0"/>
+        <w:ind w:left="360"/>
+        <w:rPr>
+          <w:color w:val="00B050"/>
+        </w:rPr>
+      </w:pPr>
+      <w:r>
+        <w:rPr>
+          <w:rStyle w:val="Strong"/>
+          <w:b/>
+          <w:bCs/>
+          <w:color w:val="00B050"/>
+        </w:rPr>
+        <w:t>d. Name of class is ______.</w:t>
+      </w:r>
+    </w:p>
+    <w:p>
+      <w:pPr>
+        <w:pStyle w:val="NormalWeb"/>
+        <w:spacing w:before="0" w:beforeAutospacing="0" w:after="0" w:afterAutospacing="0"/>
+        <w:ind w:left="720"/>
+        <w:rPr>
+          <w:color w:val="FF0000"/>
+        </w:rPr>
+      </w:pPr>
+      <w:r>
+        <w:rPr>
+          <w:rStyle w:val="Strong"/>
+          <w:color w:val="FF0000"/>
+        </w:rPr>
+        <w:t>Answer:</w:t>
+      </w:r>
+      <w:r>
+        <w:rPr>
+          <w:color w:val="FF0000"/>
+        </w:rPr>
+        <w:t xml:space="preserve"> </w:t>
+      </w:r>
+      <w:r>
+        <w:rPr>
+          <w:rStyle w:val="Strong"/>
+          <w:color w:val="FF0000"/>
+        </w:rPr>
+        <w:t>subject</w:t>
+      </w:r>
+    </w:p>
+    <w:p>
+      <w:pPr>
+        <w:spacing w:after="0"/>
+        <w:ind w:left="360"/>
+      </w:pPr>
+      <w:r>
+        <w:pict>
+          <v:rect id="_x0000_i1032" style="width:0;height:1.5pt" o:hralign="center" o:hrstd="t" o:hr="t" fillcolor="#a0a0a0" stroked="f"/>
+        </w:pict>
+      </w:r>
+    </w:p>
+    <w:p>
+      <w:pPr>
+        <w:pStyle w:val="Heading3"/>
+        <w:spacing w:before="0" w:beforeAutospacing="0" w:after="0" w:afterAutospacing="0"/>
+        <w:ind w:left="360"/>
+        <w:rPr>
+          <w:color w:val="00B050"/>
+        </w:rPr>
+      </w:pPr>
+      <w:r>
+        <w:rPr>
+          <w:rStyle w:val="Strong"/>
+          <w:b/>
+          <w:bCs/>
+          <w:color w:val="00B050"/>
+        </w:rPr>
+        <w:t>e. Name of the object is ______.</w:t>
+      </w:r>
+    </w:p>
+    <w:p>
+      <w:pPr>
+        <w:pStyle w:val="NormalWeb"/>
+        <w:spacing w:before="0" w:beforeAutospacing="0" w:after="0" w:afterAutospacing="0"/>
+        <w:ind w:left="720"/>
+        <w:rPr>
+          <w:color w:val="FF0000"/>
+        </w:rPr>
+      </w:pPr>
+      <w:r>
+        <w:rPr>
+          <w:rStyle w:val="Strong"/>
+          <w:color w:val="FF0000"/>
+        </w:rPr>
+        <w:t>Answer:</w:t>
+      </w:r>
+      <w:r>
+        <w:rPr>
+          <w:color w:val="FF0000"/>
+        </w:rPr>
+        <w:t xml:space="preserve"> </w:t>
+      </w:r>
+      <w:r>
+        <w:rPr>
+          <w:rStyle w:val="Strong"/>
+          <w:color w:val="FF0000"/>
+        </w:rPr>
+        <w:t>obj1</w:t>
+      </w:r>
+    </w:p>
+    <w:p>
+      <w:pPr>
+        <w:spacing w:after="0"/>
+        <w:ind w:left="360"/>
+      </w:pPr>
+      <w:r>
+        <w:pict>
+          <v:rect id="_x0000_i1033" style="width:0;height:1.5pt" o:hralign="center" o:hrstd="t" o:hr="t" fillcolor="#a0a0a0" stroked="f"/>
+        </w:pict>
+      </w:r>
+    </w:p>
+    <w:p>
+      <w:pPr>
+        <w:pStyle w:val="Heading3"/>
+        <w:spacing w:before="0" w:beforeAutospacing="0" w:after="0" w:afterAutospacing="0"/>
+        <w:ind w:left="360"/>
+        <w:rPr>
+          <w:color w:val="00B050"/>
+        </w:rPr>
+      </w:pPr>
+      <w:bookmarkStart w:id="0" w:name="_GoBack"/>
+      <w:r>
+        <w:rPr>
+          <w:rStyle w:val="Strong"/>
+          <w:b/>
+          <w:bCs/>
+          <w:color w:val="00B050"/>
+        </w:rPr>
+        <w:t>f. To create the object computer, we use ______ keyword.</w:t>
+      </w:r>
+    </w:p>
+    <w:bookmarkEnd w:id="0"/>
+    <w:p>
+      <w:pPr>
+        <w:pStyle w:val="NormalWeb"/>
+        <w:spacing w:before="0" w:beforeAutospacing="0" w:after="0" w:afterAutospacing="0"/>
+        <w:ind w:left="720"/>
+        <w:rPr>
+          <w:color w:val="FF0000"/>
+        </w:rPr>
+      </w:pPr>
+      <w:r>
+        <w:rPr>
+          <w:rStyle w:val="Strong"/>
+          <w:color w:val="FF0000"/>
+        </w:rPr>
+        <w:t>Answer:</w:t>
+      </w:r>
+      <w:r>
+        <w:rPr>
+          <w:color w:val="FF0000"/>
+        </w:rPr>
+        <w:t xml:space="preserve"> </w:t>
+      </w:r>
+      <w:r>
+        <w:rPr>
+          <w:rStyle w:val="Strong"/>
+          <w:color w:val="FF0000"/>
+        </w:rPr>
+        <w:t>new</w:t>
+      </w:r>
+    </w:p>
+    <w:p>
+      <w:pPr>
+        <w:pStyle w:val="NormalWeb"/>
+        <w:spacing w:before="0" w:beforeAutospacing="0" w:after="0" w:afterAutospacing="0"/>
+        <w:ind w:left="360"/>
+        <w:rPr>
+          <w:color w:val="FF0000"/>
+        </w:rPr>
+      </w:pPr>
+    </w:p>
+    <w:p>
+      <w:pPr>
+        <w:pStyle w:val="Heading1"/>
+        <w:rPr>
+          <w:color w:val="00B0F0"/>
+          <w:sz w:val="36"/>
+        </w:rPr>
+      </w:pPr>
+      <w:r>
+        <w:rPr>
+          <w:rFonts w:ascii="Segoe UI Symbol" w:hAnsi="Segoe UI Symbol" w:cs="Segoe UI Symbol"/>
+          <w:color w:val="00B0F0"/>
+          <w:sz w:val="36"/>
+        </w:rPr>
+        <w:t>✅</w:t>
+      </w:r>
+      <w:r>
+        <w:rPr>
+          <w:color w:val="00B0F0"/>
+          <w:sz w:val="36"/>
+        </w:rPr>
+        <w:t xml:space="preserve"> </w:t>
+      </w:r>
+      <w:r>
+        <w:rPr>
+          <w:rStyle w:val="Strong"/>
+          <w:bCs w:val="0"/>
+          <w:color w:val="00B0F0"/>
+          <w:sz w:val="36"/>
+        </w:rPr>
+        <w:t>C. Answer the following questions</w:t>
+      </w:r>
+    </w:p>
+    <w:p>
+      <w:pPr>
+        <w:pStyle w:val="Heading3"/>
+        <w:spacing w:after="0" w:afterAutospacing="0"/>
+        <w:rPr>
+          <w:color w:val="00B050"/>
+        </w:rPr>
+      </w:pPr>
+      <w:r>
+        <w:rPr>
+          <w:rStyle w:val="Strong"/>
+          <w:b/>
+          <w:bCs/>
+          <w:color w:val="00B050"/>
+        </w:rPr>
+        <w:t>1. In real world, if "Car" is a class, then name some objects in it.</w:t>
+      </w:r>
+    </w:p>
+    <w:p>
+      <w:pPr>
+        <w:pStyle w:val="NormalWeb"/>
+        <w:spacing w:after="0" w:afterAutospacing="0"/>
+      </w:pPr>
+      <w:r>
+        <w:rPr>
+          <w:rStyle w:val="Strong"/>
+          <w:color w:val="FF0000"/>
+        </w:rPr>
+        <w:t>Answer</w:t>
+      </w:r>
+      <w:proofErr w:type="gramStart"/>
+      <w:r>
+        <w:rPr>
+          <w:rStyle w:val="Strong"/>
+          <w:color w:val="FF0000"/>
+        </w:rPr>
+        <w:t>:</w:t>
+      </w:r>
+      <w:proofErr w:type="gramEnd"/>
+      <w:r>
+        <w:rPr>
+          <w:color w:val="FF0000"/>
+        </w:rPr>
+        <w:br/>
+      </w:r>
+      <w:r>
+        <w:t xml:space="preserve">Objects: </w:t>
+      </w:r>
+      <w:proofErr w:type="spellStart"/>
+      <w:r>
+        <w:t>Maruti</w:t>
+      </w:r>
+      <w:proofErr w:type="spellEnd"/>
+      <w:r>
+        <w:t>, Hyundai, Honda, Tata</w:t>
+      </w:r>
+    </w:p>
+    <w:p>
+      <w:pPr>
+        <w:pStyle w:val="Heading3"/>
+        <w:spacing w:after="0" w:afterAutospacing="0"/>
+        <w:rPr>
+          <w:color w:val="00B050"/>
+        </w:rPr>
+      </w:pPr>
+      <w:r>
+        <w:rPr>
+          <w:rStyle w:val="Strong"/>
+          <w:b/>
+          <w:bCs/>
+          <w:color w:val="00B050"/>
+        </w:rPr>
+        <w:t>2. List the components of classes.</w:t>
+      </w:r>
+    </w:p>
+    <w:p>
+      <w:pPr>
+        <w:pStyle w:val="NormalWeb"/>
+        <w:spacing w:after="0" w:afterAutospacing="0"/>
+        <w:rPr>
+          <w:color w:val="FF0000"/>
+        </w:rPr>
+      </w:pPr>
+      <w:r>
+        <w:rPr>
+          <w:rStyle w:val="Strong"/>
+          <w:color w:val="FF0000"/>
+        </w:rPr>
+        <w:t>Answer:</w:t>
+      </w:r>
+    </w:p>
+    <w:p>
+      <w:pPr>
+        <w:numPr>
+          <w:ilvl w:val="0"/>
+          <w:numId w:val="4"/>
+        </w:numPr>
+        <w:spacing w:before="100" w:beforeAutospacing="1" w:after="0" w:line="240" w:lineRule="auto"/>
+      </w:pPr>
+      <w:r>
+        <w:t xml:space="preserve">Data members </w:t>
+      </w:r>
+    </w:p>
+    <w:p>
+      <w:pPr>
+        <w:numPr>
+          <w:ilvl w:val="0"/>
+          <w:numId w:val="4"/>
+        </w:numPr>
+        <w:spacing w:before="100" w:beforeAutospacing="1" w:after="0" w:line="240" w:lineRule="auto"/>
+      </w:pPr>
+      <w:r>
+        <w:t xml:space="preserve">Methods </w:t>
+      </w:r>
+    </w:p>
+    <w:p>
+      <w:pPr>
+        <w:pStyle w:val="Heading3"/>
+        <w:spacing w:after="0" w:afterAutospacing="0"/>
+        <w:rPr>
+          <w:color w:val="00B050"/>
+        </w:rPr>
+      </w:pPr>
+      <w:r>
+        <w:rPr>
+          <w:rStyle w:val="Strong"/>
+          <w:b/>
+          <w:bCs/>
+          <w:color w:val="00B050"/>
+        </w:rPr>
+        <w:t>3. How do you define instance of a class?</w:t>
+      </w:r>
+    </w:p>
+    <w:p>
+      <w:pPr>
+        <w:pStyle w:val="NormalWeb"/>
+        <w:spacing w:after="0" w:afterAutospacing="0"/>
+      </w:pPr>
+      <w:r>
+        <w:rPr>
+          <w:rStyle w:val="Strong"/>
+          <w:color w:val="FF0000"/>
+        </w:rPr>
+        <w:lastRenderedPageBreak/>
+        <w:t>Answer</w:t>
+      </w:r>
+      <w:proofErr w:type="gramStart"/>
+      <w:r>
+        <w:rPr>
+          <w:rStyle w:val="Strong"/>
+          <w:color w:val="FF0000"/>
+        </w:rPr>
+        <w:t>:</w:t>
+      </w:r>
+      <w:proofErr w:type="gramEnd"/>
+      <w:r>
+        <w:rPr>
+          <w:color w:val="FF0000"/>
+        </w:rPr>
+        <w:br/>
+      </w:r>
+      <w:r>
+        <w:t xml:space="preserve">An instance of a class is called an </w:t>
+      </w:r>
+      <w:r>
+        <w:rPr>
+          <w:rStyle w:val="Strong"/>
+        </w:rPr>
+        <w:t>object</w:t>
+      </w:r>
+      <w:r>
+        <w:t>.</w:t>
+      </w:r>
+    </w:p>
+    <w:p>
+      <w:pPr>
+        <w:pStyle w:val="Heading3"/>
+        <w:spacing w:after="0" w:afterAutospacing="0"/>
+        <w:rPr>
+          <w:color w:val="00B050"/>
+        </w:rPr>
+      </w:pPr>
+      <w:r>
+        <w:rPr>
+          <w:rStyle w:val="Strong"/>
+          <w:b/>
+          <w:bCs/>
+          <w:color w:val="00B050"/>
+        </w:rPr>
+        <w:t>4. How are objects created?</w:t>
+      </w:r>
+    </w:p>
+    <w:p>
+      <w:pPr>
+        <w:pStyle w:val="NormalWeb"/>
+        <w:spacing w:after="0" w:afterAutospacing="0"/>
+      </w:pPr>
+      <w:r>
+        <w:rPr>
+          <w:rStyle w:val="Strong"/>
+          <w:color w:val="FF0000"/>
+        </w:rPr>
+        <w:t>Answer</w:t>
+      </w:r>
+      <w:proofErr w:type="gramStart"/>
+      <w:r>
+        <w:rPr>
+          <w:rStyle w:val="Strong"/>
+          <w:color w:val="FF0000"/>
+        </w:rPr>
+        <w:t>:</w:t>
+      </w:r>
+      <w:proofErr w:type="gramEnd"/>
+      <w:r>
+        <w:rPr>
+          <w:color w:val="FF0000"/>
+        </w:rPr>
+        <w:br/>
+      </w:r>
+      <w:r>
+        <w:t xml:space="preserve">Objects are created using the </w:t>
+      </w:r>
+      <w:r>
+        <w:rPr>
+          <w:rStyle w:val="Strong"/>
+        </w:rPr>
+        <w:t>new keyword</w:t>
+      </w:r>
+      <w:r>
+        <w:t>.</w:t>
+      </w:r>
+    </w:p>
+    <w:p>
+      <w:pPr>
+        <w:pStyle w:val="NormalWeb"/>
+        <w:spacing w:after="0" w:afterAutospacing="0"/>
+      </w:pPr>
+      <w:r>
+        <w:t>Example:</w:t>
+      </w:r>
+    </w:p>
+    <w:p>
+      <w:pPr>
+        <w:pStyle w:val="HTMLPreformatted"/>
+      </w:pPr>
+      <w:proofErr w:type="spellStart"/>
+      <w:r>
+        <w:rPr>
+          <w:rStyle w:val="t"/>
+        </w:rPr>
+        <w:t>ClassName</w:t>
+      </w:r>
+      <w:proofErr w:type="spellEnd"/>
+      <w:r>
+        <w:rPr>
+          <w:rStyle w:val="HTMLCode"/>
+        </w:rPr>
+        <w:t xml:space="preserve"> </w:t>
+      </w:r>
+      <w:proofErr w:type="spellStart"/>
+      <w:r>
+        <w:rPr>
+          <w:rStyle w:val="t"/>
+        </w:rPr>
+        <w:t>obj</w:t>
+      </w:r>
+      <w:proofErr w:type="spellEnd"/>
+      <w:r>
+        <w:rPr>
+          <w:rStyle w:val="HTMLCode"/>
+        </w:rPr>
+        <w:t xml:space="preserve"> </w:t>
+      </w:r>
+      <w:r>
+        <w:rPr>
+          <w:rStyle w:val="n"/>
+        </w:rPr>
+        <w:t>=</w:t>
+      </w:r>
+      <w:r>
+        <w:rPr>
+          <w:rStyle w:val="HTMLCode"/>
+        </w:rPr>
+        <w:t xml:space="preserve"> </w:t>
+      </w:r>
+      <w:r>
+        <w:rPr>
+          <w:rStyle w:val="n"/>
+        </w:rPr>
+        <w:t>new</w:t>
+      </w:r>
+      <w:r>
+        <w:rPr>
+          <w:rStyle w:val="HTMLCode"/>
+        </w:rPr>
+        <w:t xml:space="preserve"> </w:t>
+      </w:r>
+      <w:proofErr w:type="spellStart"/>
+      <w:proofErr w:type="gramStart"/>
+      <w:r>
+        <w:rPr>
+          <w:rStyle w:val="t"/>
+        </w:rPr>
+        <w:t>ClassName</w:t>
+      </w:r>
+      <w:proofErr w:type="spellEnd"/>
+      <w:r>
+        <w:rPr>
+          <w:rStyle w:val="HTMLCode"/>
+        </w:rPr>
+        <w:t>(</w:t>
+      </w:r>
+      <w:proofErr w:type="gramEnd"/>
+      <w:r>
+        <w:rPr>
+          <w:rStyle w:val="HTMLCode"/>
+        </w:rPr>
+        <w:t>);</w:t>
+      </w:r>
+    </w:p>
+    <w:p>
+      <w:pPr>
+        <w:pStyle w:val="Heading3"/>
+        <w:spacing w:after="0" w:afterAutospacing="0"/>
+        <w:rPr>
+          <w:color w:val="00B050"/>
+        </w:rPr>
+      </w:pPr>
+      <w:r>
+        <w:rPr>
+          <w:rStyle w:val="Strong"/>
+          <w:b/>
+          <w:bCs/>
+          <w:color w:val="00B050"/>
+        </w:rPr>
+        <w:t>5. What is Message passing in Java objects?</w:t>
+      </w:r>
+    </w:p>
+    <w:p>
+      <w:pPr>
+        <w:pStyle w:val="NormalWeb"/>
+        <w:spacing w:after="0" w:afterAutospacing="0"/>
+      </w:pPr>
+      <w:r>
+        <w:rPr>
+          <w:rStyle w:val="Strong"/>
+          <w:color w:val="FF0000"/>
+        </w:rPr>
+        <w:t>Answer</w:t>
+      </w:r>
+      <w:proofErr w:type="gramStart"/>
+      <w:r>
+        <w:rPr>
+          <w:rStyle w:val="Strong"/>
+          <w:color w:val="FF0000"/>
+        </w:rPr>
+        <w:t>:</w:t>
+      </w:r>
+      <w:proofErr w:type="gramEnd"/>
+      <w:r>
+        <w:rPr>
+          <w:color w:val="FF0000"/>
+        </w:rPr>
+        <w:br/>
+      </w:r>
+      <w:r>
+        <w:t>Message passing means calling a method of one object using another object.</w:t>
+      </w:r>
+    </w:p>
+    <w:p>
+      <w:pPr>
+        <w:pStyle w:val="Heading3"/>
+        <w:spacing w:after="0" w:afterAutospacing="0"/>
+        <w:rPr>
+          <w:color w:val="00B050"/>
+        </w:rPr>
+      </w:pPr>
+      <w:r>
+        <w:rPr>
+          <w:rStyle w:val="Strong"/>
+          <w:b/>
+          <w:bCs/>
+          <w:color w:val="00B050"/>
+        </w:rPr>
+        <w:t>6. Write a short note on objects.</w:t>
+      </w:r>
+    </w:p>
+    <w:p>
+      <w:pPr>
+        <w:pStyle w:val="NormalWeb"/>
+        <w:spacing w:after="0" w:afterAutospacing="0"/>
+      </w:pPr>
+      <w:r>
+        <w:rPr>
+          <w:rStyle w:val="Strong"/>
+          <w:color w:val="FF0000"/>
+        </w:rPr>
+        <w:t>Answer</w:t>
+      </w:r>
+      <w:proofErr w:type="gramStart"/>
+      <w:r>
+        <w:rPr>
+          <w:rStyle w:val="Strong"/>
+          <w:color w:val="FF0000"/>
+        </w:rPr>
+        <w:t>:</w:t>
+      </w:r>
+      <w:proofErr w:type="gramEnd"/>
+      <w:r>
+        <w:rPr>
+          <w:color w:val="FF0000"/>
+        </w:rPr>
+        <w:br/>
+      </w:r>
+      <w:r>
+        <w:t>An object is an instance of a class. It represents real-world entities and contains data and methods.</w:t>
+      </w:r>
+    </w:p>
+    <w:p>
+      <w:pPr>
+        <w:pStyle w:val="Heading3"/>
+        <w:spacing w:after="0" w:afterAutospacing="0"/>
+        <w:rPr>
+          <w:color w:val="00B050"/>
+        </w:rPr>
+      </w:pPr>
+      <w:proofErr w:type="gramStart"/>
+      <w:r>
+        <w:rPr>
+          <w:rStyle w:val="Strong"/>
+          <w:b/>
+          <w:bCs/>
+          <w:color w:val="00B050"/>
+        </w:rPr>
+        <w:t>7. Why is class</w:t>
+      </w:r>
+      <w:proofErr w:type="gramEnd"/>
+      <w:r>
+        <w:rPr>
+          <w:rStyle w:val="Strong"/>
+          <w:b/>
+          <w:bCs/>
+          <w:color w:val="00B050"/>
+        </w:rPr>
+        <w:t xml:space="preserve"> called a blueprint?</w:t>
+      </w:r>
+    </w:p>
+    <w:p>
+      <w:pPr>
+        <w:pStyle w:val="NormalWeb"/>
+        <w:spacing w:after="0" w:afterAutospacing="0"/>
+      </w:pPr>
+      <w:r>
+        <w:rPr>
+          <w:rStyle w:val="Strong"/>
+          <w:color w:val="FF0000"/>
+        </w:rPr>
+        <w:t>Answer</w:t>
+      </w:r>
+      <w:proofErr w:type="gramStart"/>
+      <w:r>
+        <w:rPr>
+          <w:rStyle w:val="Strong"/>
+          <w:color w:val="FF0000"/>
+        </w:rPr>
+        <w:t>:</w:t>
+      </w:r>
+      <w:proofErr w:type="gramEnd"/>
+      <w:r>
+        <w:rPr>
+          <w:color w:val="FF0000"/>
+        </w:rPr>
+        <w:br/>
+      </w:r>
+      <w:r>
+        <w:t xml:space="preserve">Because it defines structure and </w:t>
+      </w:r>
+      <w:proofErr w:type="spellStart"/>
+      <w:r>
+        <w:t>behaviour</w:t>
+      </w:r>
+      <w:proofErr w:type="spellEnd"/>
+      <w:r>
+        <w:t xml:space="preserve"> to create objects.</w:t>
+      </w:r>
+    </w:p>
+    <w:p>
+      <w:pPr>
+        <w:pStyle w:val="Heading3"/>
+        <w:spacing w:after="0" w:afterAutospacing="0"/>
+        <w:rPr>
+          <w:color w:val="00B050"/>
+        </w:rPr>
+      </w:pPr>
+      <w:r>
+        <w:rPr>
+          <w:rStyle w:val="Strong"/>
+          <w:b/>
+          <w:bCs/>
+          <w:color w:val="00B050"/>
+        </w:rPr>
+        <w:t>8. Justify the statement: “Classes are also known as user-defined data type.”</w:t>
+      </w:r>
+    </w:p>
+    <w:p>
+      <w:pPr>
+        <w:pStyle w:val="NormalWeb"/>
+        <w:spacing w:after="0" w:afterAutospacing="0"/>
+      </w:pPr>
+      <w:r>
+        <w:rPr>
+          <w:rStyle w:val="Strong"/>
+          <w:color w:val="FF0000"/>
+        </w:rPr>
+        <w:t>Answer</w:t>
+      </w:r>
+      <w:proofErr w:type="gramStart"/>
+      <w:r>
+        <w:rPr>
+          <w:rStyle w:val="Strong"/>
+          <w:color w:val="FF0000"/>
+        </w:rPr>
+        <w:t>:</w:t>
+      </w:r>
+      <w:proofErr w:type="gramEnd"/>
+      <w:r>
+        <w:rPr>
+          <w:color w:val="FF0000"/>
+        </w:rPr>
+        <w:br/>
+      </w:r>
+      <w:r>
+        <w:t>Classes allow users to define their own data structures using variables and methods, so they are called user-defined data types.</w:t>
+      </w:r>
+    </w:p>
+    <w:p>
+      <w:pPr>
+        <w:pStyle w:val="Heading1"/>
+        <w:rPr>
+          <w:rStyle w:val="Strong"/>
+          <w:bCs w:val="0"/>
+          <w:color w:val="00B0F0"/>
+          <w:sz w:val="36"/>
+        </w:rPr>
+      </w:pPr>
+      <w:r>
+        <w:rPr>
+          <w:rFonts w:ascii="Segoe UI Symbol" w:hAnsi="Segoe UI Symbol" w:cs="Segoe UI Symbol"/>
+          <w:color w:val="00B0F0"/>
+          <w:sz w:val="36"/>
+        </w:rPr>
+        <w:t>✅</w:t>
+      </w:r>
+      <w:r>
+        <w:rPr>
+          <w:color w:val="00B0F0"/>
+          <w:sz w:val="36"/>
+        </w:rPr>
+        <w:t xml:space="preserve"> </w:t>
+      </w:r>
+      <w:r>
+        <w:rPr>
+          <w:rStyle w:val="Strong"/>
+          <w:bCs w:val="0"/>
+          <w:color w:val="00B0F0"/>
+          <w:sz w:val="36"/>
+        </w:rPr>
+        <w:t>D. Picture Study</w:t>
+      </w:r>
+    </w:p>
+    <w:p>
+      <w:r>
+        <w:rPr>
+          <w:noProof/>
+        </w:rPr>
+        <w:drawing>
+          <wp:anchor distT="0" distB="0" distL="114300" distR="114300" simplePos="0" relativeHeight="251658752" behindDoc="0" locked="0" layoutInCell="1" allowOverlap="1">
+            <wp:simplePos x="0" y="0"/>
+            <wp:positionH relativeFrom="column">
+              <wp:posOffset>0</wp:posOffset>
+            </wp:positionH>
+            <wp:positionV relativeFrom="paragraph">
+              <wp:posOffset>4791</wp:posOffset>
+            </wp:positionV>
+            <wp:extent cx="2999006" cy="1634837"/>
+            <wp:effectExtent l="0" t="0" r="0" b="3810"/>
+            <wp:wrapNone/>
+            <wp:docPr id="1" name="Picture 1"/>
+            <wp:cNvGraphicFramePr>
+              <a:graphicFrameLocks xmlns:a="http://schemas.openxmlformats.org/drawingml/2006/main" noChangeAspect="1"/>
+            </wp:cNvGraphicFramePr>
+            <a:graphic xmlns:a="http://schemas.openxmlformats.org/drawingml/2006/main">
+              <a:graphicData uri="http://schemas.openxmlformats.org/drawingml/2006/picture">
+                <pic:pic xmlns:pic="http://schemas.openxmlformats.org/drawingml/2006/picture">
+                  <pic:nvPicPr>
+                    <pic:cNvPr id="1" name=""/>
+                    <pic:cNvPicPr/>
+                  </pic:nvPicPr>
+                  <pic:blipFill>
+                    <a:blip r:embed="rId5">
+                      <a:extLst>
+                        <a:ext uri="{28A0092B-C50C-407E-A947-70E740481C1C}">
+                          <a14:useLocalDpi xmlns:a14="http://schemas.microsoft.com/office/drawing/2010/main" val="0"/>
+                        </a:ext>
+                      </a:extLst>
+                    </a:blip>
+                    <a:stretch>
+                      <a:fillRect/>
+                    </a:stretch>
+                  </pic:blipFill>
+                  <pic:spPr>
+                    <a:xfrm>
+                      <a:off x="0" y="0"/>
+                      <a:ext cx="3014408" cy="1643233"/>
+                    </a:xfrm>
+                    <a:prstGeom prst="rect">
+                      <a:avLst/>
+                    </a:prstGeom>
+                  </pic:spPr>
+                </pic:pic>
+              </a:graphicData>
+            </a:graphic>
+            <wp14:sizeRelH relativeFrom="page">
+              <wp14:pctWidth>0</wp14:pctWidth>
+            </wp14:sizeRelH>
+            <wp14:sizeRelV relativeFrom="page">
+              <wp14:pctHeight>0</wp14:pctHeight>
+            </wp14:sizeRelV>
+          </wp:anchor>
+        </w:drawing>
+      </w:r>
+    </w:p>
+    <w:p/>
+    <w:p/>
+    <w:p/>
+    <w:p/>
+    <w:p>
+      <w:pPr>
+        <w:pStyle w:val="Heading3"/>
+        <w:spacing w:after="0" w:afterAutospacing="0"/>
+        <w:rPr>
+          <w:color w:val="00B050"/>
+        </w:rPr>
+      </w:pPr>
+      <w:r>
+        <w:rPr>
+          <w:rStyle w:val="Strong"/>
+          <w:b/>
+          <w:bCs/>
+          <w:color w:val="00B050"/>
+        </w:rPr>
+        <w:t>1. What is the name of the class?</w:t>
+      </w:r>
+    </w:p>
+    <w:p>
+      <w:pPr>
+        <w:pStyle w:val="NormalWeb"/>
+        <w:spacing w:after="0" w:afterAutospacing="0"/>
+        <w:ind w:left="450"/>
+      </w:pPr>
+      <w:r>
+        <w:lastRenderedPageBreak/>
+        <w:t>a. Student</w:t>
+      </w:r>
+      <w:r>
+        <w:br/>
+        <w:t xml:space="preserve">b. </w:t>
+      </w:r>
+      <w:proofErr w:type="spellStart"/>
+      <w:r>
+        <w:t>Ldati</w:t>
+      </w:r>
+      <w:proofErr w:type="spellEnd"/>
+      <w:r>
+        <w:br/>
+        <w:t>c. Ajay</w:t>
+      </w:r>
+      <w:r>
+        <w:br/>
+        <w:t xml:space="preserve">d. </w:t>
+      </w:r>
+      <w:proofErr w:type="spellStart"/>
+      <w:r>
+        <w:t>Reshma</w:t>
+      </w:r>
+      <w:proofErr w:type="spellEnd"/>
+    </w:p>
+    <w:p>
+      <w:pPr>
+        <w:pStyle w:val="NormalWeb"/>
+        <w:spacing w:after="0" w:afterAutospacing="0"/>
+        <w:rPr>
+          <w:color w:val="FF0000"/>
+        </w:rPr>
+      </w:pPr>
+      <w:r>
+        <w:rPr>
+          <w:rStyle w:val="Strong"/>
+          <w:color w:val="FF0000"/>
+        </w:rPr>
+        <w:t>Answer:</w:t>
+      </w:r>
+      <w:r>
+        <w:rPr>
+          <w:color w:val="FF0000"/>
+        </w:rPr>
+        <w:t xml:space="preserve"> a. Student </w:t>
+      </w:r>
+      <w:r>
+        <w:rPr>
+          <w:rFonts w:ascii="Segoe UI Symbol" w:hAnsi="Segoe UI Symbol" w:cs="Segoe UI Symbol"/>
+          <w:color w:val="FF0000"/>
+        </w:rPr>
+        <w:t>✅</w:t>
+      </w:r>
+    </w:p>
+    <w:p>
+      <w:pPr>
+        <w:pStyle w:val="Heading3"/>
+        <w:spacing w:after="0" w:afterAutospacing="0"/>
+        <w:rPr>
+          <w:color w:val="00B050"/>
+        </w:rPr>
+      </w:pPr>
+      <w:r>
+        <w:rPr>
+          <w:rStyle w:val="Strong"/>
+          <w:b/>
+          <w:bCs/>
+          <w:color w:val="00B050"/>
+        </w:rPr>
+        <w:t>2. Name the attributes of the class.</w:t>
+      </w:r>
+    </w:p>
+    <w:p>
+      <w:pPr>
+        <w:pStyle w:val="NormalWeb"/>
+        <w:spacing w:after="0" w:afterAutospacing="0"/>
+        <w:ind w:left="450"/>
+      </w:pPr>
+      <w:proofErr w:type="gramStart"/>
+      <w:r>
+        <w:t>a</w:t>
+      </w:r>
+      <w:proofErr w:type="gramEnd"/>
+      <w:r>
+        <w:t>. name</w:t>
+      </w:r>
+      <w:r>
+        <w:br/>
+        <w:t xml:space="preserve">b. </w:t>
+      </w:r>
+      <w:proofErr w:type="spellStart"/>
+      <w:r>
+        <w:t>std_type</w:t>
+      </w:r>
+      <w:proofErr w:type="spellEnd"/>
+      <w:r>
+        <w:br/>
+        <w:t>c. both a and b</w:t>
+      </w:r>
+      <w:r>
+        <w:br/>
+        <w:t>d. Both b and c</w:t>
+      </w:r>
+    </w:p>
+    <w:p>
+      <w:pPr>
+        <w:pStyle w:val="NormalWeb"/>
+        <w:spacing w:after="0" w:afterAutospacing="0"/>
+        <w:rPr>
+          <w:color w:val="FF0000"/>
+        </w:rPr>
+      </w:pPr>
+      <w:r>
+        <w:rPr>
+          <w:rStyle w:val="Strong"/>
+          <w:color w:val="FF0000"/>
+        </w:rPr>
+        <w:t>Answer:</w:t>
+      </w:r>
+      <w:r>
+        <w:rPr>
+          <w:color w:val="FF0000"/>
+        </w:rPr>
+        <w:t xml:space="preserve"> c. both a and b </w:t>
+      </w:r>
+      <w:r>
+        <w:rPr>
+          <w:rFonts w:ascii="Segoe UI Symbol" w:hAnsi="Segoe UI Symbol" w:cs="Segoe UI Symbol"/>
+          <w:color w:val="FF0000"/>
+        </w:rPr>
+        <w:t>✅</w:t>
+      </w:r>
+    </w:p>
+    <w:p>
+      <w:pPr>
+        <w:pStyle w:val="Heading3"/>
+        <w:spacing w:after="0" w:afterAutospacing="0"/>
+        <w:rPr>
+          <w:color w:val="00B050"/>
+        </w:rPr>
+      </w:pPr>
+      <w:r>
+        <w:rPr>
+          <w:rStyle w:val="Strong"/>
+          <w:b/>
+          <w:bCs/>
+          <w:color w:val="00B050"/>
+        </w:rPr>
+        <w:t>3. Name of methods.</w:t>
+      </w:r>
+    </w:p>
+    <w:p>
+      <w:pPr>
+        <w:pStyle w:val="NormalWeb"/>
+        <w:spacing w:after="0" w:afterAutospacing="0"/>
+        <w:ind w:left="450"/>
+      </w:pPr>
+      <w:r>
+        <w:t xml:space="preserve">a. </w:t>
+      </w:r>
+      <w:proofErr w:type="spellStart"/>
+      <w:r>
+        <w:t>setStu_</w:t>
+      </w:r>
+      <w:proofErr w:type="gramStart"/>
+      <w:r>
+        <w:t>type</w:t>
+      </w:r>
+      <w:proofErr w:type="spellEnd"/>
+      <w:r>
+        <w:t>(</w:t>
+      </w:r>
+      <w:proofErr w:type="gramEnd"/>
+      <w:r>
+        <w:t>)</w:t>
+      </w:r>
+      <w:r>
+        <w:br/>
+        <w:t xml:space="preserve">b. </w:t>
+      </w:r>
+      <w:proofErr w:type="spellStart"/>
+      <w:r>
+        <w:t>setStu</w:t>
+      </w:r>
+      <w:proofErr w:type="spellEnd"/>
+      <w:r>
+        <w:t>()</w:t>
+      </w:r>
+      <w:r>
+        <w:br/>
+        <w:t xml:space="preserve">c. </w:t>
+      </w:r>
+      <w:proofErr w:type="spellStart"/>
+      <w:r>
+        <w:t>setName</w:t>
+      </w:r>
+      <w:proofErr w:type="spellEnd"/>
+      <w:r>
+        <w:t>()</w:t>
+      </w:r>
+      <w:r>
+        <w:br/>
+        <w:t>d. Both a and c</w:t>
+      </w:r>
+    </w:p>
+    <w:p>
+      <w:pPr>
+        <w:pStyle w:val="NormalWeb"/>
+        <w:spacing w:after="0" w:afterAutospacing="0"/>
+        <w:rPr>
+          <w:color w:val="FF0000"/>
+        </w:rPr>
+      </w:pPr>
+      <w:r>
+        <w:rPr>
+          <w:rStyle w:val="Strong"/>
+          <w:color w:val="FF0000"/>
+        </w:rPr>
+        <w:t>Answer:</w:t>
+      </w:r>
+      <w:r>
+        <w:rPr>
+          <w:color w:val="FF0000"/>
+        </w:rPr>
+        <w:t xml:space="preserve"> d. Both a and c </w:t>
+      </w:r>
+      <w:r>
+        <w:rPr>
+          <w:rFonts w:ascii="Segoe UI Symbol" w:hAnsi="Segoe UI Symbol" w:cs="Segoe UI Symbol"/>
+          <w:color w:val="FF0000"/>
+        </w:rPr>
+        <w:t>✅</w:t>
+      </w:r>
+    </w:p>
+    <w:p>
+      <w:pPr>
+        <w:pStyle w:val="Heading3"/>
+        <w:spacing w:after="0" w:afterAutospacing="0"/>
+        <w:rPr>
+          <w:color w:val="00B050"/>
+        </w:rPr>
+      </w:pPr>
+      <w:r>
+        <w:rPr>
+          <w:rStyle w:val="Strong"/>
+          <w:b/>
+          <w:bCs/>
+          <w:color w:val="00B050"/>
+        </w:rPr>
+        <w:t xml:space="preserve">4. What is the value of </w:t>
+      </w:r>
+      <w:proofErr w:type="spellStart"/>
+      <w:r>
+        <w:rPr>
+          <w:rStyle w:val="Strong"/>
+          <w:b/>
+          <w:bCs/>
+          <w:color w:val="00B050"/>
+        </w:rPr>
+        <w:t>stu_type</w:t>
+      </w:r>
+      <w:proofErr w:type="spellEnd"/>
+      <w:r>
+        <w:rPr>
+          <w:rStyle w:val="Strong"/>
+          <w:b/>
+          <w:bCs/>
+          <w:color w:val="00B050"/>
+        </w:rPr>
+        <w:t xml:space="preserve"> attribute of object 3?</w:t>
+      </w:r>
+    </w:p>
+    <w:p>
+      <w:pPr>
+        <w:pStyle w:val="NormalWeb"/>
+        <w:spacing w:after="0" w:afterAutospacing="0"/>
+        <w:ind w:left="450"/>
+      </w:pPr>
+      <w:r>
+        <w:t>a. Primary</w:t>
+      </w:r>
+      <w:r>
+        <w:br/>
+        <w:t>b. Secondary</w:t>
+      </w:r>
+      <w:r>
+        <w:br/>
+        <w:t>c. Higher Secondary</w:t>
+      </w:r>
+      <w:r>
+        <w:br/>
+        <w:t>d. Graduate</w:t>
+      </w:r>
+    </w:p>
+    <w:p>
+      <w:pPr>
+        <w:pStyle w:val="NormalWeb"/>
+        <w:spacing w:after="0" w:afterAutospacing="0"/>
+        <w:rPr>
+          <w:color w:val="FF0000"/>
+        </w:rPr>
+      </w:pPr>
+      <w:r>
+        <w:rPr>
+          <w:rStyle w:val="Strong"/>
+          <w:color w:val="FF0000"/>
+        </w:rPr>
+        <w:t>Answer:</w:t>
+      </w:r>
+      <w:r>
+        <w:rPr>
+          <w:color w:val="FF0000"/>
+        </w:rPr>
+        <w:t xml:space="preserve"> b. Secondary </w:t>
+      </w:r>
+      <w:r>
+        <w:rPr>
+          <w:rFonts w:ascii="Segoe UI Symbol" w:hAnsi="Segoe UI Symbol" w:cs="Segoe UI Symbol"/>
+          <w:color w:val="FF0000"/>
+        </w:rPr>
+        <w:t>✅</w:t>
+      </w:r>
+    </w:p>
+    <w:p>
+      <w:pPr>
+        <w:pStyle w:val="Heading1"/>
+        <w:rPr>
+          <w:color w:val="00B0F0"/>
+          <w:sz w:val="36"/>
+        </w:rPr>
+      </w:pPr>
+      <w:r>
+        <w:rPr>
+          <w:rFonts w:ascii="Segoe UI Symbol" w:hAnsi="Segoe UI Symbol" w:cs="Segoe UI Symbol"/>
+          <w:color w:val="00B0F0"/>
+          <w:sz w:val="36"/>
+        </w:rPr>
+        <w:t>✅</w:t>
+      </w:r>
+      <w:r>
+        <w:rPr>
+          <w:color w:val="00B0F0"/>
+          <w:sz w:val="36"/>
+        </w:rPr>
+        <w:t xml:space="preserve"> </w:t>
+      </w:r>
+      <w:r>
+        <w:rPr>
+          <w:rStyle w:val="Strong"/>
+          <w:bCs w:val="0"/>
+          <w:color w:val="00B0F0"/>
+          <w:sz w:val="36"/>
+        </w:rPr>
+        <w:t>E. Case Study</w:t>
+      </w:r>
+    </w:p>
+    <w:p>
+      <w:pPr>
+        <w:pStyle w:val="Heading3"/>
+        <w:spacing w:after="0" w:afterAutospacing="0"/>
+        <w:rPr>
+          <w:color w:val="00B050"/>
+        </w:rPr>
+      </w:pPr>
+      <w:r>
+        <w:rPr>
+          <w:rStyle w:val="Strong"/>
+          <w:b/>
+          <w:bCs/>
+          <w:color w:val="00B050"/>
+        </w:rPr>
+        <w:t>1. A user-defined data type is same as ______.</w:t>
+      </w:r>
+    </w:p>
+    <w:p>
+      <w:pPr>
+        <w:pStyle w:val="NormalWeb"/>
+        <w:spacing w:after="0" w:afterAutospacing="0"/>
+        <w:ind w:left="450"/>
+      </w:pPr>
+      <w:proofErr w:type="gramStart"/>
+      <w:r>
+        <w:t>a</w:t>
+      </w:r>
+      <w:proofErr w:type="gramEnd"/>
+      <w:r>
+        <w:t>. primitive data type</w:t>
+      </w:r>
+      <w:r>
+        <w:br/>
+        <w:t>b. derived data type</w:t>
+      </w:r>
+      <w:r>
+        <w:br/>
+        <w:t>c. explicit data</w:t>
+      </w:r>
+      <w:r>
+        <w:br/>
+        <w:t>d. implicit data</w:t>
+      </w:r>
+    </w:p>
+    <w:p>
+      <w:pPr>
+        <w:pStyle w:val="NormalWeb"/>
+        <w:spacing w:after="0" w:afterAutospacing="0"/>
+        <w:rPr>
+          <w:color w:val="FF0000"/>
+        </w:rPr>
+      </w:pPr>
+      <w:r>
+        <w:rPr>
+          <w:rStyle w:val="Strong"/>
+          <w:color w:val="FF0000"/>
+        </w:rPr>
+        <w:t>Answer:</w:t>
+      </w:r>
+      <w:r>
+        <w:rPr>
+          <w:color w:val="FF0000"/>
+        </w:rPr>
+        <w:t xml:space="preserve"> b. derived data type </w:t>
+      </w:r>
+      <w:r>
+        <w:rPr>
+          <w:rFonts w:ascii="Segoe UI Symbol" w:hAnsi="Segoe UI Symbol" w:cs="Segoe UI Symbol"/>
+          <w:color w:val="FF0000"/>
+        </w:rPr>
+        <w:t>✅</w:t>
+      </w:r>
+    </w:p>
+    <w:p>
+      <w:pPr>
+        <w:pStyle w:val="Heading3"/>
+        <w:spacing w:after="0" w:afterAutospacing="0"/>
+        <w:rPr>
+          <w:color w:val="00B050"/>
+        </w:rPr>
+      </w:pPr>
+      <w:r>
+        <w:rPr>
+          <w:rStyle w:val="Strong"/>
+          <w:b/>
+          <w:bCs/>
+          <w:color w:val="00B050"/>
+        </w:rPr>
+        <w:lastRenderedPageBreak/>
+        <w:t>2. Each class is made up of ______.</w:t>
+      </w:r>
+    </w:p>
+    <w:p>
+      <w:pPr>
+        <w:pStyle w:val="NormalWeb"/>
+        <w:spacing w:after="0" w:afterAutospacing="0"/>
+        <w:ind w:left="450"/>
+      </w:pPr>
+      <w:proofErr w:type="gramStart"/>
+      <w:r>
+        <w:t>a</w:t>
+      </w:r>
+      <w:proofErr w:type="gramEnd"/>
+      <w:r>
+        <w:t>. data members</w:t>
+      </w:r>
+      <w:r>
+        <w:br/>
+        <w:t>b. predefined data types</w:t>
+      </w:r>
+      <w:r>
+        <w:br/>
+        <w:t>c. attributes</w:t>
+      </w:r>
+      <w:r>
+        <w:br/>
+        <w:t>d. all of these</w:t>
+      </w:r>
+    </w:p>
+    <w:p>
+      <w:pPr>
+        <w:pStyle w:val="NormalWeb"/>
+        <w:spacing w:after="0" w:afterAutospacing="0"/>
+        <w:rPr>
+          <w:color w:val="FF0000"/>
+        </w:rPr>
+      </w:pPr>
+      <w:r>
+        <w:rPr>
+          <w:rStyle w:val="Strong"/>
+          <w:color w:val="FF0000"/>
+        </w:rPr>
+        <w:t>Answer:</w:t>
+      </w:r>
+      <w:r>
+        <w:rPr>
+          <w:color w:val="FF0000"/>
+        </w:rPr>
+        <w:t xml:space="preserve"> d. all of these </w:t>
+      </w:r>
+      <w:r>
+        <w:rPr>
+          <w:rFonts w:ascii="Segoe UI Symbol" w:hAnsi="Segoe UI Symbol" w:cs="Segoe UI Symbol"/>
+          <w:color w:val="FF0000"/>
+        </w:rPr>
+        <w:t>✅</w:t>
+      </w:r>
+    </w:p>
+    <w:p>
+      <w:pPr>
+        <w:spacing w:after="0"/>
+        <w:jc w:val="center"/>
+        <w:rPr>
+          <w:rFonts w:ascii="Times New Roman" w:hAnsi="Times New Roman" w:cs="Times New Roman"/>
+          <w:b/>
+          <w:color w:val="FF0000"/>
+          <w:sz w:val="48"/>
+        </w:rPr>
+      </w:pPr>
+    </w:p>
+    <w:p>
+      <w:pPr>
+        <w:spacing w:after="0"/>
+        <w:jc w:val="center"/>
+        <w:rPr>
+          <w:rFonts w:ascii="Times New Roman" w:hAnsi="Times New Roman" w:cs="Times New Roman"/>
+          <w:b/>
+          <w:color w:val="FF0000"/>
+          <w:sz w:val="48"/>
+        </w:rPr>
+      </w:pPr>
+    </w:p>
+    <w:p>
+      <w:pPr>
+        <w:spacing w:after="0"/>
+        <w:jc w:val="center"/>
+        <w:rPr>
+          <w:rFonts w:ascii="Times New Roman" w:hAnsi="Times New Roman" w:cs="Times New Roman"/>
+          <w:b/>
+          <w:color w:val="FF0000"/>
+          <w:sz w:val="48"/>
+        </w:rPr>
+      </w:pPr>
+    </w:p>
+    <w:p>
+      <w:pPr>
+        <w:spacing w:after="0"/>
+        <w:jc w:val="center"/>
+        <w:rPr>
+          <w:rFonts w:ascii="Times New Roman" w:hAnsi="Times New Roman" w:cs="Times New Roman"/>
+          <w:b/>
+          <w:color w:val="FF0000"/>
+          <w:sz w:val="48"/>
+        </w:rPr>
+      </w:pPr>
+    </w:p>
+    <w:p>
+      <w:pPr>
+        <w:spacing w:after="0"/>
+        <w:jc w:val="center"/>
+        <w:rPr>
+          <w:rFonts w:ascii="Times New Roman" w:hAnsi="Times New Roman" w:cs="Times New Roman"/>
+          <w:b/>
+          <w:color w:val="FF0000"/>
+          <w:sz w:val="48"/>
+        </w:rPr>
+      </w:pPr>
+    </w:p>
+    <w:p>
+      <w:pPr>
+        <w:spacing w:after="0"/>
+        <w:jc w:val="center"/>
+        <w:rPr>
+          <w:rFonts w:ascii="Times New Roman" w:hAnsi="Times New Roman" w:cs="Times New Roman"/>
+          <w:b/>
+          <w:color w:val="FF0000"/>
+          <w:sz w:val="48"/>
+        </w:rPr>
+      </w:pPr>
+    </w:p>
+    <w:p>
+      <w:pPr>
+        <w:spacing w:after="0"/>
+        <w:jc w:val="center"/>
+        <w:rPr>
+          <w:rFonts w:ascii="Times New Roman" w:hAnsi="Times New Roman" w:cs="Times New Roman"/>
+          <w:b/>
+          <w:color w:val="FF0000"/>
+          <w:sz w:val="48"/>
+        </w:rPr>
+      </w:pPr>
+    </w:p>
+    <w:p>
+      <w:pPr>
+        <w:spacing w:after="0"/>
+        <w:jc w:val="center"/>
+        <w:rPr>
+          <w:rFonts w:ascii="Times New Roman" w:hAnsi="Times New Roman" w:cs="Times New Roman"/>
+          <w:b/>
+          <w:color w:val="FF0000"/>
+          <w:sz w:val="48"/>
+        </w:rPr>
+      </w:pPr>
+      <w:r>
+        <w:rPr>
+          <w:rFonts w:ascii="Times New Roman" w:hAnsi="Times New Roman" w:cs="Times New Roman"/>
+          <w:b/>
+          <w:color w:val="FF0000"/>
+          <w:sz w:val="48"/>
+        </w:rPr>
+        <w:t>Class 9 chapter 3</w:t>
+      </w:r>
+      <w:r>
+        <w:rPr>
+          <w:rFonts w:ascii="Times New Roman" w:hAnsi="Times New Roman" w:cs="Times New Roman"/>
+          <w:b/>
+          <w:color w:val="FF0000"/>
+          <w:sz w:val="48"/>
+        </w:rPr>
+        <w:t>(2025-26)</w:t>
+      </w:r>
+    </w:p>
+    <w:p>
+      <w:pPr>
+        <w:spacing w:after="0"/>
+        <w:jc w:val="center"/>
+        <w:rPr>
+          <w:rFonts w:ascii="Times New Roman" w:hAnsi="Times New Roman" w:cs="Times New Roman"/>
+          <w:b/>
+          <w:color w:val="984806" w:themeColor="accent6" w:themeShade="80"/>
+          <w:sz w:val="48"/>
+          <w:u w:val="single"/>
+        </w:rPr>
+      </w:pPr>
+      <w:r>
+        <w:rPr>
+          <w:rFonts w:ascii="Times New Roman" w:hAnsi="Times New Roman" w:cs="Times New Roman"/>
+          <w:b/>
+          <w:color w:val="984806" w:themeColor="accent6" w:themeShade="80"/>
+          <w:sz w:val="48"/>
+          <w:u w:val="single"/>
+        </w:rPr>
+        <w:t>Elementary concept of object and class</w:t>
+      </w:r>
+    </w:p>
+    <w:p>
+      <w:pPr>
+        <w:spacing w:before="100" w:beforeAutospacing="1" w:after="0" w:line="240" w:lineRule="auto"/>
         <w:outlineLvl w:val="2"/>
         <w:rPr>
           <w:rFonts w:ascii="Times New Roman" w:eastAsia="Times New Roman" w:hAnsi="Times New Roman" w:cs="Times New Roman"/>
@@ -94,7 +2861,7 @@
           <w:ilvl w:val="0"/>
           <w:numId w:val="1"/>
         </w:numPr>
-        <w:spacing w:before="100" w:beforeAutospacing="1" w:after="100" w:afterAutospacing="1" w:line="240" w:lineRule="auto"/>
+        <w:spacing w:before="100" w:beforeAutospacing="1" w:after="0" w:line="240" w:lineRule="auto"/>
         <w:rPr>
           <w:rFonts w:ascii="Times New Roman" w:eastAsia="Times New Roman" w:hAnsi="Times New Roman" w:cs="Times New Roman"/>
           <w:sz w:val="24"/>
@@ -118,7 +2885,7 @@
           <w:ilvl w:val="1"/>
           <w:numId w:val="1"/>
         </w:numPr>
-        <w:spacing w:before="100" w:beforeAutospacing="1" w:after="100" w:afterAutospacing="1" w:line="240" w:lineRule="auto"/>
+        <w:spacing w:before="100" w:beforeAutospacing="1" w:after="0" w:line="240" w:lineRule="auto"/>
         <w:rPr>
           <w:rFonts w:ascii="Times New Roman" w:eastAsia="Times New Roman" w:hAnsi="Times New Roman" w:cs="Times New Roman"/>
           <w:color w:val="FF0000"/>
@@ -171,7 +2938,7 @@
           <w:ilvl w:val="0"/>
           <w:numId w:val="1"/>
         </w:numPr>
-        <w:spacing w:before="100" w:beforeAutospacing="1" w:after="100" w:afterAutospacing="1" w:line="240" w:lineRule="auto"/>
+        <w:spacing w:before="100" w:beforeAutospacing="1" w:after="0" w:line="240" w:lineRule="auto"/>
         <w:rPr>
           <w:rFonts w:ascii="Times New Roman" w:eastAsia="Times New Roman" w:hAnsi="Times New Roman" w:cs="Times New Roman"/>
           <w:sz w:val="24"/>
@@ -195,7 +2962,7 @@
           <w:ilvl w:val="1"/>
           <w:numId w:val="1"/>
         </w:numPr>
-        <w:spacing w:before="100" w:beforeAutospacing="1" w:after="100" w:afterAutospacing="1" w:line="240" w:lineRule="auto"/>
+        <w:spacing w:before="100" w:beforeAutospacing="1" w:after="0" w:line="240" w:lineRule="auto"/>
         <w:rPr>
           <w:rFonts w:ascii="Times New Roman" w:eastAsia="Times New Roman" w:hAnsi="Times New Roman" w:cs="Times New Roman"/>
           <w:color w:val="FF0000"/>
@@ -272,7 +3039,7 @@
           <w:ilvl w:val="0"/>
           <w:numId w:val="1"/>
         </w:numPr>
-        <w:spacing w:before="100" w:beforeAutospacing="1" w:after="100" w:afterAutospacing="1" w:line="240" w:lineRule="auto"/>
+        <w:spacing w:before="100" w:beforeAutospacing="1" w:after="0" w:line="240" w:lineRule="auto"/>
         <w:rPr>
           <w:rFonts w:ascii="Times New Roman" w:eastAsia="Times New Roman" w:hAnsi="Times New Roman" w:cs="Times New Roman"/>
           <w:sz w:val="24"/>
@@ -296,7 +3063,7 @@
           <w:ilvl w:val="1"/>
           <w:numId w:val="1"/>
         </w:numPr>
-        <w:spacing w:before="100" w:beforeAutospacing="1" w:after="100" w:afterAutospacing="1" w:line="240" w:lineRule="auto"/>
+        <w:spacing w:before="100" w:beforeAutospacing="1" w:after="0" w:line="240" w:lineRule="auto"/>
         <w:rPr>
           <w:rFonts w:ascii="Times New Roman" w:eastAsia="Times New Roman" w:hAnsi="Times New Roman" w:cs="Times New Roman"/>
           <w:color w:val="FF0000"/>
@@ -349,7 +3116,7 @@
           <w:ilvl w:val="0"/>
           <w:numId w:val="1"/>
         </w:numPr>
-        <w:spacing w:before="100" w:beforeAutospacing="1" w:after="100" w:afterAutospacing="1" w:line="240" w:lineRule="auto"/>
+        <w:spacing w:before="100" w:beforeAutospacing="1" w:after="0" w:line="240" w:lineRule="auto"/>
         <w:rPr>
           <w:rFonts w:ascii="Times New Roman" w:eastAsia="Times New Roman" w:hAnsi="Times New Roman" w:cs="Times New Roman"/>
           <w:sz w:val="24"/>
@@ -373,7 +3140,7 @@
           <w:ilvl w:val="1"/>
           <w:numId w:val="1"/>
         </w:numPr>
-        <w:spacing w:before="100" w:beforeAutospacing="1" w:after="100" w:afterAutospacing="1" w:line="240" w:lineRule="auto"/>
+        <w:spacing w:before="100" w:beforeAutospacing="1" w:after="0" w:line="240" w:lineRule="auto"/>
         <w:rPr>
           <w:rFonts w:ascii="Times New Roman" w:eastAsia="Times New Roman" w:hAnsi="Times New Roman" w:cs="Times New Roman"/>
           <w:color w:val="FF0000"/>
@@ -426,7 +3193,7 @@
           <w:ilvl w:val="0"/>
           <w:numId w:val="1"/>
         </w:numPr>
-        <w:spacing w:before="100" w:beforeAutospacing="1" w:after="100" w:afterAutospacing="1" w:line="240" w:lineRule="auto"/>
+        <w:spacing w:before="100" w:beforeAutospacing="1" w:after="0" w:line="240" w:lineRule="auto"/>
         <w:rPr>
           <w:rFonts w:ascii="Times New Roman" w:eastAsia="Times New Roman" w:hAnsi="Times New Roman" w:cs="Times New Roman"/>
           <w:sz w:val="24"/>
@@ -450,7 +3217,7 @@
           <w:ilvl w:val="1"/>
           <w:numId w:val="1"/>
         </w:numPr>
-        <w:spacing w:before="100" w:beforeAutospacing="1" w:after="100" w:afterAutospacing="1" w:line="240" w:lineRule="auto"/>
+        <w:spacing w:before="100" w:beforeAutospacing="1" w:after="0" w:line="240" w:lineRule="auto"/>
         <w:rPr>
           <w:rFonts w:ascii="Times New Roman" w:eastAsia="Times New Roman" w:hAnsi="Times New Roman" w:cs="Times New Roman"/>
           <w:color w:val="FF0000"/>
@@ -503,7 +3270,7 @@
           <w:ilvl w:val="0"/>
           <w:numId w:val="1"/>
         </w:numPr>
-        <w:spacing w:before="100" w:beforeAutospacing="1" w:after="100" w:afterAutospacing="1" w:line="240" w:lineRule="auto"/>
+        <w:spacing w:before="100" w:beforeAutospacing="1" w:after="0" w:line="240" w:lineRule="auto"/>
         <w:rPr>
           <w:rFonts w:ascii="Times New Roman" w:eastAsia="Times New Roman" w:hAnsi="Times New Roman" w:cs="Times New Roman"/>
           <w:sz w:val="24"/>
@@ -527,7 +3294,7 @@
           <w:ilvl w:val="1"/>
           <w:numId w:val="1"/>
         </w:numPr>
-        <w:spacing w:before="100" w:beforeAutospacing="1" w:after="100" w:afterAutospacing="1" w:line="240" w:lineRule="auto"/>
+        <w:spacing w:before="100" w:beforeAutospacing="1" w:after="0" w:line="240" w:lineRule="auto"/>
         <w:rPr>
           <w:rFonts w:ascii="Times New Roman" w:eastAsia="Times New Roman" w:hAnsi="Times New Roman" w:cs="Times New Roman"/>
           <w:color w:val="FF0000"/>
@@ -544,6 +3311,7 @@
           <w:sz w:val="32"/>
           <w:szCs w:val="24"/>
         </w:rPr>
+        <w:lastRenderedPageBreak/>
         <w:t>d. All of these</w:t>
       </w:r>
       <w:r>
@@ -598,7 +3366,7 @@
     </w:p>
     <w:p>
       <w:pPr>
-        <w:spacing w:before="100" w:beforeAutospacing="1" w:after="100" w:afterAutospacing="1" w:line="240" w:lineRule="auto"/>
+        <w:spacing w:before="100" w:beforeAutospacing="1" w:after="0" w:line="240" w:lineRule="auto"/>
         <w:outlineLvl w:val="2"/>
         <w:rPr>
           <w:rFonts w:ascii="Times New Roman" w:eastAsia="Times New Roman" w:hAnsi="Times New Roman" w:cs="Times New Roman"/>
@@ -625,7 +3393,7 @@
           <w:ilvl w:val="0"/>
           <w:numId w:val="2"/>
         </w:numPr>
-        <w:spacing w:before="100" w:beforeAutospacing="1" w:after="100" w:afterAutospacing="1" w:line="240" w:lineRule="auto"/>
+        <w:spacing w:before="100" w:beforeAutospacing="1" w:after="0" w:line="240" w:lineRule="auto"/>
         <w:rPr>
           <w:rFonts w:ascii="Times New Roman" w:eastAsia="Times New Roman" w:hAnsi="Times New Roman" w:cs="Times New Roman"/>
           <w:sz w:val="24"/>
@@ -676,7 +3444,7 @@
           <w:ilvl w:val="0"/>
           <w:numId w:val="2"/>
         </w:numPr>
-        <w:spacing w:before="100" w:beforeAutospacing="1" w:after="100" w:afterAutospacing="1" w:line="240" w:lineRule="auto"/>
+        <w:spacing w:before="100" w:beforeAutospacing="1" w:after="0" w:line="240" w:lineRule="auto"/>
         <w:rPr>
           <w:rFonts w:ascii="Times New Roman" w:eastAsia="Times New Roman" w:hAnsi="Times New Roman" w:cs="Times New Roman"/>
           <w:sz w:val="24"/>
@@ -735,7 +3503,7 @@
           <w:ilvl w:val="0"/>
           <w:numId w:val="2"/>
         </w:numPr>
-        <w:spacing w:before="100" w:beforeAutospacing="1" w:after="100" w:afterAutospacing="1" w:line="240" w:lineRule="auto"/>
+        <w:spacing w:before="100" w:beforeAutospacing="1" w:after="0" w:line="240" w:lineRule="auto"/>
         <w:rPr>
           <w:rFonts w:ascii="Times New Roman" w:eastAsia="Times New Roman" w:hAnsi="Times New Roman" w:cs="Times New Roman"/>
           <w:sz w:val="24"/>
@@ -794,7 +3562,7 @@
           <w:ilvl w:val="0"/>
           <w:numId w:val="2"/>
         </w:numPr>
-        <w:spacing w:before="100" w:beforeAutospacing="1" w:after="100" w:afterAutospacing="1" w:line="240" w:lineRule="auto"/>
+        <w:spacing w:before="100" w:beforeAutospacing="1" w:after="0" w:line="240" w:lineRule="auto"/>
         <w:rPr>
           <w:rFonts w:ascii="Times New Roman" w:eastAsia="Times New Roman" w:hAnsi="Times New Roman" w:cs="Times New Roman"/>
           <w:sz w:val="24"/>
@@ -845,7 +3613,7 @@
           <w:ilvl w:val="0"/>
           <w:numId w:val="2"/>
         </w:numPr>
-        <w:spacing w:before="100" w:beforeAutospacing="1" w:after="100" w:afterAutospacing="1" w:line="240" w:lineRule="auto"/>
+        <w:spacing w:before="100" w:beforeAutospacing="1" w:after="0" w:line="240" w:lineRule="auto"/>
         <w:rPr>
           <w:rFonts w:ascii="Times New Roman" w:eastAsia="Times New Roman" w:hAnsi="Times New Roman" w:cs="Times New Roman"/>
           <w:sz w:val="24"/>
@@ -912,7 +3680,7 @@
     </w:p>
     <w:p>
       <w:pPr>
-        <w:spacing w:before="100" w:beforeAutospacing="1" w:after="100" w:afterAutospacing="1" w:line="240" w:lineRule="auto"/>
+        <w:spacing w:before="100" w:beforeAutospacing="1" w:after="0" w:line="240" w:lineRule="auto"/>
         <w:outlineLvl w:val="3"/>
         <w:rPr>
           <w:rFonts w:ascii="Times New Roman" w:eastAsia="Times New Roman" w:hAnsi="Times New Roman" w:cs="Times New Roman"/>
@@ -1305,7 +4073,7 @@
     </w:p>
     <w:p>
       <w:pPr>
-        <w:spacing w:before="100" w:beforeAutospacing="1" w:after="100" w:afterAutospacing="1" w:line="240" w:lineRule="auto"/>
+        <w:spacing w:before="100" w:beforeAutospacing="1" w:after="0" w:line="240" w:lineRule="auto"/>
         <w:rPr>
           <w:rFonts w:ascii="Times New Roman" w:eastAsia="Times New Roman" w:hAnsi="Times New Roman" w:cs="Times New Roman"/>
           <w:sz w:val="24"/>
@@ -1319,7 +4087,6 @@
           <w:sz w:val="24"/>
           <w:szCs w:val="24"/>
         </w:rPr>
-        <w:lastRenderedPageBreak/>
         <w:t>a</w:t>
       </w:r>
       <w:proofErr w:type="gramEnd"/>
@@ -1355,7 +4122,7 @@
     </w:p>
     <w:p>
       <w:pPr>
-        <w:spacing w:before="100" w:beforeAutospacing="1" w:after="100" w:afterAutospacing="1" w:line="240" w:lineRule="auto"/>
+        <w:spacing w:before="100" w:beforeAutospacing="1" w:after="0" w:line="240" w:lineRule="auto"/>
         <w:rPr>
           <w:rFonts w:ascii="Times New Roman" w:eastAsia="Times New Roman" w:hAnsi="Times New Roman" w:cs="Times New Roman"/>
           <w:sz w:val="24"/>
@@ -1404,7 +4171,7 @@
     </w:p>
     <w:p>
       <w:pPr>
-        <w:spacing w:before="100" w:beforeAutospacing="1" w:after="100" w:afterAutospacing="1" w:line="240" w:lineRule="auto"/>
+        <w:spacing w:before="100" w:beforeAutospacing="1" w:after="0" w:line="240" w:lineRule="auto"/>
         <w:rPr>
           <w:rFonts w:ascii="Times New Roman" w:eastAsia="Times New Roman" w:hAnsi="Times New Roman" w:cs="Times New Roman"/>
           <w:sz w:val="24"/>
@@ -1497,7 +4264,7 @@
     </w:p>
     <w:p>
       <w:pPr>
-        <w:spacing w:before="100" w:beforeAutospacing="1" w:after="100" w:afterAutospacing="1" w:line="240" w:lineRule="auto"/>
+        <w:spacing w:before="100" w:beforeAutospacing="1" w:after="0" w:line="240" w:lineRule="auto"/>
         <w:rPr>
           <w:rFonts w:ascii="Times New Roman" w:eastAsia="Times New Roman" w:hAnsi="Times New Roman" w:cs="Times New Roman"/>
           <w:sz w:val="24"/>
@@ -1545,7 +4312,7 @@
     </w:p>
     <w:p>
       <w:pPr>
-        <w:spacing w:before="100" w:beforeAutospacing="1" w:after="100" w:afterAutospacing="1" w:line="240" w:lineRule="auto"/>
+        <w:spacing w:before="100" w:beforeAutospacing="1" w:after="0" w:line="240" w:lineRule="auto"/>
         <w:rPr>
           <w:rFonts w:ascii="Times New Roman" w:eastAsia="Times New Roman" w:hAnsi="Times New Roman" w:cs="Times New Roman"/>
           <w:sz w:val="24"/>
@@ -1594,7 +4361,7 @@
     </w:p>
     <w:p>
       <w:pPr>
-        <w:spacing w:before="100" w:beforeAutospacing="1" w:after="100" w:afterAutospacing="1" w:line="240" w:lineRule="auto"/>
+        <w:spacing w:before="100" w:beforeAutospacing="1" w:after="0" w:line="240" w:lineRule="auto"/>
         <w:rPr>
           <w:rFonts w:ascii="Times New Roman" w:eastAsia="Times New Roman" w:hAnsi="Times New Roman" w:cs="Times New Roman"/>
           <w:sz w:val="24"/>
@@ -1633,7 +4400,7 @@
     </w:p>
     <w:p>
       <w:pPr>
-        <w:spacing w:before="100" w:beforeAutospacing="1" w:after="100" w:afterAutospacing="1" w:line="240" w:lineRule="auto"/>
+        <w:spacing w:before="100" w:beforeAutospacing="1" w:after="0" w:line="240" w:lineRule="auto"/>
         <w:rPr>
           <w:rFonts w:ascii="Times New Roman" w:eastAsia="Times New Roman" w:hAnsi="Times New Roman" w:cs="Times New Roman"/>
           <w:sz w:val="24"/>
@@ -1702,7 +4469,7 @@
     </w:p>
     <w:p>
       <w:pPr>
-        <w:spacing w:before="100" w:beforeAutospacing="1" w:after="100" w:afterAutospacing="1" w:line="240" w:lineRule="auto"/>
+        <w:spacing w:before="100" w:beforeAutospacing="1" w:after="0" w:line="240" w:lineRule="auto"/>
         <w:outlineLvl w:val="2"/>
         <w:rPr>
           <w:rFonts w:ascii="Times New Roman" w:eastAsia="Times New Roman" w:hAnsi="Times New Roman" w:cs="Times New Roman"/>
@@ -1729,7 +4496,7 @@
           <w:ilvl w:val="0"/>
           <w:numId w:val="3"/>
         </w:numPr>
-        <w:spacing w:before="100" w:beforeAutospacing="1" w:after="100" w:afterAutospacing="1" w:line="240" w:lineRule="auto"/>
+        <w:spacing w:before="100" w:beforeAutospacing="1" w:after="0" w:line="240" w:lineRule="auto"/>
         <w:rPr>
           <w:rFonts w:ascii="Times New Roman" w:eastAsia="Times New Roman" w:hAnsi="Times New Roman" w:cs="Times New Roman"/>
           <w:sz w:val="24"/>
@@ -1753,7 +4520,7 @@
           <w:ilvl w:val="1"/>
           <w:numId w:val="3"/>
         </w:numPr>
-        <w:spacing w:before="100" w:beforeAutospacing="1" w:after="100" w:afterAutospacing="1" w:line="240" w:lineRule="auto"/>
+        <w:spacing w:before="100" w:beforeAutospacing="1" w:after="0" w:line="240" w:lineRule="auto"/>
         <w:rPr>
           <w:rFonts w:ascii="Times New Roman" w:eastAsia="Times New Roman" w:hAnsi="Times New Roman" w:cs="Times New Roman"/>
           <w:sz w:val="24"/>
@@ -1805,7 +4572,7 @@
           <w:ilvl w:val="0"/>
           <w:numId w:val="3"/>
         </w:numPr>
-        <w:spacing w:before="100" w:beforeAutospacing="1" w:after="100" w:afterAutospacing="1" w:line="240" w:lineRule="auto"/>
+        <w:spacing w:before="100" w:beforeAutospacing="1" w:after="0" w:line="240" w:lineRule="auto"/>
         <w:rPr>
           <w:rFonts w:ascii="Times New Roman" w:eastAsia="Times New Roman" w:hAnsi="Times New Roman" w:cs="Times New Roman"/>
           <w:sz w:val="24"/>
@@ -1829,7 +4596,7 @@
           <w:ilvl w:val="1"/>
           <w:numId w:val="3"/>
         </w:numPr>
-        <w:spacing w:before="100" w:beforeAutospacing="1" w:after="100" w:afterAutospacing="1" w:line="240" w:lineRule="auto"/>
+        <w:spacing w:before="100" w:beforeAutospacing="1" w:after="0" w:line="240" w:lineRule="auto"/>
         <w:rPr>
           <w:rFonts w:ascii="Times New Roman" w:eastAsia="Times New Roman" w:hAnsi="Times New Roman" w:cs="Times New Roman"/>
           <w:sz w:val="24"/>
@@ -1851,7 +4618,7 @@
           <w:ilvl w:val="2"/>
           <w:numId w:val="3"/>
         </w:numPr>
-        <w:spacing w:before="100" w:beforeAutospacing="1" w:after="100" w:afterAutospacing="1" w:line="240" w:lineRule="auto"/>
+        <w:spacing w:before="100" w:beforeAutospacing="1" w:after="0" w:line="240" w:lineRule="auto"/>
         <w:rPr>
           <w:rFonts w:ascii="Times New Roman" w:eastAsia="Times New Roman" w:hAnsi="Times New Roman" w:cs="Times New Roman"/>
           <w:sz w:val="24"/>
@@ -1875,7 +4642,7 @@
           <w:ilvl w:val="2"/>
           <w:numId w:val="3"/>
         </w:numPr>
-        <w:spacing w:before="100" w:beforeAutospacing="1" w:after="100" w:afterAutospacing="1" w:line="240" w:lineRule="auto"/>
+        <w:spacing w:before="100" w:beforeAutospacing="1" w:after="0" w:line="240" w:lineRule="auto"/>
         <w:rPr>
           <w:rFonts w:ascii="Times New Roman" w:eastAsia="Times New Roman" w:hAnsi="Times New Roman" w:cs="Times New Roman"/>
           <w:sz w:val="24"/>
@@ -1899,7 +4666,7 @@
           <w:ilvl w:val="2"/>
           <w:numId w:val="3"/>
         </w:numPr>
-        <w:spacing w:before="100" w:beforeAutospacing="1" w:after="100" w:afterAutospacing="1" w:line="240" w:lineRule="auto"/>
+        <w:spacing w:before="100" w:beforeAutospacing="1" w:after="0" w:line="240" w:lineRule="auto"/>
         <w:rPr>
           <w:rFonts w:ascii="Times New Roman" w:eastAsia="Times New Roman" w:hAnsi="Times New Roman" w:cs="Times New Roman"/>
           <w:sz w:val="24"/>
@@ -1923,7 +4690,7 @@
           <w:ilvl w:val="2"/>
           <w:numId w:val="3"/>
         </w:numPr>
-        <w:spacing w:before="100" w:beforeAutospacing="1" w:after="100" w:afterAutospacing="1" w:line="240" w:lineRule="auto"/>
+        <w:spacing w:before="100" w:beforeAutospacing="1" w:after="0" w:line="240" w:lineRule="auto"/>
         <w:rPr>
           <w:rFonts w:ascii="Times New Roman" w:eastAsia="Times New Roman" w:hAnsi="Times New Roman" w:cs="Times New Roman"/>
           <w:sz w:val="24"/>
@@ -1947,21 +4714,22 @@
           <w:ilvl w:val="0"/>
           <w:numId w:val="3"/>
         </w:numPr>
-        <w:spacing w:before="100" w:beforeAutospacing="1" w:after="100" w:afterAutospacing="1" w:line="240" w:lineRule="auto"/>
-        <w:rPr>
-          <w:rFonts w:ascii="Times New Roman" w:eastAsia="Times New Roman" w:hAnsi="Times New Roman" w:cs="Times New Roman"/>
-          <w:sz w:val="24"/>
-          <w:szCs w:val="24"/>
-        </w:rPr>
-      </w:pPr>
-      <w:r>
-        <w:rPr>
-          <w:rFonts w:ascii="Times New Roman" w:eastAsia="Times New Roman" w:hAnsi="Times New Roman" w:cs="Times New Roman"/>
-          <w:b/>
-          <w:bCs/>
-          <w:sz w:val="24"/>
-          <w:szCs w:val="24"/>
-        </w:rPr>
+        <w:spacing w:before="100" w:beforeAutospacing="1" w:after="0" w:line="240" w:lineRule="auto"/>
+        <w:rPr>
+          <w:rFonts w:ascii="Times New Roman" w:eastAsia="Times New Roman" w:hAnsi="Times New Roman" w:cs="Times New Roman"/>
+          <w:sz w:val="24"/>
+          <w:szCs w:val="24"/>
+        </w:rPr>
+      </w:pPr>
+      <w:r>
+        <w:rPr>
+          <w:rFonts w:ascii="Times New Roman" w:eastAsia="Times New Roman" w:hAnsi="Times New Roman" w:cs="Times New Roman"/>
+          <w:b/>
+          <w:bCs/>
+          <w:sz w:val="24"/>
+          <w:szCs w:val="24"/>
+        </w:rPr>
+        <w:lastRenderedPageBreak/>
         <w:t>How do you define a class in Java?</w:t>
       </w:r>
     </w:p>
@@ -1971,7 +4739,7 @@
           <w:ilvl w:val="1"/>
           <w:numId w:val="3"/>
         </w:numPr>
-        <w:spacing w:before="100" w:beforeAutospacing="1" w:after="100" w:afterAutospacing="1" w:line="240" w:lineRule="auto"/>
+        <w:spacing w:before="100" w:beforeAutospacing="1" w:after="0" w:line="240" w:lineRule="auto"/>
         <w:rPr>
           <w:rFonts w:ascii="Times New Roman" w:eastAsia="Times New Roman" w:hAnsi="Times New Roman" w:cs="Times New Roman"/>
           <w:sz w:val="24"/>
@@ -2031,8 +4799,6 @@
           <w:szCs w:val="20"/>
         </w:rPr>
       </w:pPr>
-      <w:bookmarkStart w:id="0" w:name="_GoBack"/>
-      <w:bookmarkEnd w:id="0"/>
       <w:proofErr w:type="gramStart"/>
       <w:r>
         <w:rPr>
@@ -2393,7 +5159,7 @@
           <w:ilvl w:val="0"/>
           <w:numId w:val="3"/>
         </w:numPr>
-        <w:spacing w:before="100" w:beforeAutospacing="1" w:after="100" w:afterAutospacing="1" w:line="240" w:lineRule="auto"/>
+        <w:spacing w:before="100" w:beforeAutospacing="1" w:after="0" w:line="240" w:lineRule="auto"/>
         <w:rPr>
           <w:rFonts w:ascii="Times New Roman" w:eastAsia="Times New Roman" w:hAnsi="Times New Roman" w:cs="Times New Roman"/>
           <w:sz w:val="24"/>
@@ -2417,7 +5183,7 @@
           <w:ilvl w:val="1"/>
           <w:numId w:val="3"/>
         </w:numPr>
-        <w:spacing w:before="100" w:beforeAutospacing="1" w:after="100" w:afterAutospacing="1" w:line="240" w:lineRule="auto"/>
+        <w:spacing w:before="100" w:beforeAutospacing="1" w:after="0" w:line="240" w:lineRule="auto"/>
         <w:rPr>
           <w:rFonts w:ascii="Times New Roman" w:eastAsia="Times New Roman" w:hAnsi="Times New Roman" w:cs="Times New Roman"/>
           <w:sz w:val="24"/>
@@ -2439,7 +5205,7 @@
           <w:ilvl w:val="0"/>
           <w:numId w:val="3"/>
         </w:numPr>
-        <w:spacing w:before="100" w:beforeAutospacing="1" w:after="100" w:afterAutospacing="1" w:line="240" w:lineRule="auto"/>
+        <w:spacing w:before="100" w:beforeAutospacing="1" w:after="0" w:line="240" w:lineRule="auto"/>
         <w:rPr>
           <w:rFonts w:ascii="Times New Roman" w:eastAsia="Times New Roman" w:hAnsi="Times New Roman" w:cs="Times New Roman"/>
           <w:sz w:val="24"/>
@@ -2463,7 +5229,7 @@
           <w:ilvl w:val="1"/>
           <w:numId w:val="3"/>
         </w:numPr>
-        <w:spacing w:before="100" w:beforeAutospacing="1" w:after="100" w:afterAutospacing="1" w:line="240" w:lineRule="auto"/>
+        <w:spacing w:before="100" w:beforeAutospacing="1" w:after="0" w:line="240" w:lineRule="auto"/>
         <w:rPr>
           <w:rFonts w:ascii="Times New Roman" w:eastAsia="Times New Roman" w:hAnsi="Times New Roman" w:cs="Times New Roman"/>
           <w:sz w:val="24"/>
@@ -2519,7 +5285,7 @@
           <w:ilvl w:val="0"/>
           <w:numId w:val="3"/>
         </w:numPr>
-        <w:spacing w:before="100" w:beforeAutospacing="1" w:after="100" w:afterAutospacing="1" w:line="240" w:lineRule="auto"/>
+        <w:spacing w:before="100" w:beforeAutospacing="1" w:after="0" w:line="240" w:lineRule="auto"/>
         <w:rPr>
           <w:rFonts w:ascii="Times New Roman" w:eastAsia="Times New Roman" w:hAnsi="Times New Roman" w:cs="Times New Roman"/>
           <w:sz w:val="24"/>
@@ -2543,7 +5309,7 @@
           <w:ilvl w:val="1"/>
           <w:numId w:val="3"/>
         </w:numPr>
-        <w:spacing w:before="100" w:beforeAutospacing="1" w:after="100" w:afterAutospacing="1" w:line="240" w:lineRule="auto"/>
+        <w:spacing w:before="100" w:beforeAutospacing="1" w:after="0" w:line="240" w:lineRule="auto"/>
         <w:rPr>
           <w:rFonts w:ascii="Times New Roman" w:eastAsia="Times New Roman" w:hAnsi="Times New Roman" w:cs="Times New Roman"/>
           <w:sz w:val="24"/>
@@ -2565,20 +5331,19 @@
           <w:ilvl w:val="2"/>
           <w:numId w:val="3"/>
         </w:numPr>
-        <w:spacing w:before="100" w:beforeAutospacing="1" w:after="100" w:afterAutospacing="1" w:line="240" w:lineRule="auto"/>
-        <w:rPr>
-          <w:rFonts w:ascii="Times New Roman" w:eastAsia="Times New Roman" w:hAnsi="Times New Roman" w:cs="Times New Roman"/>
-          <w:sz w:val="24"/>
-          <w:szCs w:val="24"/>
-        </w:rPr>
-      </w:pPr>
-      <w:r>
-        <w:rPr>
-          <w:rFonts w:ascii="Times New Roman" w:eastAsia="Times New Roman" w:hAnsi="Times New Roman" w:cs="Times New Roman"/>
-          <w:sz w:val="24"/>
-          <w:szCs w:val="24"/>
-        </w:rPr>
-        <w:lastRenderedPageBreak/>
+        <w:spacing w:before="100" w:beforeAutospacing="1" w:after="0" w:line="240" w:lineRule="auto"/>
+        <w:rPr>
+          <w:rFonts w:ascii="Times New Roman" w:eastAsia="Times New Roman" w:hAnsi="Times New Roman" w:cs="Times New Roman"/>
+          <w:sz w:val="24"/>
+          <w:szCs w:val="24"/>
+        </w:rPr>
+      </w:pPr>
+      <w:r>
+        <w:rPr>
+          <w:rFonts w:ascii="Times New Roman" w:eastAsia="Times New Roman" w:hAnsi="Times New Roman" w:cs="Times New Roman"/>
+          <w:sz w:val="24"/>
+          <w:szCs w:val="24"/>
+        </w:rPr>
         <w:t>Example:</w:t>
       </w:r>
     </w:p>
@@ -2886,7 +5651,7 @@
           <w:ilvl w:val="0"/>
           <w:numId w:val="3"/>
         </w:numPr>
-        <w:spacing w:before="100" w:beforeAutospacing="1" w:after="100" w:afterAutospacing="1" w:line="240" w:lineRule="auto"/>
+        <w:spacing w:before="100" w:beforeAutospacing="1" w:after="0" w:line="240" w:lineRule="auto"/>
         <w:rPr>
           <w:rFonts w:ascii="Times New Roman" w:eastAsia="Times New Roman" w:hAnsi="Times New Roman" w:cs="Times New Roman"/>
           <w:sz w:val="24"/>
@@ -2932,7 +5697,7 @@
           <w:ilvl w:val="1"/>
           <w:numId w:val="3"/>
         </w:numPr>
-        <w:spacing w:before="100" w:beforeAutospacing="1" w:after="100" w:afterAutospacing="1" w:line="240" w:lineRule="auto"/>
+        <w:spacing w:before="100" w:beforeAutospacing="1" w:after="0" w:line="240" w:lineRule="auto"/>
         <w:rPr>
           <w:rFonts w:ascii="Times New Roman" w:eastAsia="Times New Roman" w:hAnsi="Times New Roman" w:cs="Times New Roman"/>
           <w:sz w:val="24"/>
@@ -2954,7 +5719,7 @@
           <w:ilvl w:val="2"/>
           <w:numId w:val="3"/>
         </w:numPr>
-        <w:spacing w:before="100" w:beforeAutospacing="1" w:after="100" w:afterAutospacing="1" w:line="240" w:lineRule="auto"/>
+        <w:spacing w:before="100" w:beforeAutospacing="1" w:after="0" w:line="240" w:lineRule="auto"/>
         <w:rPr>
           <w:rFonts w:ascii="Times New Roman" w:eastAsia="Times New Roman" w:hAnsi="Times New Roman" w:cs="Times New Roman"/>
           <w:sz w:val="24"/>
@@ -2978,7 +5743,7 @@
           <w:ilvl w:val="2"/>
           <w:numId w:val="3"/>
         </w:numPr>
-        <w:spacing w:before="100" w:beforeAutospacing="1" w:after="100" w:afterAutospacing="1" w:line="240" w:lineRule="auto"/>
+        <w:spacing w:before="100" w:beforeAutospacing="1" w:after="0" w:line="240" w:lineRule="auto"/>
         <w:rPr>
           <w:rFonts w:ascii="Times New Roman" w:eastAsia="Times New Roman" w:hAnsi="Times New Roman" w:cs="Times New Roman"/>
           <w:sz w:val="24"/>
@@ -3024,7 +5789,7 @@
           <w:ilvl w:val="0"/>
           <w:numId w:val="3"/>
         </w:numPr>
-        <w:spacing w:before="100" w:beforeAutospacing="1" w:after="100" w:afterAutospacing="1" w:line="240" w:lineRule="auto"/>
+        <w:spacing w:before="100" w:beforeAutospacing="1" w:after="0" w:line="240" w:lineRule="auto"/>
         <w:rPr>
           <w:rFonts w:ascii="Times New Roman" w:eastAsia="Times New Roman" w:hAnsi="Times New Roman" w:cs="Times New Roman"/>
           <w:sz w:val="24"/>
@@ -3048,7 +5813,7 @@
           <w:ilvl w:val="1"/>
           <w:numId w:val="3"/>
         </w:numPr>
-        <w:spacing w:before="100" w:beforeAutospacing="1" w:after="100" w:afterAutospacing="1" w:line="240" w:lineRule="auto"/>
+        <w:spacing w:before="100" w:beforeAutospacing="1" w:after="0" w:line="240" w:lineRule="auto"/>
         <w:rPr>
           <w:rFonts w:ascii="Times New Roman" w:eastAsia="Times New Roman" w:hAnsi="Times New Roman" w:cs="Times New Roman"/>
           <w:sz w:val="24"/>
@@ -3100,6 +5865,7 @@
     </w:p>
     <w:p>
       <w:pPr>
+        <w:spacing w:after="0"/>
         <w:rPr>
           <w:rFonts w:ascii="Times New Roman" w:hAnsi="Times New Roman" w:cs="Times New Roman"/>
           <w:color w:val="FF0000"/>
@@ -3124,8 +5890,8 @@
 </file>
 
 <file path=word/numbering.xml><?xml version="1.0" encoding="utf-8"?>
-<w:numbering xmlns:wpc="http://schemas.microsoft.com/office/word/2010/wordprocessingCanvas" xmlns:mc="http://schemas.openxmlformats.org/markup-compatibility/2006" xmlns:o="urn:schemas-microsoft-com:office:office" xmlns:r="http://schemas.openxmlformats.org/officeDocument/2006/relationships" xmlns:m="http://schemas.openxmlformats.org/officeDocument/2006/math" xmlns:v="urn:schemas-microsoft-com:vml" xmlns:wp14="http://schemas.microsoft.com/office/word/2010/wordprocessingDrawing" xmlns:wp="http://schemas.openxmlformats.org/drawingml/2006/wordprocessingDrawing" xmlns:w10="urn:schemas-microsoft-com:office:word" xmlns:w="http://schemas.openxmlformats.org/wordprocessingml/2006/main" xmlns:w14="http://schemas.microsoft.com/office/word/2010/wordml" xmlns:wpg="http://schemas.microsoft.com/office/word/2010/wordprocessingGroup" xmlns:wpi="http://schemas.microsoft.com/office/word/2010/wordprocessingInk" xmlns:wne="http://schemas.microsoft.com/office/word/2006/wordml" xmlns:wps="http://schemas.microsoft.com/office/word/2010/wordprocessingShape" mc:Ignorable="w14 wp14">
-  <w:abstractNum w:abstractNumId="0">
+<w:numbering xmlns:wpc="http://schemas.microsoft.com/office/word/2010/wordprocessingCanvas" xmlns:mc="http://schemas.openxmlformats.org/markup-compatibility/2006" xmlns:o="urn:schemas-microsoft-com:office:office" xmlns:r="http://schemas.openxmlformats.org/officeDocument/2006/relationships" xmlns:m="http://schemas.openxmlformats.org/officeDocument/2006/math" xmlns:v="urn:schemas-microsoft-com:vml" xmlns:wp14="http://schemas.microsoft.com/office/word/2010/wordprocessingDrawing" xmlns:wp="http://schemas.openxmlformats.org/drawingml/2006/wordprocessingDrawing" xmlns:w10="urn:schemas-microsoft-com:office:word" xmlns:w="http://schemas.openxmlformats.org/wordprocessingml/2006/main" xmlns:w14="http://schemas.microsoft.com/office/word/2010/wordml" xmlns:w15="http://schemas.microsoft.com/office/word/2012/wordml" xmlns:wpg="http://schemas.microsoft.com/office/word/2010/wordprocessingGroup" xmlns:wpi="http://schemas.microsoft.com/office/word/2010/wordprocessingInk" xmlns:wne="http://schemas.microsoft.com/office/word/2006/wordml" xmlns:wps="http://schemas.microsoft.com/office/word/2010/wordprocessingShape" mc:Ignorable="w14 w15 wp14">
+  <w:abstractNum w:abstractNumId="0" w15:restartNumberingAfterBreak="0">
     <w:nsid w:val="051A703A"/>
     <w:multiLevelType w:val="multilevel"/>
     <w:tmpl w:val="655E5D5C"/>
@@ -3242,7 +6008,7 @@
       </w:pPr>
     </w:lvl>
   </w:abstractNum>
-  <w:abstractNum w:abstractNumId="1">
+  <w:abstractNum w:abstractNumId="1" w15:restartNumberingAfterBreak="0">
     <w:nsid w:val="05C204B8"/>
     <w:multiLevelType w:val="multilevel"/>
     <w:tmpl w:val="811EBAB4"/>
@@ -3355,7 +6121,7 @@
       </w:pPr>
     </w:lvl>
   </w:abstractNum>
-  <w:abstractNum w:abstractNumId="2">
+  <w:abstractNum w:abstractNumId="2" w15:restartNumberingAfterBreak="0">
     <w:nsid w:val="2682108E"/>
     <w:multiLevelType w:val="multilevel"/>
     <w:tmpl w:val="83B08502"/>
@@ -3473,6 +6239,246 @@
           <w:tab w:val="num" w:pos="6480"/>
         </w:tabs>
         <w:ind w:left="6480" w:hanging="360"/>
+      </w:pPr>
+    </w:lvl>
+  </w:abstractNum>
+  <w:abstractNum w:abstractNumId="3" w15:restartNumberingAfterBreak="0">
+    <w:nsid w:val="277E55CE"/>
+    <w:multiLevelType w:val="multilevel"/>
+    <w:tmpl w:val="FD8EE7BA"/>
+    <w:lvl w:ilvl="0">
+      <w:start w:val="1"/>
+      <w:numFmt w:val="bullet"/>
+      <w:lvlText w:val=""/>
+      <w:lvlJc w:val="left"/>
+      <w:pPr>
+        <w:tabs>
+          <w:tab w:val="num" w:pos="720"/>
+        </w:tabs>
+        <w:ind w:left="720" w:hanging="360"/>
+      </w:pPr>
+      <w:rPr>
+        <w:rFonts w:ascii="Symbol" w:hAnsi="Symbol" w:hint="default"/>
+        <w:sz w:val="20"/>
+      </w:rPr>
+    </w:lvl>
+    <w:lvl w:ilvl="1" w:tentative="1">
+      <w:start w:val="1"/>
+      <w:numFmt w:val="bullet"/>
+      <w:lvlText w:val="o"/>
+      <w:lvlJc w:val="left"/>
+      <w:pPr>
+        <w:tabs>
+          <w:tab w:val="num" w:pos="1440"/>
+        </w:tabs>
+        <w:ind w:left="1440" w:hanging="360"/>
+      </w:pPr>
+      <w:rPr>
+        <w:rFonts w:ascii="Courier New" w:hAnsi="Courier New" w:hint="default"/>
+        <w:sz w:val="20"/>
+      </w:rPr>
+    </w:lvl>
+    <w:lvl w:ilvl="2" w:tentative="1">
+      <w:start w:val="1"/>
+      <w:numFmt w:val="bullet"/>
+      <w:lvlText w:val=""/>
+      <w:lvlJc w:val="left"/>
+      <w:pPr>
+        <w:tabs>
+          <w:tab w:val="num" w:pos="2160"/>
+        </w:tabs>
+        <w:ind w:left="2160" w:hanging="360"/>
+      </w:pPr>
+      <w:rPr>
+        <w:rFonts w:ascii="Wingdings" w:hAnsi="Wingdings" w:hint="default"/>
+        <w:sz w:val="20"/>
+      </w:rPr>
+    </w:lvl>
+    <w:lvl w:ilvl="3" w:tentative="1">
+      <w:start w:val="1"/>
+      <w:numFmt w:val="bullet"/>
+      <w:lvlText w:val=""/>
+      <w:lvlJc w:val="left"/>
+      <w:pPr>
+        <w:tabs>
+          <w:tab w:val="num" w:pos="2880"/>
+        </w:tabs>
+        <w:ind w:left="2880" w:hanging="360"/>
+      </w:pPr>
+      <w:rPr>
+        <w:rFonts w:ascii="Wingdings" w:hAnsi="Wingdings" w:hint="default"/>
+        <w:sz w:val="20"/>
+      </w:rPr>
+    </w:lvl>
+    <w:lvl w:ilvl="4" w:tentative="1">
+      <w:start w:val="1"/>
+      <w:numFmt w:val="bullet"/>
+      <w:lvlText w:val=""/>
+      <w:lvlJc w:val="left"/>
+      <w:pPr>
+        <w:tabs>
+          <w:tab w:val="num" w:pos="3600"/>
+        </w:tabs>
+        <w:ind w:left="3600" w:hanging="360"/>
+      </w:pPr>
+      <w:rPr>
+        <w:rFonts w:ascii="Wingdings" w:hAnsi="Wingdings" w:hint="default"/>
+        <w:sz w:val="20"/>
+      </w:rPr>
+    </w:lvl>
+    <w:lvl w:ilvl="5" w:tentative="1">
+      <w:start w:val="1"/>
+      <w:numFmt w:val="bullet"/>
+      <w:lvlText w:val=""/>
+      <w:lvlJc w:val="left"/>
+      <w:pPr>
+        <w:tabs>
+          <w:tab w:val="num" w:pos="4320"/>
+        </w:tabs>
+        <w:ind w:left="4320" w:hanging="360"/>
+      </w:pPr>
+      <w:rPr>
+        <w:rFonts w:ascii="Wingdings" w:hAnsi="Wingdings" w:hint="default"/>
+        <w:sz w:val="20"/>
+      </w:rPr>
+    </w:lvl>
+    <w:lvl w:ilvl="6" w:tentative="1">
+      <w:start w:val="1"/>
+      <w:numFmt w:val="bullet"/>
+      <w:lvlText w:val=""/>
+      <w:lvlJc w:val="left"/>
+      <w:pPr>
+        <w:tabs>
+          <w:tab w:val="num" w:pos="5040"/>
+        </w:tabs>
+        <w:ind w:left="5040" w:hanging="360"/>
+      </w:pPr>
+      <w:rPr>
+        <w:rFonts w:ascii="Wingdings" w:hAnsi="Wingdings" w:hint="default"/>
+        <w:sz w:val="20"/>
+      </w:rPr>
+    </w:lvl>
+    <w:lvl w:ilvl="7" w:tentative="1">
+      <w:start w:val="1"/>
+      <w:numFmt w:val="bullet"/>
+      <w:lvlText w:val=""/>
+      <w:lvlJc w:val="left"/>
+      <w:pPr>
+        <w:tabs>
+          <w:tab w:val="num" w:pos="5760"/>
+        </w:tabs>
+        <w:ind w:left="5760" w:hanging="360"/>
+      </w:pPr>
+      <w:rPr>
+        <w:rFonts w:ascii="Wingdings" w:hAnsi="Wingdings" w:hint="default"/>
+        <w:sz w:val="20"/>
+      </w:rPr>
+    </w:lvl>
+    <w:lvl w:ilvl="8" w:tentative="1">
+      <w:start w:val="1"/>
+      <w:numFmt w:val="bullet"/>
+      <w:lvlText w:val=""/>
+      <w:lvlJc w:val="left"/>
+      <w:pPr>
+        <w:tabs>
+          <w:tab w:val="num" w:pos="6480"/>
+        </w:tabs>
+        <w:ind w:left="6480" w:hanging="360"/>
+      </w:pPr>
+      <w:rPr>
+        <w:rFonts w:ascii="Wingdings" w:hAnsi="Wingdings" w:hint="default"/>
+        <w:sz w:val="20"/>
+      </w:rPr>
+    </w:lvl>
+  </w:abstractNum>
+  <w:abstractNum w:abstractNumId="4" w15:restartNumberingAfterBreak="0">
+    <w:nsid w:val="296A77C9"/>
+    <w:multiLevelType w:val="hybridMultilevel"/>
+    <w:tmpl w:val="FFF281CC"/>
+    <w:lvl w:ilvl="0" w:tplc="83DAEA82">
+      <w:start w:val="1"/>
+      <w:numFmt w:val="lowerLetter"/>
+      <w:lvlText w:val="%1."/>
+      <w:lvlJc w:val="left"/>
+      <w:pPr>
+        <w:ind w:left="720" w:hanging="360"/>
+      </w:pPr>
+      <w:rPr>
+        <w:rFonts w:hint="default"/>
+        <w:b/>
+        <w:color w:val="00B050"/>
+      </w:rPr>
+    </w:lvl>
+    <w:lvl w:ilvl="1" w:tplc="04090019" w:tentative="1">
+      <w:start w:val="1"/>
+      <w:numFmt w:val="lowerLetter"/>
+      <w:lvlText w:val="%2."/>
+      <w:lvlJc w:val="left"/>
+      <w:pPr>
+        <w:ind w:left="1440" w:hanging="360"/>
+      </w:pPr>
+    </w:lvl>
+    <w:lvl w:ilvl="2" w:tplc="0409001B" w:tentative="1">
+      <w:start w:val="1"/>
+      <w:numFmt w:val="lowerRoman"/>
+      <w:lvlText w:val="%3."/>
+      <w:lvlJc w:val="right"/>
+      <w:pPr>
+        <w:ind w:left="2160" w:hanging="180"/>
+      </w:pPr>
+    </w:lvl>
+    <w:lvl w:ilvl="3" w:tplc="0409000F" w:tentative="1">
+      <w:start w:val="1"/>
+      <w:numFmt w:val="decimal"/>
+      <w:lvlText w:val="%4."/>
+      <w:lvlJc w:val="left"/>
+      <w:pPr>
+        <w:ind w:left="2880" w:hanging="360"/>
+      </w:pPr>
+    </w:lvl>
+    <w:lvl w:ilvl="4" w:tplc="04090019" w:tentative="1">
+      <w:start w:val="1"/>
+      <w:numFmt w:val="lowerLetter"/>
+      <w:lvlText w:val="%5."/>
+      <w:lvlJc w:val="left"/>
+      <w:pPr>
+        <w:ind w:left="3600" w:hanging="360"/>
+      </w:pPr>
+    </w:lvl>
+    <w:lvl w:ilvl="5" w:tplc="0409001B" w:tentative="1">
+      <w:start w:val="1"/>
+      <w:numFmt w:val="lowerRoman"/>
+      <w:lvlText w:val="%6."/>
+      <w:lvlJc w:val="right"/>
+      <w:pPr>
+        <w:ind w:left="4320" w:hanging="180"/>
+      </w:pPr>
+    </w:lvl>
+    <w:lvl w:ilvl="6" w:tplc="0409000F" w:tentative="1">
+      <w:start w:val="1"/>
+      <w:numFmt w:val="decimal"/>
+      <w:lvlText w:val="%7."/>
+      <w:lvlJc w:val="left"/>
+      <w:pPr>
+        <w:ind w:left="5040" w:hanging="360"/>
+      </w:pPr>
+    </w:lvl>
+    <w:lvl w:ilvl="7" w:tplc="04090019" w:tentative="1">
+      <w:start w:val="1"/>
+      <w:numFmt w:val="lowerLetter"/>
+      <w:lvlText w:val="%8."/>
+      <w:lvlJc w:val="left"/>
+      <w:pPr>
+        <w:ind w:left="5760" w:hanging="360"/>
+      </w:pPr>
+    </w:lvl>
+    <w:lvl w:ilvl="8" w:tplc="0409001B" w:tentative="1">
+      <w:start w:val="1"/>
+      <w:numFmt w:val="lowerRoman"/>
+      <w:lvlText w:val="%9."/>
+      <w:lvlJc w:val="right"/>
+      <w:pPr>
+        <w:ind w:left="6480" w:hanging="180"/>
       </w:pPr>
     </w:lvl>
   </w:abstractNum>
@@ -3485,11 +6491,17 @@
   <w:num w:numId="3">
     <w:abstractNumId w:val="2"/>
   </w:num>
+  <w:num w:numId="4">
+    <w:abstractNumId w:val="3"/>
+  </w:num>
+  <w:num w:numId="5">
+    <w:abstractNumId w:val="4"/>
+  </w:num>
 </w:numbering>
 </file>
 
 <file path=word/styles.xml><?xml version="1.0" encoding="utf-8"?>
-<w:styles xmlns:mc="http://schemas.openxmlformats.org/markup-compatibility/2006" xmlns:r="http://schemas.openxmlformats.org/officeDocument/2006/relationships" xmlns:w="http://schemas.openxmlformats.org/wordprocessingml/2006/main" xmlns:w14="http://schemas.microsoft.com/office/word/2010/wordml" mc:Ignorable="w14">
+<w:styles xmlns:mc="http://schemas.openxmlformats.org/markup-compatibility/2006" xmlns:r="http://schemas.openxmlformats.org/officeDocument/2006/relationships" xmlns:w="http://schemas.openxmlformats.org/wordprocessingml/2006/main" xmlns:w14="http://schemas.microsoft.com/office/word/2010/wordml" xmlns:w15="http://schemas.microsoft.com/office/word/2012/wordml" mc:Ignorable="w14 w15">
   <w:docDefaults>
     <w:rPrDefault>
       <w:rPr>
@@ -3505,148 +6517,403 @@
       </w:pPr>
     </w:pPrDefault>
   </w:docDefaults>
-  <w:latentStyles w:defLockedState="0" w:defUIPriority="99" w:defSemiHidden="1" w:defUnhideWhenUsed="1" w:defQFormat="0" w:count="267">
-    <w:lsdException w:name="Normal" w:semiHidden="0" w:uiPriority="0" w:unhideWhenUsed="0" w:qFormat="1"/>
-    <w:lsdException w:name="heading 1" w:semiHidden="0" w:uiPriority="9" w:unhideWhenUsed="0" w:qFormat="1"/>
-    <w:lsdException w:name="heading 2" w:uiPriority="9" w:qFormat="1"/>
-    <w:lsdException w:name="heading 3" w:uiPriority="9" w:qFormat="1"/>
-    <w:lsdException w:name="heading 4" w:uiPriority="9" w:qFormat="1"/>
-    <w:lsdException w:name="heading 5" w:uiPriority="9" w:qFormat="1"/>
-    <w:lsdException w:name="heading 6" w:uiPriority="9" w:qFormat="1"/>
-    <w:lsdException w:name="heading 7" w:uiPriority="9" w:qFormat="1"/>
-    <w:lsdException w:name="heading 8" w:uiPriority="9" w:qFormat="1"/>
-    <w:lsdException w:name="heading 9" w:uiPriority="9" w:qFormat="1"/>
-    <w:lsdException w:name="toc 1" w:uiPriority="39"/>
-    <w:lsdException w:name="toc 2" w:uiPriority="39"/>
-    <w:lsdException w:name="toc 3" w:uiPriority="39"/>
-    <w:lsdException w:name="toc 4" w:uiPriority="39"/>
-    <w:lsdException w:name="toc 5" w:uiPriority="39"/>
-    <w:lsdException w:name="toc 6" w:uiPriority="39"/>
-    <w:lsdException w:name="toc 7" w:uiPriority="39"/>
-    <w:lsdException w:name="toc 8" w:uiPriority="39"/>
-    <w:lsdException w:name="toc 9" w:uiPriority="39"/>
-    <w:lsdException w:name="caption" w:uiPriority="35" w:qFormat="1"/>
-    <w:lsdException w:name="Title" w:semiHidden="0" w:uiPriority="10" w:unhideWhenUsed="0" w:qFormat="1"/>
-    <w:lsdException w:name="Default Paragraph Font" w:uiPriority="1"/>
-    <w:lsdException w:name="Subtitle" w:semiHidden="0" w:uiPriority="11" w:unhideWhenUsed="0" w:qFormat="1"/>
-    <w:lsdException w:name="Strong" w:semiHidden="0" w:uiPriority="22" w:unhideWhenUsed="0" w:qFormat="1"/>
-    <w:lsdException w:name="Emphasis" w:semiHidden="0" w:uiPriority="20" w:unhideWhenUsed="0" w:qFormat="1"/>
-    <w:lsdException w:name="Table Grid" w:semiHidden="0" w:uiPriority="59" w:unhideWhenUsed="0"/>
-    <w:lsdException w:name="Placeholder Text" w:unhideWhenUsed="0"/>
-    <w:lsdException w:name="No Spacing" w:semiHidden="0" w:uiPriority="1" w:unhideWhenUsed="0" w:qFormat="1"/>
-    <w:lsdException w:name="Light Shading" w:semiHidden="0" w:uiPriority="60" w:unhideWhenUsed="0"/>
-    <w:lsdException w:name="Light List" w:semiHidden="0" w:uiPriority="61" w:unhideWhenUsed="0"/>
-    <w:lsdException w:name="Light Grid" w:semiHidden="0" w:uiPriority="62" w:unhideWhenUsed="0"/>
-    <w:lsdException w:name="Medium Shading 1" w:semiHidden="0" w:uiPriority="63" w:unhideWhenUsed="0"/>
-    <w:lsdException w:name="Medium Shading 2" w:semiHidden="0" w:uiPriority="64" w:unhideWhenUsed="0"/>
-    <w:lsdException w:name="Medium List 1" w:semiHidden="0" w:uiPriority="65" w:unhideWhenUsed="0"/>
-    <w:lsdException w:name="Medium List 2" w:semiHidden="0" w:uiPriority="66" w:unhideWhenUsed="0"/>
-    <w:lsdException w:name="Medium Grid 1" w:semiHidden="0" w:uiPriority="67" w:unhideWhenUsed="0"/>
-    <w:lsdException w:name="Medium Grid 2" w:semiHidden="0" w:uiPriority="68" w:unhideWhenUsed="0"/>
-    <w:lsdException w:name="Medium Grid 3" w:semiHidden="0" w:uiPriority="69" w:unhideWhenUsed="0"/>
-    <w:lsdException w:name="Dark List" w:semiHidden="0" w:uiPriority="70" w:unhideWhenUsed="0"/>
-    <w:lsdException w:name="Colorful Shading" w:semiHidden="0" w:uiPriority="71" w:unhideWhenUsed="0"/>
-    <w:lsdException w:name="Colorful List" w:semiHidden="0" w:uiPriority="72" w:unhideWhenUsed="0"/>
-    <w:lsdException w:name="Colorful Grid" w:semiHidden="0" w:uiPriority="73" w:unhideWhenUsed="0"/>
-    <w:lsdException w:name="Light Shading Accent 1" w:semiHidden="0" w:uiPriority="60" w:unhideWhenUsed="0"/>
-    <w:lsdException w:name="Light List Accent 1" w:semiHidden="0" w:uiPriority="61" w:unhideWhenUsed="0"/>
-    <w:lsdException w:name="Light Grid Accent 1" w:semiHidden="0" w:uiPriority="62" w:unhideWhenUsed="0"/>
-    <w:lsdException w:name="Medium Shading 1 Accent 1" w:semiHidden="0" w:uiPriority="63" w:unhideWhenUsed="0"/>
-    <w:lsdException w:name="Medium Shading 2 Accent 1" w:semiHidden="0" w:uiPriority="64" w:unhideWhenUsed="0"/>
-    <w:lsdException w:name="Medium List 1 Accent 1" w:semiHidden="0" w:uiPriority="65" w:unhideWhenUsed="0"/>
-    <w:lsdException w:name="Revision" w:unhideWhenUsed="0"/>
-    <w:lsdException w:name="List Paragraph" w:semiHidden="0" w:uiPriority="34" w:unhideWhenUsed="0" w:qFormat="1"/>
-    <w:lsdException w:name="Quote" w:semiHidden="0" w:uiPriority="29" w:unhideWhenUsed="0" w:qFormat="1"/>
-    <w:lsdException w:name="Intense Quote" w:semiHidden="0" w:uiPriority="30" w:unhideWhenUsed="0" w:qFormat="1"/>
-    <w:lsdException w:name="Medium List 2 Accent 1" w:semiHidden="0" w:uiPriority="66" w:unhideWhenUsed="0"/>
-    <w:lsdException w:name="Medium Grid 1 Accent 1" w:semiHidden="0" w:uiPriority="67" w:unhideWhenUsed="0"/>
-    <w:lsdException w:name="Medium Grid 2 Accent 1" w:semiHidden="0" w:uiPriority="68" w:unhideWhenUsed="0"/>
-    <w:lsdException w:name="Medium Grid 3 Accent 1" w:semiHidden="0" w:uiPriority="69" w:unhideWhenUsed="0"/>
-    <w:lsdException w:name="Dark List Accent 1" w:semiHidden="0" w:uiPriority="70" w:unhideWhenUsed="0"/>
-    <w:lsdException w:name="Colorful Shading Accent 1" w:semiHidden="0" w:uiPriority="71" w:unhideWhenUsed="0"/>
-    <w:lsdException w:name="Colorful List Accent 1" w:semiHidden="0" w:uiPriority="72" w:unhideWhenUsed="0"/>
-    <w:lsdException w:name="Colorful Grid Accent 1" w:semiHidden="0" w:uiPriority="73" w:unhideWhenUsed="0"/>
-    <w:lsdException w:name="Light Shading Accent 2" w:semiHidden="0" w:uiPriority="60" w:unhideWhenUsed="0"/>
-    <w:lsdException w:name="Light List Accent 2" w:semiHidden="0" w:uiPriority="61" w:unhideWhenUsed="0"/>
-    <w:lsdException w:name="Light Grid Accent 2" w:semiHidden="0" w:uiPriority="62" w:unhideWhenUsed="0"/>
-    <w:lsdException w:name="Medium Shading 1 Accent 2" w:semiHidden="0" w:uiPriority="63" w:unhideWhenUsed="0"/>
-    <w:lsdException w:name="Medium Shading 2 Accent 2" w:semiHidden="0" w:uiPriority="64" w:unhideWhenUsed="0"/>
-    <w:lsdException w:name="Medium List 1 Accent 2" w:semiHidden="0" w:uiPriority="65" w:unhideWhenUsed="0"/>
-    <w:lsdException w:name="Medium List 2 Accent 2" w:semiHidden="0" w:uiPriority="66" w:unhideWhenUsed="0"/>
-    <w:lsdException w:name="Medium Grid 1 Accent 2" w:semiHidden="0" w:uiPriority="67" w:unhideWhenUsed="0"/>
-    <w:lsdException w:name="Medium Grid 2 Accent 2" w:semiHidden="0" w:uiPriority="68" w:unhideWhenUsed="0"/>
-    <w:lsdException w:name="Medium Grid 3 Accent 2" w:semiHidden="0" w:uiPriority="69" w:unhideWhenUsed="0"/>
-    <w:lsdException w:name="Dark List Accent 2" w:semiHidden="0" w:uiPriority="70" w:unhideWhenUsed="0"/>
-    <w:lsdException w:name="Colorful Shading Accent 2" w:semiHidden="0" w:uiPriority="71" w:unhideWhenUsed="0"/>
-    <w:lsdException w:name="Colorful List Accent 2" w:semiHidden="0" w:uiPriority="72" w:unhideWhenUsed="0"/>
-    <w:lsdException w:name="Colorful Grid Accent 2" w:semiHidden="0" w:uiPriority="73" w:unhideWhenUsed="0"/>
-    <w:lsdException w:name="Light Shading Accent 3" w:semiHidden="0" w:uiPriority="60" w:unhideWhenUsed="0"/>
-    <w:lsdException w:name="Light List Accent 3" w:semiHidden="0" w:uiPriority="61" w:unhideWhenUsed="0"/>
-    <w:lsdException w:name="Light Grid Accent 3" w:semiHidden="0" w:uiPriority="62" w:unhideWhenUsed="0"/>
-    <w:lsdException w:name="Medium Shading 1 Accent 3" w:semiHidden="0" w:uiPriority="63" w:unhideWhenUsed="0"/>
-    <w:lsdException w:name="Medium Shading 2 Accent 3" w:semiHidden="0" w:uiPriority="64" w:unhideWhenUsed="0"/>
-    <w:lsdException w:name="Medium List 1 Accent 3" w:semiHidden="0" w:uiPriority="65" w:unhideWhenUsed="0"/>
-    <w:lsdException w:name="Medium List 2 Accent 3" w:semiHidden="0" w:uiPriority="66" w:unhideWhenUsed="0"/>
-    <w:lsdException w:name="Medium Grid 1 Accent 3" w:semiHidden="0" w:uiPriority="67" w:unhideWhenUsed="0"/>
-    <w:lsdException w:name="Medium Grid 2 Accent 3" w:semiHidden="0" w:uiPriority="68" w:unhideWhenUsed="0"/>
-    <w:lsdException w:name="Medium Grid 3 Accent 3" w:semiHidden="0" w:uiPriority="69" w:unhideWhenUsed="0"/>
-    <w:lsdException w:name="Dark List Accent 3" w:semiHidden="0" w:uiPriority="70" w:unhideWhenUsed="0"/>
-    <w:lsdException w:name="Colorful Shading Accent 3" w:semiHidden="0" w:uiPriority="71" w:unhideWhenUsed="0"/>
-    <w:lsdException w:name="Colorful List Accent 3" w:semiHidden="0" w:uiPriority="72" w:unhideWhenUsed="0"/>
-    <w:lsdException w:name="Colorful Grid Accent 3" w:semiHidden="0" w:uiPriority="73" w:unhideWhenUsed="0"/>
-    <w:lsdException w:name="Light Shading Accent 4" w:semiHidden="0" w:uiPriority="60" w:unhideWhenUsed="0"/>
-    <w:lsdException w:name="Light List Accent 4" w:semiHidden="0" w:uiPriority="61" w:unhideWhenUsed="0"/>
-    <w:lsdException w:name="Light Grid Accent 4" w:semiHidden="0" w:uiPriority="62" w:unhideWhenUsed="0"/>
-    <w:lsdException w:name="Medium Shading 1 Accent 4" w:semiHidden="0" w:uiPriority="63" w:unhideWhenUsed="0"/>
-    <w:lsdException w:name="Medium Shading 2 Accent 4" w:semiHidden="0" w:uiPriority="64" w:unhideWhenUsed="0"/>
-    <w:lsdException w:name="Medium List 1 Accent 4" w:semiHidden="0" w:uiPriority="65" w:unhideWhenUsed="0"/>
-    <w:lsdException w:name="Medium List 2 Accent 4" w:semiHidden="0" w:uiPriority="66" w:unhideWhenUsed="0"/>
-    <w:lsdException w:name="Medium Grid 1 Accent 4" w:semiHidden="0" w:uiPriority="67" w:unhideWhenUsed="0"/>
-    <w:lsdException w:name="Medium Grid 2 Accent 4" w:semiHidden="0" w:uiPriority="68" w:unhideWhenUsed="0"/>
-    <w:lsdException w:name="Medium Grid 3 Accent 4" w:semiHidden="0" w:uiPriority="69" w:unhideWhenUsed="0"/>
-    <w:lsdException w:name="Dark List Accent 4" w:semiHidden="0" w:uiPriority="70" w:unhideWhenUsed="0"/>
-    <w:lsdException w:name="Colorful Shading Accent 4" w:semiHidden="0" w:uiPriority="71" w:unhideWhenUsed="0"/>
-    <w:lsdException w:name="Colorful List Accent 4" w:semiHidden="0" w:uiPriority="72" w:unhideWhenUsed="0"/>
-    <w:lsdException w:name="Colorful Grid Accent 4" w:semiHidden="0" w:uiPriority="73" w:unhideWhenUsed="0"/>
-    <w:lsdException w:name="Light Shading Accent 5" w:semiHidden="0" w:uiPriority="60" w:unhideWhenUsed="0"/>
-    <w:lsdException w:name="Light List Accent 5" w:semiHidden="0" w:uiPriority="61" w:unhideWhenUsed="0"/>
-    <w:lsdException w:name="Light Grid Accent 5" w:semiHidden="0" w:uiPriority="62" w:unhideWhenUsed="0"/>
-    <w:lsdException w:name="Medium Shading 1 Accent 5" w:semiHidden="0" w:uiPriority="63" w:unhideWhenUsed="0"/>
-    <w:lsdException w:name="Medium Shading 2 Accent 5" w:semiHidden="0" w:uiPriority="64" w:unhideWhenUsed="0"/>
-    <w:lsdException w:name="Medium List 1 Accent 5" w:semiHidden="0" w:uiPriority="65" w:unhideWhenUsed="0"/>
-    <w:lsdException w:name="Medium List 2 Accent 5" w:semiHidden="0" w:uiPriority="66" w:unhideWhenUsed="0"/>
-    <w:lsdException w:name="Medium Grid 1 Accent 5" w:semiHidden="0" w:uiPriority="67" w:unhideWhenUsed="0"/>
-    <w:lsdException w:name="Medium Grid 2 Accent 5" w:semiHidden="0" w:uiPriority="68" w:unhideWhenUsed="0"/>
-    <w:lsdException w:name="Medium Grid 3 Accent 5" w:semiHidden="0" w:uiPriority="69" w:unhideWhenUsed="0"/>
-    <w:lsdException w:name="Dark List Accent 5" w:semiHidden="0" w:uiPriority="70" w:unhideWhenUsed="0"/>
-    <w:lsdException w:name="Colorful Shading Accent 5" w:semiHidden="0" w:uiPriority="71" w:unhideWhenUsed="0"/>
-    <w:lsdException w:name="Colorful List Accent 5" w:semiHidden="0" w:uiPriority="72" w:unhideWhenUsed="0"/>
-    <w:lsdException w:name="Colorful Grid Accent 5" w:semiHidden="0" w:uiPriority="73" w:unhideWhenUsed="0"/>
-    <w:lsdException w:name="Light Shading Accent 6" w:semiHidden="0" w:uiPriority="60" w:unhideWhenUsed="0"/>
-    <w:lsdException w:name="Light List Accent 6" w:semiHidden="0" w:uiPriority="61" w:unhideWhenUsed="0"/>
-    <w:lsdException w:name="Light Grid Accent 6" w:semiHidden="0" w:uiPriority="62" w:unhideWhenUsed="0"/>
-    <w:lsdException w:name="Medium Shading 1 Accent 6" w:semiHidden="0" w:uiPriority="63" w:unhideWhenUsed="0"/>
-    <w:lsdException w:name="Medium Shading 2 Accent 6" w:semiHidden="0" w:uiPriority="64" w:unhideWhenUsed="0"/>
-    <w:lsdException w:name="Medium List 1 Accent 6" w:semiHidden="0" w:uiPriority="65" w:unhideWhenUsed="0"/>
-    <w:lsdException w:name="Medium List 2 Accent 6" w:semiHidden="0" w:uiPriority="66" w:unhideWhenUsed="0"/>
-    <w:lsdException w:name="Medium Grid 1 Accent 6" w:semiHidden="0" w:uiPriority="67" w:unhideWhenUsed="0"/>
-    <w:lsdException w:name="Medium Grid 2 Accent 6" w:semiHidden="0" w:uiPriority="68" w:unhideWhenUsed="0"/>
-    <w:lsdException w:name="Medium Grid 3 Accent 6" w:semiHidden="0" w:uiPriority="69" w:unhideWhenUsed="0"/>
-    <w:lsdException w:name="Dark List Accent 6" w:semiHidden="0" w:uiPriority="70" w:unhideWhenUsed="0"/>
-    <w:lsdException w:name="Colorful Shading Accent 6" w:semiHidden="0" w:uiPriority="71" w:unhideWhenUsed="0"/>
-    <w:lsdException w:name="Colorful List Accent 6" w:semiHidden="0" w:uiPriority="72" w:unhideWhenUsed="0"/>
-    <w:lsdException w:name="Colorful Grid Accent 6" w:semiHidden="0" w:uiPriority="73" w:unhideWhenUsed="0"/>
-    <w:lsdException w:name="Subtle Emphasis" w:semiHidden="0" w:uiPriority="19" w:unhideWhenUsed="0" w:qFormat="1"/>
-    <w:lsdException w:name="Intense Emphasis" w:semiHidden="0" w:uiPriority="21" w:unhideWhenUsed="0" w:qFormat="1"/>
-    <w:lsdException w:name="Subtle Reference" w:semiHidden="0" w:uiPriority="31" w:unhideWhenUsed="0" w:qFormat="1"/>
-    <w:lsdException w:name="Intense Reference" w:semiHidden="0" w:uiPriority="32" w:unhideWhenUsed="0" w:qFormat="1"/>
-    <w:lsdException w:name="Book Title" w:semiHidden="0" w:uiPriority="33" w:unhideWhenUsed="0" w:qFormat="1"/>
-    <w:lsdException w:name="Bibliography" w:uiPriority="37"/>
-    <w:lsdException w:name="TOC Heading" w:uiPriority="39" w:qFormat="1"/>
+  <w:latentStyles w:defLockedState="0" w:defUIPriority="99" w:defSemiHidden="0" w:defUnhideWhenUsed="0" w:defQFormat="0" w:count="371">
+    <w:lsdException w:name="Normal" w:uiPriority="0" w:qFormat="1"/>
+    <w:lsdException w:name="heading 1" w:uiPriority="9" w:qFormat="1"/>
+    <w:lsdException w:name="heading 2" w:semiHidden="1" w:uiPriority="9" w:unhideWhenUsed="1" w:qFormat="1"/>
+    <w:lsdException w:name="heading 3" w:semiHidden="1" w:uiPriority="9" w:unhideWhenUsed="1" w:qFormat="1"/>
+    <w:lsdException w:name="heading 4" w:semiHidden="1" w:uiPriority="9" w:unhideWhenUsed="1" w:qFormat="1"/>
+    <w:lsdException w:name="heading 5" w:semiHidden="1" w:uiPriority="9" w:unhideWhenUsed="1" w:qFormat="1"/>
+    <w:lsdException w:name="heading 6" w:semiHidden="1" w:uiPriority="9" w:unhideWhenUsed="1" w:qFormat="1"/>
+    <w:lsdException w:name="heading 7" w:semiHidden="1" w:uiPriority="9" w:unhideWhenUsed="1" w:qFormat="1"/>
+    <w:lsdException w:name="heading 8" w:semiHidden="1" w:uiPriority="9" w:unhideWhenUsed="1" w:qFormat="1"/>
+    <w:lsdException w:name="heading 9" w:semiHidden="1" w:uiPriority="9" w:unhideWhenUsed="1" w:qFormat="1"/>
+    <w:lsdException w:name="index 1" w:semiHidden="1" w:unhideWhenUsed="1"/>
+    <w:lsdException w:name="index 2" w:semiHidden="1" w:unhideWhenUsed="1"/>
+    <w:lsdException w:name="index 3" w:semiHidden="1" w:unhideWhenUsed="1"/>
+    <w:lsdException w:name="index 4" w:semiHidden="1" w:unhideWhenUsed="1"/>
+    <w:lsdException w:name="index 5" w:semiHidden="1" w:unhideWhenUsed="1"/>
+    <w:lsdException w:name="index 6" w:semiHidden="1" w:unhideWhenUsed="1"/>
+    <w:lsdException w:name="index 7" w:semiHidden="1" w:unhideWhenUsed="1"/>
+    <w:lsdException w:name="index 8" w:semiHidden="1" w:unhideWhenUsed="1"/>
+    <w:lsdException w:name="index 9" w:semiHidden="1" w:unhideWhenUsed="1"/>
+    <w:lsdException w:name="toc 1" w:semiHidden="1" w:uiPriority="39" w:unhideWhenUsed="1"/>
+    <w:lsdException w:name="toc 2" w:semiHidden="1" w:uiPriority="39" w:unhideWhenUsed="1"/>
+    <w:lsdException w:name="toc 3" w:semiHidden="1" w:uiPriority="39" w:unhideWhenUsed="1"/>
+    <w:lsdException w:name="toc 4" w:semiHidden="1" w:uiPriority="39" w:unhideWhenUsed="1"/>
+    <w:lsdException w:name="toc 5" w:semiHidden="1" w:uiPriority="39" w:unhideWhenUsed="1"/>
+    <w:lsdException w:name="toc 6" w:semiHidden="1" w:uiPriority="39" w:unhideWhenUsed="1"/>
+    <w:lsdException w:name="toc 7" w:semiHidden="1" w:uiPriority="39" w:unhideWhenUsed="1"/>
+    <w:lsdException w:name="toc 8" w:semiHidden="1" w:uiPriority="39" w:unhideWhenUsed="1"/>
+    <w:lsdException w:name="toc 9" w:semiHidden="1" w:uiPriority="39" w:unhideWhenUsed="1"/>
+    <w:lsdException w:name="Normal Indent" w:semiHidden="1" w:unhideWhenUsed="1"/>
+    <w:lsdException w:name="footnote text" w:semiHidden="1" w:unhideWhenUsed="1"/>
+    <w:lsdException w:name="annotation text" w:semiHidden="1" w:unhideWhenUsed="1"/>
+    <w:lsdException w:name="header" w:semiHidden="1" w:unhideWhenUsed="1"/>
+    <w:lsdException w:name="footer" w:semiHidden="1" w:unhideWhenUsed="1"/>
+    <w:lsdException w:name="index heading" w:semiHidden="1" w:unhideWhenUsed="1"/>
+    <w:lsdException w:name="caption" w:semiHidden="1" w:uiPriority="35" w:unhideWhenUsed="1" w:qFormat="1"/>
+    <w:lsdException w:name="table of figures" w:semiHidden="1" w:unhideWhenUsed="1"/>
+    <w:lsdException w:name="envelope address" w:semiHidden="1" w:unhideWhenUsed="1"/>
+    <w:lsdException w:name="envelope return" w:semiHidden="1" w:unhideWhenUsed="1"/>
+    <w:lsdException w:name="footnote reference" w:semiHidden="1" w:unhideWhenUsed="1"/>
+    <w:lsdException w:name="annotation reference" w:semiHidden="1" w:unhideWhenUsed="1"/>
+    <w:lsdException w:name="line number" w:semiHidden="1" w:unhideWhenUsed="1"/>
+    <w:lsdException w:name="page number" w:semiHidden="1" w:unhideWhenUsed="1"/>
+    <w:lsdException w:name="endnote reference" w:semiHidden="1" w:unhideWhenUsed="1"/>
+    <w:lsdException w:name="endnote text" w:semiHidden="1" w:unhideWhenUsed="1"/>
+    <w:lsdException w:name="table of authorities" w:semiHidden="1" w:unhideWhenUsed="1"/>
+    <w:lsdException w:name="macro" w:semiHidden="1" w:unhideWhenUsed="1"/>
+    <w:lsdException w:name="toa heading" w:semiHidden="1" w:unhideWhenUsed="1"/>
+    <w:lsdException w:name="List" w:semiHidden="1" w:unhideWhenUsed="1"/>
+    <w:lsdException w:name="List Bullet" w:semiHidden="1" w:unhideWhenUsed="1"/>
+    <w:lsdException w:name="List Number" w:semiHidden="1" w:unhideWhenUsed="1"/>
+    <w:lsdException w:name="List 2" w:semiHidden="1" w:unhideWhenUsed="1"/>
+    <w:lsdException w:name="List 3" w:semiHidden="1" w:unhideWhenUsed="1"/>
+    <w:lsdException w:name="List 4" w:semiHidden="1" w:unhideWhenUsed="1"/>
+    <w:lsdException w:name="List 5" w:semiHidden="1" w:unhideWhenUsed="1"/>
+    <w:lsdException w:name="List Bullet 2" w:semiHidden="1" w:unhideWhenUsed="1"/>
+    <w:lsdException w:name="List Bullet 3" w:semiHidden="1" w:unhideWhenUsed="1"/>
+    <w:lsdException w:name="List Bullet 4" w:semiHidden="1" w:unhideWhenUsed="1"/>
+    <w:lsdException w:name="List Bullet 5" w:semiHidden="1" w:unhideWhenUsed="1"/>
+    <w:lsdException w:name="List Number 2" w:semiHidden="1" w:unhideWhenUsed="1"/>
+    <w:lsdException w:name="List Number 3" w:semiHidden="1" w:unhideWhenUsed="1"/>
+    <w:lsdException w:name="List Number 4" w:semiHidden="1" w:unhideWhenUsed="1"/>
+    <w:lsdException w:name="List Number 5" w:semiHidden="1" w:unhideWhenUsed="1"/>
+    <w:lsdException w:name="Title" w:uiPriority="10" w:qFormat="1"/>
+    <w:lsdException w:name="Closing" w:semiHidden="1" w:unhideWhenUsed="1"/>
+    <w:lsdException w:name="Signature" w:semiHidden="1" w:unhideWhenUsed="1"/>
+    <w:lsdException w:name="Default Paragraph Font" w:semiHidden="1" w:uiPriority="1" w:unhideWhenUsed="1"/>
+    <w:lsdException w:name="Body Text" w:semiHidden="1" w:unhideWhenUsed="1"/>
+    <w:lsdException w:name="Body Text Indent" w:semiHidden="1" w:unhideWhenUsed="1"/>
+    <w:lsdException w:name="List Continue" w:semiHidden="1" w:unhideWhenUsed="1"/>
+    <w:lsdException w:name="List Continue 2" w:semiHidden="1" w:unhideWhenUsed="1"/>
+    <w:lsdException w:name="List Continue 3" w:semiHidden="1" w:unhideWhenUsed="1"/>
+    <w:lsdException w:name="List Continue 4" w:semiHidden="1" w:unhideWhenUsed="1"/>
+    <w:lsdException w:name="List Continue 5" w:semiHidden="1" w:unhideWhenUsed="1"/>
+    <w:lsdException w:name="Message Header" w:semiHidden="1" w:unhideWhenUsed="1"/>
+    <w:lsdException w:name="Subtitle" w:uiPriority="11" w:qFormat="1"/>
+    <w:lsdException w:name="Salutation" w:semiHidden="1" w:unhideWhenUsed="1"/>
+    <w:lsdException w:name="Date" w:semiHidden="1" w:unhideWhenUsed="1"/>
+    <w:lsdException w:name="Body Text First Indent" w:semiHidden="1" w:unhideWhenUsed="1"/>
+    <w:lsdException w:name="Body Text First Indent 2" w:semiHidden="1" w:unhideWhenUsed="1"/>
+    <w:lsdException w:name="Note Heading" w:semiHidden="1" w:unhideWhenUsed="1"/>
+    <w:lsdException w:name="Body Text 2" w:semiHidden="1" w:unhideWhenUsed="1"/>
+    <w:lsdException w:name="Body Text 3" w:semiHidden="1" w:unhideWhenUsed="1"/>
+    <w:lsdException w:name="Body Text Indent 2" w:semiHidden="1" w:unhideWhenUsed="1"/>
+    <w:lsdException w:name="Body Text Indent 3" w:semiHidden="1" w:unhideWhenUsed="1"/>
+    <w:lsdException w:name="Block Text" w:semiHidden="1" w:unhideWhenUsed="1"/>
+    <w:lsdException w:name="Hyperlink" w:semiHidden="1" w:unhideWhenUsed="1"/>
+    <w:lsdException w:name="FollowedHyperlink" w:semiHidden="1" w:unhideWhenUsed="1"/>
+    <w:lsdException w:name="Strong" w:uiPriority="22" w:qFormat="1"/>
+    <w:lsdException w:name="Emphasis" w:uiPriority="20" w:qFormat="1"/>
+    <w:lsdException w:name="Document Map" w:semiHidden="1" w:unhideWhenUsed="1"/>
+    <w:lsdException w:name="Plain Text" w:semiHidden="1" w:unhideWhenUsed="1"/>
+    <w:lsdException w:name="E-mail Signature" w:semiHidden="1" w:unhideWhenUsed="1"/>
+    <w:lsdException w:name="HTML Top of Form" w:semiHidden="1" w:unhideWhenUsed="1"/>
+    <w:lsdException w:name="HTML Bottom of Form" w:semiHidden="1" w:unhideWhenUsed="1"/>
+    <w:lsdException w:name="Normal (Web)" w:semiHidden="1" w:unhideWhenUsed="1"/>
+    <w:lsdException w:name="HTML Acronym" w:semiHidden="1" w:unhideWhenUsed="1"/>
+    <w:lsdException w:name="HTML Address" w:semiHidden="1" w:unhideWhenUsed="1"/>
+    <w:lsdException w:name="HTML Cite" w:semiHidden="1" w:unhideWhenUsed="1"/>
+    <w:lsdException w:name="HTML Code" w:semiHidden="1" w:unhideWhenUsed="1"/>
+    <w:lsdException w:name="HTML Definition" w:semiHidden="1" w:unhideWhenUsed="1"/>
+    <w:lsdException w:name="HTML Keyboard" w:semiHidden="1" w:unhideWhenUsed="1"/>
+    <w:lsdException w:name="HTML Preformatted" w:semiHidden="1" w:unhideWhenUsed="1"/>
+    <w:lsdException w:name="HTML Sample" w:semiHidden="1" w:unhideWhenUsed="1"/>
+    <w:lsdException w:name="HTML Typewriter" w:semiHidden="1" w:unhideWhenUsed="1"/>
+    <w:lsdException w:name="HTML Variable" w:semiHidden="1" w:unhideWhenUsed="1"/>
+    <w:lsdException w:name="Normal Table" w:semiHidden="1" w:unhideWhenUsed="1"/>
+    <w:lsdException w:name="annotation subject" w:semiHidden="1" w:unhideWhenUsed="1"/>
+    <w:lsdException w:name="No List" w:semiHidden="1" w:unhideWhenUsed="1"/>
+    <w:lsdException w:name="Outline List 1" w:semiHidden="1" w:unhideWhenUsed="1"/>
+    <w:lsdException w:name="Outline List 2" w:semiHidden="1" w:unhideWhenUsed="1"/>
+    <w:lsdException w:name="Outline List 3" w:semiHidden="1" w:unhideWhenUsed="1"/>
+    <w:lsdException w:name="Table Simple 1" w:semiHidden="1" w:unhideWhenUsed="1"/>
+    <w:lsdException w:name="Table Simple 2" w:semiHidden="1" w:unhideWhenUsed="1"/>
+    <w:lsdException w:name="Table Simple 3" w:semiHidden="1" w:unhideWhenUsed="1"/>
+    <w:lsdException w:name="Table Classic 1" w:semiHidden="1" w:unhideWhenUsed="1"/>
+    <w:lsdException w:name="Table Classic 2" w:semiHidden="1" w:unhideWhenUsed="1"/>
+    <w:lsdException w:name="Table Classic 3" w:semiHidden="1" w:unhideWhenUsed="1"/>
+    <w:lsdException w:name="Table Classic 4" w:semiHidden="1" w:unhideWhenUsed="1"/>
+    <w:lsdException w:name="Table Colorful 1" w:semiHidden="1" w:unhideWhenUsed="1"/>
+    <w:lsdException w:name="Table Colorful 2" w:semiHidden="1" w:unhideWhenUsed="1"/>
+    <w:lsdException w:name="Table Colorful 3" w:semiHidden="1" w:unhideWhenUsed="1"/>
+    <w:lsdException w:name="Table Columns 1" w:semiHidden="1" w:unhideWhenUsed="1"/>
+    <w:lsdException w:name="Table Columns 2" w:semiHidden="1" w:unhideWhenUsed="1"/>
+    <w:lsdException w:name="Table Columns 3" w:semiHidden="1" w:unhideWhenUsed="1"/>
+    <w:lsdException w:name="Table Columns 4" w:semiHidden="1" w:unhideWhenUsed="1"/>
+    <w:lsdException w:name="Table Columns 5" w:semiHidden="1" w:unhideWhenUsed="1"/>
+    <w:lsdException w:name="Table Grid 1" w:semiHidden="1" w:unhideWhenUsed="1"/>
+    <w:lsdException w:name="Table Grid 2" w:semiHidden="1" w:unhideWhenUsed="1"/>
+    <w:lsdException w:name="Table Grid 3" w:semiHidden="1" w:unhideWhenUsed="1"/>
+    <w:lsdException w:name="Table Grid 4" w:semiHidden="1" w:unhideWhenUsed="1"/>
+    <w:lsdException w:name="Table Grid 5" w:semiHidden="1" w:unhideWhenUsed="1"/>
+    <w:lsdException w:name="Table Grid 6" w:semiHidden="1" w:unhideWhenUsed="1"/>
+    <w:lsdException w:name="Table Grid 7" w:semiHidden="1" w:unhideWhenUsed="1"/>
+    <w:lsdException w:name="Table Grid 8" w:semiHidden="1" w:unhideWhenUsed="1"/>
+    <w:lsdException w:name="Table List 1" w:semiHidden="1" w:unhideWhenUsed="1"/>
+    <w:lsdException w:name="Table List 2" w:semiHidden="1" w:unhideWhenUsed="1"/>
+    <w:lsdException w:name="Table List 3" w:semiHidden="1" w:unhideWhenUsed="1"/>
+    <w:lsdException w:name="Table List 4" w:semiHidden="1" w:unhideWhenUsed="1"/>
+    <w:lsdException w:name="Table List 5" w:semiHidden="1" w:unhideWhenUsed="1"/>
+    <w:lsdException w:name="Table List 6" w:semiHidden="1" w:unhideWhenUsed="1"/>
+    <w:lsdException w:name="Table List 7" w:semiHidden="1" w:unhideWhenUsed="1"/>
+    <w:lsdException w:name="Table List 8" w:semiHidden="1" w:unhideWhenUsed="1"/>
+    <w:lsdException w:name="Table 3D effects 1" w:semiHidden="1" w:unhideWhenUsed="1"/>
+    <w:lsdException w:name="Table 3D effects 2" w:semiHidden="1" w:unhideWhenUsed="1"/>
+    <w:lsdException w:name="Table 3D effects 3" w:semiHidden="1" w:unhideWhenUsed="1"/>
+    <w:lsdException w:name="Table Contemporary" w:semiHidden="1" w:unhideWhenUsed="1"/>
+    <w:lsdException w:name="Table Elegant" w:semiHidden="1" w:unhideWhenUsed="1"/>
+    <w:lsdException w:name="Table Professional" w:semiHidden="1" w:unhideWhenUsed="1"/>
+    <w:lsdException w:name="Table Subtle 1" w:semiHidden="1" w:unhideWhenUsed="1"/>
+    <w:lsdException w:name="Table Subtle 2" w:semiHidden="1" w:unhideWhenUsed="1"/>
+    <w:lsdException w:name="Table Web 1" w:semiHidden="1" w:unhideWhenUsed="1"/>
+    <w:lsdException w:name="Table Web 2" w:semiHidden="1" w:unhideWhenUsed="1"/>
+    <w:lsdException w:name="Table Web 3" w:semiHidden="1" w:unhideWhenUsed="1"/>
+    <w:lsdException w:name="Balloon Text" w:semiHidden="1" w:unhideWhenUsed="1"/>
+    <w:lsdException w:name="Table Grid" w:uiPriority="59"/>
+    <w:lsdException w:name="Table Theme" w:semiHidden="1" w:unhideWhenUsed="1"/>
+    <w:lsdException w:name="Placeholder Text" w:semiHidden="1"/>
+    <w:lsdException w:name="No Spacing" w:uiPriority="1" w:qFormat="1"/>
+    <w:lsdException w:name="Light Shading" w:uiPriority="60"/>
+    <w:lsdException w:name="Light List" w:uiPriority="61"/>
+    <w:lsdException w:name="Light Grid" w:uiPriority="62"/>
+    <w:lsdException w:name="Medium Shading 1" w:uiPriority="63"/>
+    <w:lsdException w:name="Medium Shading 2" w:uiPriority="64"/>
+    <w:lsdException w:name="Medium List 1" w:uiPriority="65"/>
+    <w:lsdException w:name="Medium List 2" w:uiPriority="66"/>
+    <w:lsdException w:name="Medium Grid 1" w:uiPriority="67"/>
+    <w:lsdException w:name="Medium Grid 2" w:uiPriority="68"/>
+    <w:lsdException w:name="Medium Grid 3" w:uiPriority="69"/>
+    <w:lsdException w:name="Dark List" w:uiPriority="70"/>
+    <w:lsdException w:name="Colorful Shading" w:uiPriority="71"/>
+    <w:lsdException w:name="Colorful List" w:uiPriority="72"/>
+    <w:lsdException w:name="Colorful Grid" w:uiPriority="73"/>
+    <w:lsdException w:name="Light Shading Accent 1" w:uiPriority="60"/>
+    <w:lsdException w:name="Light List Accent 1" w:uiPriority="61"/>
+    <w:lsdException w:name="Light Grid Accent 1" w:uiPriority="62"/>
+    <w:lsdException w:name="Medium Shading 1 Accent 1" w:uiPriority="63"/>
+    <w:lsdException w:name="Medium Shading 2 Accent 1" w:uiPriority="64"/>
+    <w:lsdException w:name="Medium List 1 Accent 1" w:uiPriority="65"/>
+    <w:lsdException w:name="Revision" w:semiHidden="1"/>
+    <w:lsdException w:name="List Paragraph" w:uiPriority="34" w:qFormat="1"/>
+    <w:lsdException w:name="Quote" w:uiPriority="29" w:qFormat="1"/>
+    <w:lsdException w:name="Intense Quote" w:uiPriority="30" w:qFormat="1"/>
+    <w:lsdException w:name="Medium List 2 Accent 1" w:uiPriority="66"/>
+    <w:lsdException w:name="Medium Grid 1 Accent 1" w:uiPriority="67"/>
+    <w:lsdException w:name="Medium Grid 2 Accent 1" w:uiPriority="68"/>
+    <w:lsdException w:name="Medium Grid 3 Accent 1" w:uiPriority="69"/>
+    <w:lsdException w:name="Dark List Accent 1" w:uiPriority="70"/>
+    <w:lsdException w:name="Colorful Shading Accent 1" w:uiPriority="71"/>
+    <w:lsdException w:name="Colorful List Accent 1" w:uiPriority="72"/>
+    <w:lsdException w:name="Colorful Grid Accent 1" w:uiPriority="73"/>
+    <w:lsdException w:name="Light Shading Accent 2" w:uiPriority="60"/>
+    <w:lsdException w:name="Light List Accent 2" w:uiPriority="61"/>
+    <w:lsdException w:name="Light Grid Accent 2" w:uiPriority="62"/>
+    <w:lsdException w:name="Medium Shading 1 Accent 2" w:uiPriority="63"/>
+    <w:lsdException w:name="Medium Shading 2 Accent 2" w:uiPriority="64"/>
+    <w:lsdException w:name="Medium List 1 Accent 2" w:uiPriority="65"/>
+    <w:lsdException w:name="Medium List 2 Accent 2" w:uiPriority="66"/>
+    <w:lsdException w:name="Medium Grid 1 Accent 2" w:uiPriority="67"/>
+    <w:lsdException w:name="Medium Grid 2 Accent 2" w:uiPriority="68"/>
+    <w:lsdException w:name="Medium Grid 3 Accent 2" w:uiPriority="69"/>
+    <w:lsdException w:name="Dark List Accent 2" w:uiPriority="70"/>
+    <w:lsdException w:name="Colorful Shading Accent 2" w:uiPriority="71"/>
+    <w:lsdException w:name="Colorful List Accent 2" w:uiPriority="72"/>
+    <w:lsdException w:name="Colorful Grid Accent 2" w:uiPriority="73"/>
+    <w:lsdException w:name="Light Shading Accent 3" w:uiPriority="60"/>
+    <w:lsdException w:name="Light List Accent 3" w:uiPriority="61"/>
+    <w:lsdException w:name="Light Grid Accent 3" w:uiPriority="62"/>
+    <w:lsdException w:name="Medium Shading 1 Accent 3" w:uiPriority="63"/>
+    <w:lsdException w:name="Medium Shading 2 Accent 3" w:uiPriority="64"/>
+    <w:lsdException w:name="Medium List 1 Accent 3" w:uiPriority="65"/>
+    <w:lsdException w:name="Medium List 2 Accent 3" w:uiPriority="66"/>
+    <w:lsdException w:name="Medium Grid 1 Accent 3" w:uiPriority="67"/>
+    <w:lsdException w:name="Medium Grid 2 Accent 3" w:uiPriority="68"/>
+    <w:lsdException w:name="Medium Grid 3 Accent 3" w:uiPriority="69"/>
+    <w:lsdException w:name="Dark List Accent 3" w:uiPriority="70"/>
+    <w:lsdException w:name="Colorful Shading Accent 3" w:uiPriority="71"/>
+    <w:lsdException w:name="Colorful List Accent 3" w:uiPriority="72"/>
+    <w:lsdException w:name="Colorful Grid Accent 3" w:uiPriority="73"/>
+    <w:lsdException w:name="Light Shading Accent 4" w:uiPriority="60"/>
+    <w:lsdException w:name="Light List Accent 4" w:uiPriority="61"/>
+    <w:lsdException w:name="Light Grid Accent 4" w:uiPriority="62"/>
+    <w:lsdException w:name="Medium Shading 1 Accent 4" w:uiPriority="63"/>
+    <w:lsdException w:name="Medium Shading 2 Accent 4" w:uiPriority="64"/>
+    <w:lsdException w:name="Medium List 1 Accent 4" w:uiPriority="65"/>
+    <w:lsdException w:name="Medium List 2 Accent 4" w:uiPriority="66"/>
+    <w:lsdException w:name="Medium Grid 1 Accent 4" w:uiPriority="67"/>
+    <w:lsdException w:name="Medium Grid 2 Accent 4" w:uiPriority="68"/>
+    <w:lsdException w:name="Medium Grid 3 Accent 4" w:uiPriority="69"/>
+    <w:lsdException w:name="Dark List Accent 4" w:uiPriority="70"/>
+    <w:lsdException w:name="Colorful Shading Accent 4" w:uiPriority="71"/>
+    <w:lsdException w:name="Colorful List Accent 4" w:uiPriority="72"/>
+    <w:lsdException w:name="Colorful Grid Accent 4" w:uiPriority="73"/>
+    <w:lsdException w:name="Light Shading Accent 5" w:uiPriority="60"/>
+    <w:lsdException w:name="Light List Accent 5" w:uiPriority="61"/>
+    <w:lsdException w:name="Light Grid Accent 5" w:uiPriority="62"/>
+    <w:lsdException w:name="Medium Shading 1 Accent 5" w:uiPriority="63"/>
+    <w:lsdException w:name="Medium Shading 2 Accent 5" w:uiPriority="64"/>
+    <w:lsdException w:name="Medium List 1 Accent 5" w:uiPriority="65"/>
+    <w:lsdException w:name="Medium List 2 Accent 5" w:uiPriority="66"/>
+    <w:lsdException w:name="Medium Grid 1 Accent 5" w:uiPriority="67"/>
+    <w:lsdException w:name="Medium Grid 2 Accent 5" w:uiPriority="68"/>
+    <w:lsdException w:name="Medium Grid 3 Accent 5" w:uiPriority="69"/>
+    <w:lsdException w:name="Dark List Accent 5" w:uiPriority="70"/>
+    <w:lsdException w:name="Colorful Shading Accent 5" w:uiPriority="71"/>
+    <w:lsdException w:name="Colorful List Accent 5" w:uiPriority="72"/>
+    <w:lsdException w:name="Colorful Grid Accent 5" w:uiPriority="73"/>
+    <w:lsdException w:name="Light Shading Accent 6" w:uiPriority="60"/>
+    <w:lsdException w:name="Light List Accent 6" w:uiPriority="61"/>
+    <w:lsdException w:name="Light Grid Accent 6" w:uiPriority="62"/>
+    <w:lsdException w:name="Medium Shading 1 Accent 6" w:uiPriority="63"/>
+    <w:lsdException w:name="Medium Shading 2 Accent 6" w:uiPriority="64"/>
+    <w:lsdException w:name="Medium List 1 Accent 6" w:uiPriority="65"/>
+    <w:lsdException w:name="Medium List 2 Accent 6" w:uiPriority="66"/>
+    <w:lsdException w:name="Medium Grid 1 Accent 6" w:uiPriority="67"/>
+    <w:lsdException w:name="Medium Grid 2 Accent 6" w:uiPriority="68"/>
+    <w:lsdException w:name="Medium Grid 3 Accent 6" w:uiPriority="69"/>
+    <w:lsdException w:name="Dark List Accent 6" w:uiPriority="70"/>
+    <w:lsdException w:name="Colorful Shading Accent 6" w:uiPriority="71"/>
+    <w:lsdException w:name="Colorful List Accent 6" w:uiPriority="72"/>
+    <w:lsdException w:name="Colorful Grid Accent 6" w:uiPriority="73"/>
+    <w:lsdException w:name="Subtle Emphasis" w:uiPriority="19" w:qFormat="1"/>
+    <w:lsdException w:name="Intense Emphasis" w:uiPriority="21" w:qFormat="1"/>
+    <w:lsdException w:name="Subtle Reference" w:uiPriority="31" w:qFormat="1"/>
+    <w:lsdException w:name="Intense Reference" w:uiPriority="32" w:qFormat="1"/>
+    <w:lsdException w:name="Book Title" w:uiPriority="33" w:qFormat="1"/>
+    <w:lsdException w:name="Bibliography" w:semiHidden="1" w:uiPriority="37" w:unhideWhenUsed="1"/>
+    <w:lsdException w:name="TOC Heading" w:semiHidden="1" w:uiPriority="39" w:unhideWhenUsed="1" w:qFormat="1"/>
+    <w:lsdException w:name="Plain Table 1" w:uiPriority="41"/>
+    <w:lsdException w:name="Plain Table 2" w:uiPriority="42"/>
+    <w:lsdException w:name="Plain Table 3" w:uiPriority="43"/>
+    <w:lsdException w:name="Plain Table 4" w:uiPriority="44"/>
+    <w:lsdException w:name="Plain Table 5" w:uiPriority="45"/>
+    <w:lsdException w:name="Grid Table Light" w:uiPriority="40"/>
+    <w:lsdException w:name="Grid Table 1 Light" w:uiPriority="46"/>
+    <w:lsdException w:name="Grid Table 2" w:uiPriority="47"/>
+    <w:lsdException w:name="Grid Table 3" w:uiPriority="48"/>
+    <w:lsdException w:name="Grid Table 4" w:uiPriority="49"/>
+    <w:lsdException w:name="Grid Table 5 Dark" w:uiPriority="50"/>
+    <w:lsdException w:name="Grid Table 6 Colorful" w:uiPriority="51"/>
+    <w:lsdException w:name="Grid Table 7 Colorful" w:uiPriority="52"/>
+    <w:lsdException w:name="Grid Table 1 Light Accent 1" w:uiPriority="46"/>
+    <w:lsdException w:name="Grid Table 2 Accent 1" w:uiPriority="47"/>
+    <w:lsdException w:name="Grid Table 3 Accent 1" w:uiPriority="48"/>
+    <w:lsdException w:name="Grid Table 4 Accent 1" w:uiPriority="49"/>
+    <w:lsdException w:name="Grid Table 5 Dark Accent 1" w:uiPriority="50"/>
+    <w:lsdException w:name="Grid Table 6 Colorful Accent 1" w:uiPriority="51"/>
+    <w:lsdException w:name="Grid Table 7 Colorful Accent 1" w:uiPriority="52"/>
+    <w:lsdException w:name="Grid Table 1 Light Accent 2" w:uiPriority="46"/>
+    <w:lsdException w:name="Grid Table 2 Accent 2" w:uiPriority="47"/>
+    <w:lsdException w:name="Grid Table 3 Accent 2" w:uiPriority="48"/>
+    <w:lsdException w:name="Grid Table 4 Accent 2" w:uiPriority="49"/>
+    <w:lsdException w:name="Grid Table 5 Dark Accent 2" w:uiPriority="50"/>
+    <w:lsdException w:name="Grid Table 6 Colorful Accent 2" w:uiPriority="51"/>
+    <w:lsdException w:name="Grid Table 7 Colorful Accent 2" w:uiPriority="52"/>
+    <w:lsdException w:name="Grid Table 1 Light Accent 3" w:uiPriority="46"/>
+    <w:lsdException w:name="Grid Table 2 Accent 3" w:uiPriority="47"/>
+    <w:lsdException w:name="Grid Table 3 Accent 3" w:uiPriority="48"/>
+    <w:lsdException w:name="Grid Table 4 Accent 3" w:uiPriority="49"/>
+    <w:lsdException w:name="Grid Table 5 Dark Accent 3" w:uiPriority="50"/>
+    <w:lsdException w:name="Grid Table 6 Colorful Accent 3" w:uiPriority="51"/>
+    <w:lsdException w:name="Grid Table 7 Colorful Accent 3" w:uiPriority="52"/>
+    <w:lsdException w:name="Grid Table 1 Light Accent 4" w:uiPriority="46"/>
+    <w:lsdException w:name="Grid Table 2 Accent 4" w:uiPriority="47"/>
+    <w:lsdException w:name="Grid Table 3 Accent 4" w:uiPriority="48"/>
+    <w:lsdException w:name="Grid Table 4 Accent 4" w:uiPriority="49"/>
+    <w:lsdException w:name="Grid Table 5 Dark Accent 4" w:uiPriority="50"/>
+    <w:lsdException w:name="Grid Table 6 Colorful Accent 4" w:uiPriority="51"/>
+    <w:lsdException w:name="Grid Table 7 Colorful Accent 4" w:uiPriority="52"/>
+    <w:lsdException w:name="Grid Table 1 Light Accent 5" w:uiPriority="46"/>
+    <w:lsdException w:name="Grid Table 2 Accent 5" w:uiPriority="47"/>
+    <w:lsdException w:name="Grid Table 3 Accent 5" w:uiPriority="48"/>
+    <w:lsdException w:name="Grid Table 4 Accent 5" w:uiPriority="49"/>
+    <w:lsdException w:name="Grid Table 5 Dark Accent 5" w:uiPriority="50"/>
+    <w:lsdException w:name="Grid Table 6 Colorful Accent 5" w:uiPriority="51"/>
+    <w:lsdException w:name="Grid Table 7 Colorful Accent 5" w:uiPriority="52"/>
+    <w:lsdException w:name="Grid Table 1 Light Accent 6" w:uiPriority="46"/>
+    <w:lsdException w:name="Grid Table 2 Accent 6" w:uiPriority="47"/>
+    <w:lsdException w:name="Grid Table 3 Accent 6" w:uiPriority="48"/>
+    <w:lsdException w:name="Grid Table 4 Accent 6" w:uiPriority="49"/>
+    <w:lsdException w:name="Grid Table 5 Dark Accent 6" w:uiPriority="50"/>
+    <w:lsdException w:name="Grid Table 6 Colorful Accent 6" w:uiPriority="51"/>
+    <w:lsdException w:name="Grid Table 7 Colorful Accent 6" w:uiPriority="52"/>
+    <w:lsdException w:name="List Table 1 Light" w:uiPriority="46"/>
+    <w:lsdException w:name="List Table 2" w:uiPriority="47"/>
+    <w:lsdException w:name="List Table 3" w:uiPriority="48"/>
+    <w:lsdException w:name="List Table 4" w:uiPriority="49"/>
+    <w:lsdException w:name="List Table 5 Dark" w:uiPriority="50"/>
+    <w:lsdException w:name="List Table 6 Colorful" w:uiPriority="51"/>
+    <w:lsdException w:name="List Table 7 Colorful" w:uiPriority="52"/>
+    <w:lsdException w:name="List Table 1 Light Accent 1" w:uiPriority="46"/>
+    <w:lsdException w:name="List Table 2 Accent 1" w:uiPriority="47"/>
+    <w:lsdException w:name="List Table 3 Accent 1" w:uiPriority="48"/>
+    <w:lsdException w:name="List Table 4 Accent 1" w:uiPriority="49"/>
+    <w:lsdException w:name="List Table 5 Dark Accent 1" w:uiPriority="50"/>
+    <w:lsdException w:name="List Table 6 Colorful Accent 1" w:uiPriority="51"/>
+    <w:lsdException w:name="List Table 7 Colorful Accent 1" w:uiPriority="52"/>
+    <w:lsdException w:name="List Table 1 Light Accent 2" w:uiPriority="46"/>
+    <w:lsdException w:name="List Table 2 Accent 2" w:uiPriority="47"/>
+    <w:lsdException w:name="List Table 3 Accent 2" w:uiPriority="48"/>
+    <w:lsdException w:name="List Table 4 Accent 2" w:uiPriority="49"/>
+    <w:lsdException w:name="List Table 5 Dark Accent 2" w:uiPriority="50"/>
+    <w:lsdException w:name="List Table 6 Colorful Accent 2" w:uiPriority="51"/>
+    <w:lsdException w:name="List Table 7 Colorful Accent 2" w:uiPriority="52"/>
+    <w:lsdException w:name="List Table 1 Light Accent 3" w:uiPriority="46"/>
+    <w:lsdException w:name="List Table 2 Accent 3" w:uiPriority="47"/>
+    <w:lsdException w:name="List Table 3 Accent 3" w:uiPriority="48"/>
+    <w:lsdException w:name="List Table 4 Accent 3" w:uiPriority="49"/>
+    <w:lsdException w:name="List Table 5 Dark Accent 3" w:uiPriority="50"/>
+    <w:lsdException w:name="List Table 6 Colorful Accent 3" w:uiPriority="51"/>
+    <w:lsdException w:name="List Table 7 Colorful Accent 3" w:uiPriority="52"/>
+    <w:lsdException w:name="List Table 1 Light Accent 4" w:uiPriority="46"/>
+    <w:lsdException w:name="List Table 2 Accent 4" w:uiPriority="47"/>
+    <w:lsdException w:name="List Table 3 Accent 4" w:uiPriority="48"/>
+    <w:lsdException w:name="List Table 4 Accent 4" w:uiPriority="49"/>
+    <w:lsdException w:name="List Table 5 Dark Accent 4" w:uiPriority="50"/>
+    <w:lsdException w:name="List Table 6 Colorful Accent 4" w:uiPriority="51"/>
+    <w:lsdException w:name="List Table 7 Colorful Accent 4" w:uiPriority="52"/>
+    <w:lsdException w:name="List Table 1 Light Accent 5" w:uiPriority="46"/>
+    <w:lsdException w:name="List Table 2 Accent 5" w:uiPriority="47"/>
+    <w:lsdException w:name="List Table 3 Accent 5" w:uiPriority="48"/>
+    <w:lsdException w:name="List Table 4 Accent 5" w:uiPriority="49"/>
+    <w:lsdException w:name="List Table 5 Dark Accent 5" w:uiPriority="50"/>
+    <w:lsdException w:name="List Table 6 Colorful Accent 5" w:uiPriority="51"/>
+    <w:lsdException w:name="List Table 7 Colorful Accent 5" w:uiPriority="52"/>
+    <w:lsdException w:name="List Table 1 Light Accent 6" w:uiPriority="46"/>
+    <w:lsdException w:name="List Table 2 Accent 6" w:uiPriority="47"/>
+    <w:lsdException w:name="List Table 3 Accent 6" w:uiPriority="48"/>
+    <w:lsdException w:name="List Table 4 Accent 6" w:uiPriority="49"/>
+    <w:lsdException w:name="List Table 5 Dark Accent 6" w:uiPriority="50"/>
+    <w:lsdException w:name="List Table 6 Colorful Accent 6" w:uiPriority="51"/>
+    <w:lsdException w:name="List Table 7 Colorful Accent 6" w:uiPriority="52"/>
   </w:latentStyles>
   <w:style w:type="paragraph" w:default="1" w:styleId="Normal">
     <w:name w:val="Normal"/>
     <w:qFormat/>
+  </w:style>
+  <w:style w:type="paragraph" w:styleId="Heading1">
+    <w:name w:val="heading 1"/>
+    <w:basedOn w:val="Normal"/>
+    <w:next w:val="Normal"/>
+    <w:link w:val="Heading1Char"/>
+    <w:uiPriority w:val="9"/>
+    <w:qFormat/>
+    <w:rsid w:val="00EC2BF4"/>
+    <w:pPr>
+      <w:keepNext/>
+      <w:keepLines/>
+      <w:spacing w:before="240" w:after="0"/>
+      <w:outlineLvl w:val="0"/>
+    </w:pPr>
+    <w:rPr>
+      <w:rFonts w:asciiTheme="majorHAnsi" w:eastAsiaTheme="majorEastAsia" w:hAnsiTheme="majorHAnsi" w:cstheme="majorBidi"/>
+      <w:color w:val="365F91" w:themeColor="accent1" w:themeShade="BF"/>
+      <w:sz w:val="32"/>
+      <w:szCs w:val="32"/>
+    </w:rPr>
   </w:style>
   <w:style w:type="paragraph" w:styleId="Heading3">
     <w:name w:val="heading 3"/>
@@ -3853,373 +7120,44 @@
     <w:basedOn w:val="DefaultParagraphFont"/>
     <w:rsid w:val="004B5B56"/>
   </w:style>
-</w:styles>
-</file>
-
-<file path=word/stylesWithEffects.xml><?xml version="1.0" encoding="utf-8"?>
-<w:styles xmlns:wpc="http://schemas.microsoft.com/office/word/2010/wordprocessingCanvas" xmlns:mc="http://schemas.openxmlformats.org/markup-compatibility/2006" xmlns:o="urn:schemas-microsoft-com:office:office" xmlns:r="http://schemas.openxmlformats.org/officeDocument/2006/relationships" xmlns:m="http://schemas.openxmlformats.org/officeDocument/2006/math" xmlns:v="urn:schemas-microsoft-com:vml" xmlns:wp14="http://schemas.microsoft.com/office/word/2010/wordprocessingDrawing" xmlns:wp="http://schemas.openxmlformats.org/drawingml/2006/wordprocessingDrawing" xmlns:w10="urn:schemas-microsoft-com:office:word" xmlns:w="http://schemas.openxmlformats.org/wordprocessingml/2006/main" xmlns:w14="http://schemas.microsoft.com/office/word/2010/wordml" xmlns:wpg="http://schemas.microsoft.com/office/word/2010/wordprocessingGroup" xmlns:wpi="http://schemas.microsoft.com/office/word/2010/wordprocessingInk" xmlns:wne="http://schemas.microsoft.com/office/word/2006/wordml" xmlns:wps="http://schemas.microsoft.com/office/word/2010/wordprocessingShape" mc:Ignorable="w14 wp14">
-  <w:docDefaults>
-    <w:rPrDefault>
-      <w:rPr>
-        <w:rFonts w:asciiTheme="minorHAnsi" w:eastAsiaTheme="minorEastAsia" w:hAnsiTheme="minorHAnsi" w:cstheme="minorBidi"/>
-        <w:sz w:val="22"/>
-        <w:szCs w:val="22"/>
-        <w:lang w:val="en-US" w:eastAsia="en-US" w:bidi="ar-SA"/>
-      </w:rPr>
-    </w:rPrDefault>
-    <w:pPrDefault>
-      <w:pPr>
-        <w:spacing w:after="200" w:line="276" w:lineRule="auto"/>
-      </w:pPr>
-    </w:pPrDefault>
-  </w:docDefaults>
-  <w:latentStyles w:defLockedState="0" w:defUIPriority="99" w:defSemiHidden="1" w:defUnhideWhenUsed="1" w:defQFormat="0" w:count="267">
-    <w:lsdException w:name="Normal" w:semiHidden="0" w:uiPriority="0" w:unhideWhenUsed="0" w:qFormat="1"/>
-    <w:lsdException w:name="heading 1" w:semiHidden="0" w:uiPriority="9" w:unhideWhenUsed="0" w:qFormat="1"/>
-    <w:lsdException w:name="heading 2" w:uiPriority="9" w:qFormat="1"/>
-    <w:lsdException w:name="heading 3" w:uiPriority="9" w:qFormat="1"/>
-    <w:lsdException w:name="heading 4" w:uiPriority="9" w:qFormat="1"/>
-    <w:lsdException w:name="heading 5" w:uiPriority="9" w:qFormat="1"/>
-    <w:lsdException w:name="heading 6" w:uiPriority="9" w:qFormat="1"/>
-    <w:lsdException w:name="heading 7" w:uiPriority="9" w:qFormat="1"/>
-    <w:lsdException w:name="heading 8" w:uiPriority="9" w:qFormat="1"/>
-    <w:lsdException w:name="heading 9" w:uiPriority="9" w:qFormat="1"/>
-    <w:lsdException w:name="toc 1" w:uiPriority="39"/>
-    <w:lsdException w:name="toc 2" w:uiPriority="39"/>
-    <w:lsdException w:name="toc 3" w:uiPriority="39"/>
-    <w:lsdException w:name="toc 4" w:uiPriority="39"/>
-    <w:lsdException w:name="toc 5" w:uiPriority="39"/>
-    <w:lsdException w:name="toc 6" w:uiPriority="39"/>
-    <w:lsdException w:name="toc 7" w:uiPriority="39"/>
-    <w:lsdException w:name="toc 8" w:uiPriority="39"/>
-    <w:lsdException w:name="toc 9" w:uiPriority="39"/>
-    <w:lsdException w:name="caption" w:uiPriority="35" w:qFormat="1"/>
-    <w:lsdException w:name="Title" w:semiHidden="0" w:uiPriority="10" w:unhideWhenUsed="0" w:qFormat="1"/>
-    <w:lsdException w:name="Default Paragraph Font" w:uiPriority="1"/>
-    <w:lsdException w:name="Subtitle" w:semiHidden="0" w:uiPriority="11" w:unhideWhenUsed="0" w:qFormat="1"/>
-    <w:lsdException w:name="Strong" w:semiHidden="0" w:uiPriority="22" w:unhideWhenUsed="0" w:qFormat="1"/>
-    <w:lsdException w:name="Emphasis" w:semiHidden="0" w:uiPriority="20" w:unhideWhenUsed="0" w:qFormat="1"/>
-    <w:lsdException w:name="Table Grid" w:semiHidden="0" w:uiPriority="59" w:unhideWhenUsed="0"/>
-    <w:lsdException w:name="Placeholder Text" w:unhideWhenUsed="0"/>
-    <w:lsdException w:name="No Spacing" w:semiHidden="0" w:uiPriority="1" w:unhideWhenUsed="0" w:qFormat="1"/>
-    <w:lsdException w:name="Light Shading" w:semiHidden="0" w:uiPriority="60" w:unhideWhenUsed="0"/>
-    <w:lsdException w:name="Light List" w:semiHidden="0" w:uiPriority="61" w:unhideWhenUsed="0"/>
-    <w:lsdException w:name="Light Grid" w:semiHidden="0" w:uiPriority="62" w:unhideWhenUsed="0"/>
-    <w:lsdException w:name="Medium Shading 1" w:semiHidden="0" w:uiPriority="63" w:unhideWhenUsed="0"/>
-    <w:lsdException w:name="Medium Shading 2" w:semiHidden="0" w:uiPriority="64" w:unhideWhenUsed="0"/>
-    <w:lsdException w:name="Medium List 1" w:semiHidden="0" w:uiPriority="65" w:unhideWhenUsed="0"/>
-    <w:lsdException w:name="Medium List 2" w:semiHidden="0" w:uiPriority="66" w:unhideWhenUsed="0"/>
-    <w:lsdException w:name="Medium Grid 1" w:semiHidden="0" w:uiPriority="67" w:unhideWhenUsed="0"/>
-    <w:lsdException w:name="Medium Grid 2" w:semiHidden="0" w:uiPriority="68" w:unhideWhenUsed="0"/>
-    <w:lsdException w:name="Medium Grid 3" w:semiHidden="0" w:uiPriority="69" w:unhideWhenUsed="0"/>
-    <w:lsdException w:name="Dark List" w:semiHidden="0" w:uiPriority="70" w:unhideWhenUsed="0"/>
-    <w:lsdException w:name="Colorful Shading" w:semiHidden="0" w:uiPriority="71" w:unhideWhenUsed="0"/>
-    <w:lsdException w:name="Colorful List" w:semiHidden="0" w:uiPriority="72" w:unhideWhenUsed="0"/>
-    <w:lsdException w:name="Colorful Grid" w:semiHidden="0" w:uiPriority="73" w:unhideWhenUsed="0"/>
-    <w:lsdException w:name="Light Shading Accent 1" w:semiHidden="0" w:uiPriority="60" w:unhideWhenUsed="0"/>
-    <w:lsdException w:name="Light List Accent 1" w:semiHidden="0" w:uiPriority="61" w:unhideWhenUsed="0"/>
-    <w:lsdException w:name="Light Grid Accent 1" w:semiHidden="0" w:uiPriority="62" w:unhideWhenUsed="0"/>
-    <w:lsdException w:name="Medium Shading 1 Accent 1" w:semiHidden="0" w:uiPriority="63" w:unhideWhenUsed="0"/>
-    <w:lsdException w:name="Medium Shading 2 Accent 1" w:semiHidden="0" w:uiPriority="64" w:unhideWhenUsed="0"/>
-    <w:lsdException w:name="Medium List 1 Accent 1" w:semiHidden="0" w:uiPriority="65" w:unhideWhenUsed="0"/>
-    <w:lsdException w:name="Revision" w:unhideWhenUsed="0"/>
-    <w:lsdException w:name="List Paragraph" w:semiHidden="0" w:uiPriority="34" w:unhideWhenUsed="0" w:qFormat="1"/>
-    <w:lsdException w:name="Quote" w:semiHidden="0" w:uiPriority="29" w:unhideWhenUsed="0" w:qFormat="1"/>
-    <w:lsdException w:name="Intense Quote" w:semiHidden="0" w:uiPriority="30" w:unhideWhenUsed="0" w:qFormat="1"/>
-    <w:lsdException w:name="Medium List 2 Accent 1" w:semiHidden="0" w:uiPriority="66" w:unhideWhenUsed="0"/>
-    <w:lsdException w:name="Medium Grid 1 Accent 1" w:semiHidden="0" w:uiPriority="67" w:unhideWhenUsed="0"/>
-    <w:lsdException w:name="Medium Grid 2 Accent 1" w:semiHidden="0" w:uiPriority="68" w:unhideWhenUsed="0"/>
-    <w:lsdException w:name="Medium Grid 3 Accent 1" w:semiHidden="0" w:uiPriority="69" w:unhideWhenUsed="0"/>
-    <w:lsdException w:name="Dark List Accent 1" w:semiHidden="0" w:uiPriority="70" w:unhideWhenUsed="0"/>
-    <w:lsdException w:name="Colorful Shading Accent 1" w:semiHidden="0" w:uiPriority="71" w:unhideWhenUsed="0"/>
-    <w:lsdException w:name="Colorful List Accent 1" w:semiHidden="0" w:uiPriority="72" w:unhideWhenUsed="0"/>
-    <w:lsdException w:name="Colorful Grid Accent 1" w:semiHidden="0" w:uiPriority="73" w:unhideWhenUsed="0"/>
-    <w:lsdException w:name="Light Shading Accent 2" w:semiHidden="0" w:uiPriority="60" w:unhideWhenUsed="0"/>
-    <w:lsdException w:name="Light List Accent 2" w:semiHidden="0" w:uiPriority="61" w:unhideWhenUsed="0"/>
-    <w:lsdException w:name="Light Grid Accent 2" w:semiHidden="0" w:uiPriority="62" w:unhideWhenUsed="0"/>
-    <w:lsdException w:name="Medium Shading 1 Accent 2" w:semiHidden="0" w:uiPriority="63" w:unhideWhenUsed="0"/>
-    <w:lsdException w:name="Medium Shading 2 Accent 2" w:semiHidden="0" w:uiPriority="64" w:unhideWhenUsed="0"/>
-    <w:lsdException w:name="Medium List 1 Accent 2" w:semiHidden="0" w:uiPriority="65" w:unhideWhenUsed="0"/>
-    <w:lsdException w:name="Medium List 2 Accent 2" w:semiHidden="0" w:uiPriority="66" w:unhideWhenUsed="0"/>
-    <w:lsdException w:name="Medium Grid 1 Accent 2" w:semiHidden="0" w:uiPriority="67" w:unhideWhenUsed="0"/>
-    <w:lsdException w:name="Medium Grid 2 Accent 2" w:semiHidden="0" w:uiPriority="68" w:unhideWhenUsed="0"/>
-    <w:lsdException w:name="Medium Grid 3 Accent 2" w:semiHidden="0" w:uiPriority="69" w:unhideWhenUsed="0"/>
-    <w:lsdException w:name="Dark List Accent 2" w:semiHidden="0" w:uiPriority="70" w:unhideWhenUsed="0"/>
-    <w:lsdException w:name="Colorful Shading Accent 2" w:semiHidden="0" w:uiPriority="71" w:unhideWhenUsed="0"/>
-    <w:lsdException w:name="Colorful List Accent 2" w:semiHidden="0" w:uiPriority="72" w:unhideWhenUsed="0"/>
-    <w:lsdException w:name="Colorful Grid Accent 2" w:semiHidden="0" w:uiPriority="73" w:unhideWhenUsed="0"/>
-    <w:lsdException w:name="Light Shading Accent 3" w:semiHidden="0" w:uiPriority="60" w:unhideWhenUsed="0"/>
-    <w:lsdException w:name="Light List Accent 3" w:semiHidden="0" w:uiPriority="61" w:unhideWhenUsed="0"/>
-    <w:lsdException w:name="Light Grid Accent 3" w:semiHidden="0" w:uiPriority="62" w:unhideWhenUsed="0"/>
-    <w:lsdException w:name="Medium Shading 1 Accent 3" w:semiHidden="0" w:uiPriority="63" w:unhideWhenUsed="0"/>
-    <w:lsdException w:name="Medium Shading 2 Accent 3" w:semiHidden="0" w:uiPriority="64" w:unhideWhenUsed="0"/>
-    <w:lsdException w:name="Medium List 1 Accent 3" w:semiHidden="0" w:uiPriority="65" w:unhideWhenUsed="0"/>
-    <w:lsdException w:name="Medium List 2 Accent 3" w:semiHidden="0" w:uiPriority="66" w:unhideWhenUsed="0"/>
-    <w:lsdException w:name="Medium Grid 1 Accent 3" w:semiHidden="0" w:uiPriority="67" w:unhideWhenUsed="0"/>
-    <w:lsdException w:name="Medium Grid 2 Accent 3" w:semiHidden="0" w:uiPriority="68" w:unhideWhenUsed="0"/>
-    <w:lsdException w:name="Medium Grid 3 Accent 3" w:semiHidden="0" w:uiPriority="69" w:unhideWhenUsed="0"/>
-    <w:lsdException w:name="Dark List Accent 3" w:semiHidden="0" w:uiPriority="70" w:unhideWhenUsed="0"/>
-    <w:lsdException w:name="Colorful Shading Accent 3" w:semiHidden="0" w:uiPriority="71" w:unhideWhenUsed="0"/>
-    <w:lsdException w:name="Colorful List Accent 3" w:semiHidden="0" w:uiPriority="72" w:unhideWhenUsed="0"/>
-    <w:lsdException w:name="Colorful Grid Accent 3" w:semiHidden="0" w:uiPriority="73" w:unhideWhenUsed="0"/>
-    <w:lsdException w:name="Light Shading Accent 4" w:semiHidden="0" w:uiPriority="60" w:unhideWhenUsed="0"/>
-    <w:lsdException w:name="Light List Accent 4" w:semiHidden="0" w:uiPriority="61" w:unhideWhenUsed="0"/>
-    <w:lsdException w:name="Light Grid Accent 4" w:semiHidden="0" w:uiPriority="62" w:unhideWhenUsed="0"/>
-    <w:lsdException w:name="Medium Shading 1 Accent 4" w:semiHidden="0" w:uiPriority="63" w:unhideWhenUsed="0"/>
-    <w:lsdException w:name="Medium Shading 2 Accent 4" w:semiHidden="0" w:uiPriority="64" w:unhideWhenUsed="0"/>
-    <w:lsdException w:name="Medium List 1 Accent 4" w:semiHidden="0" w:uiPriority="65" w:unhideWhenUsed="0"/>
-    <w:lsdException w:name="Medium List 2 Accent 4" w:semiHidden="0" w:uiPriority="66" w:unhideWhenUsed="0"/>
-    <w:lsdException w:name="Medium Grid 1 Accent 4" w:semiHidden="0" w:uiPriority="67" w:unhideWhenUsed="0"/>
-    <w:lsdException w:name="Medium Grid 2 Accent 4" w:semiHidden="0" w:uiPriority="68" w:unhideWhenUsed="0"/>
-    <w:lsdException w:name="Medium Grid 3 Accent 4" w:semiHidden="0" w:uiPriority="69" w:unhideWhenUsed="0"/>
-    <w:lsdException w:name="Dark List Accent 4" w:semiHidden="0" w:uiPriority="70" w:unhideWhenUsed="0"/>
-    <w:lsdException w:name="Colorful Shading Accent 4" w:semiHidden="0" w:uiPriority="71" w:unhideWhenUsed="0"/>
-    <w:lsdException w:name="Colorful List Accent 4" w:semiHidden="0" w:uiPriority="72" w:unhideWhenUsed="0"/>
-    <w:lsdException w:name="Colorful Grid Accent 4" w:semiHidden="0" w:uiPriority="73" w:unhideWhenUsed="0"/>
-    <w:lsdException w:name="Light Shading Accent 5" w:semiHidden="0" w:uiPriority="60" w:unhideWhenUsed="0"/>
-    <w:lsdException w:name="Light List Accent 5" w:semiHidden="0" w:uiPriority="61" w:unhideWhenUsed="0"/>
-    <w:lsdException w:name="Light Grid Accent 5" w:semiHidden="0" w:uiPriority="62" w:unhideWhenUsed="0"/>
-    <w:lsdException w:name="Medium Shading 1 Accent 5" w:semiHidden="0" w:uiPriority="63" w:unhideWhenUsed="0"/>
-    <w:lsdException w:name="Medium Shading 2 Accent 5" w:semiHidden="0" w:uiPriority="64" w:unhideWhenUsed="0"/>
-    <w:lsdException w:name="Medium List 1 Accent 5" w:semiHidden="0" w:uiPriority="65" w:unhideWhenUsed="0"/>
-    <w:lsdException w:name="Medium List 2 Accent 5" w:semiHidden="0" w:uiPriority="66" w:unhideWhenUsed="0"/>
-    <w:lsdException w:name="Medium Grid 1 Accent 5" w:semiHidden="0" w:uiPriority="67" w:unhideWhenUsed="0"/>
-    <w:lsdException w:name="Medium Grid 2 Accent 5" w:semiHidden="0" w:uiPriority="68" w:unhideWhenUsed="0"/>
-    <w:lsdException w:name="Medium Grid 3 Accent 5" w:semiHidden="0" w:uiPriority="69" w:unhideWhenUsed="0"/>
-    <w:lsdException w:name="Dark List Accent 5" w:semiHidden="0" w:uiPriority="70" w:unhideWhenUsed="0"/>
-    <w:lsdException w:name="Colorful Shading Accent 5" w:semiHidden="0" w:uiPriority="71" w:unhideWhenUsed="0"/>
-    <w:lsdException w:name="Colorful List Accent 5" w:semiHidden="0" w:uiPriority="72" w:unhideWhenUsed="0"/>
-    <w:lsdException w:name="Colorful Grid Accent 5" w:semiHidden="0" w:uiPriority="73" w:unhideWhenUsed="0"/>
-    <w:lsdException w:name="Light Shading Accent 6" w:semiHidden="0" w:uiPriority="60" w:unhideWhenUsed="0"/>
-    <w:lsdException w:name="Light List Accent 6" w:semiHidden="0" w:uiPriority="61" w:unhideWhenUsed="0"/>
-    <w:lsdException w:name="Light Grid Accent 6" w:semiHidden="0" w:uiPriority="62" w:unhideWhenUsed="0"/>
-    <w:lsdException w:name="Medium Shading 1 Accent 6" w:semiHidden="0" w:uiPriority="63" w:unhideWhenUsed="0"/>
-    <w:lsdException w:name="Medium Shading 2 Accent 6" w:semiHidden="0" w:uiPriority="64" w:unhideWhenUsed="0"/>
-    <w:lsdException w:name="Medium List 1 Accent 6" w:semiHidden="0" w:uiPriority="65" w:unhideWhenUsed="0"/>
-    <w:lsdException w:name="Medium List 2 Accent 6" w:semiHidden="0" w:uiPriority="66" w:unhideWhenUsed="0"/>
-    <w:lsdException w:name="Medium Grid 1 Accent 6" w:semiHidden="0" w:uiPriority="67" w:unhideWhenUsed="0"/>
-    <w:lsdException w:name="Medium Grid 2 Accent 6" w:semiHidden="0" w:uiPriority="68" w:unhideWhenUsed="0"/>
-    <w:lsdException w:name="Medium Grid 3 Accent 6" w:semiHidden="0" w:uiPriority="69" w:unhideWhenUsed="0"/>
-    <w:lsdException w:name="Dark List Accent 6" w:semiHidden="0" w:uiPriority="70" w:unhideWhenUsed="0"/>
-    <w:lsdException w:name="Colorful Shading Accent 6" w:semiHidden="0" w:uiPriority="71" w:unhideWhenUsed="0"/>
-    <w:lsdException w:name="Colorful List Accent 6" w:semiHidden="0" w:uiPriority="72" w:unhideWhenUsed="0"/>
-    <w:lsdException w:name="Colorful Grid Accent 6" w:semiHidden="0" w:uiPriority="73" w:unhideWhenUsed="0"/>
-    <w:lsdException w:name="Subtle Emphasis" w:semiHidden="0" w:uiPriority="19" w:unhideWhenUsed="0" w:qFormat="1"/>
-    <w:lsdException w:name="Intense Emphasis" w:semiHidden="0" w:uiPriority="21" w:unhideWhenUsed="0" w:qFormat="1"/>
-    <w:lsdException w:name="Subtle Reference" w:semiHidden="0" w:uiPriority="31" w:unhideWhenUsed="0" w:qFormat="1"/>
-    <w:lsdException w:name="Intense Reference" w:semiHidden="0" w:uiPriority="32" w:unhideWhenUsed="0" w:qFormat="1"/>
-    <w:lsdException w:name="Book Title" w:semiHidden="0" w:uiPriority="33" w:unhideWhenUsed="0" w:qFormat="1"/>
-    <w:lsdException w:name="Bibliography" w:uiPriority="37"/>
-    <w:lsdException w:name="TOC Heading" w:uiPriority="39" w:qFormat="1"/>
-  </w:latentStyles>
-  <w:style w:type="paragraph" w:default="1" w:styleId="Normal">
-    <w:name w:val="Normal"/>
-    <w:qFormat/>
+  <w:style w:type="character" w:customStyle="1" w:styleId="Heading1Char">
+    <w:name w:val="Heading 1 Char"/>
+    <w:basedOn w:val="DefaultParagraphFont"/>
+    <w:link w:val="Heading1"/>
+    <w:uiPriority w:val="9"/>
+    <w:rsid w:val="00EC2BF4"/>
+    <w:rPr>
+      <w:rFonts w:asciiTheme="majorHAnsi" w:eastAsiaTheme="majorEastAsia" w:hAnsiTheme="majorHAnsi" w:cstheme="majorBidi"/>
+      <w:color w:val="365F91" w:themeColor="accent1" w:themeShade="BF"/>
+      <w:sz w:val="32"/>
+      <w:szCs w:val="32"/>
+    </w:rPr>
   </w:style>
-  <w:style w:type="paragraph" w:styleId="Heading3">
-    <w:name w:val="heading 3"/>
+  <w:style w:type="paragraph" w:styleId="NormalWeb">
+    <w:name w:val="Normal (Web)"/>
     <w:basedOn w:val="Normal"/>
-    <w:link w:val="Heading3Char"/>
-    <w:uiPriority w:val="9"/>
-    <w:qFormat/>
-    <w:rsid w:val="004B5B56"/>
+    <w:uiPriority w:val="99"/>
+    <w:semiHidden/>
+    <w:unhideWhenUsed/>
+    <w:rsid w:val="00EC2BF4"/>
     <w:pPr>
       <w:spacing w:before="100" w:beforeAutospacing="1" w:after="100" w:afterAutospacing="1" w:line="240" w:lineRule="auto"/>
-      <w:outlineLvl w:val="2"/>
     </w:pPr>
     <w:rPr>
       <w:rFonts w:ascii="Times New Roman" w:eastAsia="Times New Roman" w:hAnsi="Times New Roman" w:cs="Times New Roman"/>
-      <w:b/>
-      <w:bCs/>
-      <w:sz w:val="27"/>
-      <w:szCs w:val="27"/>
-    </w:rPr>
-  </w:style>
-  <w:style w:type="paragraph" w:styleId="Heading4">
-    <w:name w:val="heading 4"/>
-    <w:basedOn w:val="Normal"/>
-    <w:link w:val="Heading4Char"/>
-    <w:uiPriority w:val="9"/>
-    <w:qFormat/>
-    <w:rsid w:val="004B5B56"/>
-    <w:pPr>
-      <w:spacing w:before="100" w:beforeAutospacing="1" w:after="100" w:afterAutospacing="1" w:line="240" w:lineRule="auto"/>
-      <w:outlineLvl w:val="3"/>
-    </w:pPr>
-    <w:rPr>
-      <w:rFonts w:ascii="Times New Roman" w:eastAsia="Times New Roman" w:hAnsi="Times New Roman" w:cs="Times New Roman"/>
-      <w:b/>
-      <w:bCs/>
       <w:sz w:val="24"/>
       <w:szCs w:val="24"/>
     </w:rPr>
   </w:style>
-  <w:style w:type="character" w:default="1" w:styleId="DefaultParagraphFont">
-    <w:name w:val="Default Paragraph Font"/>
-    <w:uiPriority w:val="1"/>
-    <w:semiHidden/>
-    <w:unhideWhenUsed/>
+  <w:style w:type="character" w:customStyle="1" w:styleId="t">
+    <w:name w:val="ͼt"/>
+    <w:basedOn w:val="DefaultParagraphFont"/>
+    <w:rsid w:val="00EC2BF4"/>
   </w:style>
-  <w:style w:type="table" w:default="1" w:styleId="TableNormal">
-    <w:name w:val="Normal Table"/>
-    <w:uiPriority w:val="99"/>
-    <w:semiHidden/>
-    <w:unhideWhenUsed/>
-    <w:tblPr>
-      <w:tblInd w:w="0" w:type="dxa"/>
-      <w:tblCellMar>
-        <w:top w:w="0" w:type="dxa"/>
-        <w:left w:w="108" w:type="dxa"/>
-        <w:bottom w:w="0" w:type="dxa"/>
-        <w:right w:w="108" w:type="dxa"/>
-      </w:tblCellMar>
-    </w:tblPr>
-  </w:style>
-  <w:style w:type="numbering" w:default="1" w:styleId="NoList">
-    <w:name w:val="No List"/>
-    <w:uiPriority w:val="99"/>
-    <w:semiHidden/>
-    <w:unhideWhenUsed/>
-  </w:style>
-  <w:style w:type="character" w:customStyle="1" w:styleId="Heading3Char">
-    <w:name w:val="Heading 3 Char"/>
+  <w:style w:type="character" w:customStyle="1" w:styleId="n">
+    <w:name w:val="ͼn"/>
     <w:basedOn w:val="DefaultParagraphFont"/>
-    <w:link w:val="Heading3"/>
-    <w:uiPriority w:val="9"/>
-    <w:rsid w:val="004B5B56"/>
-    <w:rPr>
-      <w:rFonts w:ascii="Times New Roman" w:eastAsia="Times New Roman" w:hAnsi="Times New Roman" w:cs="Times New Roman"/>
-      <w:b/>
-      <w:bCs/>
-      <w:sz w:val="27"/>
-      <w:szCs w:val="27"/>
-    </w:rPr>
-  </w:style>
-  <w:style w:type="character" w:customStyle="1" w:styleId="Heading4Char">
-    <w:name w:val="Heading 4 Char"/>
-    <w:basedOn w:val="DefaultParagraphFont"/>
-    <w:link w:val="Heading4"/>
-    <w:uiPriority w:val="9"/>
-    <w:rsid w:val="004B5B56"/>
-    <w:rPr>
-      <w:rFonts w:ascii="Times New Roman" w:eastAsia="Times New Roman" w:hAnsi="Times New Roman" w:cs="Times New Roman"/>
-      <w:b/>
-      <w:bCs/>
-      <w:sz w:val="24"/>
-      <w:szCs w:val="24"/>
-    </w:rPr>
-  </w:style>
-  <w:style w:type="character" w:styleId="Strong">
-    <w:name w:val="Strong"/>
-    <w:basedOn w:val="DefaultParagraphFont"/>
-    <w:uiPriority w:val="22"/>
-    <w:qFormat/>
-    <w:rsid w:val="004B5B56"/>
-    <w:rPr>
-      <w:b/>
-      <w:bCs/>
-    </w:rPr>
-  </w:style>
-  <w:style w:type="paragraph" w:styleId="HTMLPreformatted">
-    <w:name w:val="HTML Preformatted"/>
-    <w:basedOn w:val="Normal"/>
-    <w:link w:val="HTMLPreformattedChar"/>
-    <w:uiPriority w:val="99"/>
-    <w:semiHidden/>
-    <w:unhideWhenUsed/>
-    <w:rsid w:val="004B5B56"/>
-    <w:pPr>
-      <w:tabs>
-        <w:tab w:val="left" w:pos="916"/>
-        <w:tab w:val="left" w:pos="1832"/>
-        <w:tab w:val="left" w:pos="2748"/>
-        <w:tab w:val="left" w:pos="3664"/>
-        <w:tab w:val="left" w:pos="4580"/>
-        <w:tab w:val="left" w:pos="5496"/>
-        <w:tab w:val="left" w:pos="6412"/>
-        <w:tab w:val="left" w:pos="7328"/>
-        <w:tab w:val="left" w:pos="8244"/>
-        <w:tab w:val="left" w:pos="9160"/>
-        <w:tab w:val="left" w:pos="10076"/>
-        <w:tab w:val="left" w:pos="10992"/>
-        <w:tab w:val="left" w:pos="11908"/>
-        <w:tab w:val="left" w:pos="12824"/>
-        <w:tab w:val="left" w:pos="13740"/>
-        <w:tab w:val="left" w:pos="14656"/>
-      </w:tabs>
-      <w:spacing w:after="0" w:line="240" w:lineRule="auto"/>
-    </w:pPr>
-    <w:rPr>
-      <w:rFonts w:ascii="Courier New" w:eastAsia="Times New Roman" w:hAnsi="Courier New" w:cs="Courier New"/>
-      <w:sz w:val="20"/>
-      <w:szCs w:val="20"/>
-    </w:rPr>
-  </w:style>
-  <w:style w:type="character" w:customStyle="1" w:styleId="HTMLPreformattedChar">
-    <w:name w:val="HTML Preformatted Char"/>
-    <w:basedOn w:val="DefaultParagraphFont"/>
-    <w:link w:val="HTMLPreformatted"/>
-    <w:uiPriority w:val="99"/>
-    <w:semiHidden/>
-    <w:rsid w:val="004B5B56"/>
-    <w:rPr>
-      <w:rFonts w:ascii="Courier New" w:eastAsia="Times New Roman" w:hAnsi="Courier New" w:cs="Courier New"/>
-      <w:sz w:val="20"/>
-      <w:szCs w:val="20"/>
-    </w:rPr>
-  </w:style>
-  <w:style w:type="character" w:styleId="HTMLCode">
-    <w:name w:val="HTML Code"/>
-    <w:basedOn w:val="DefaultParagraphFont"/>
-    <w:uiPriority w:val="99"/>
-    <w:semiHidden/>
-    <w:unhideWhenUsed/>
-    <w:rsid w:val="004B5B56"/>
-    <w:rPr>
-      <w:rFonts w:ascii="Courier New" w:eastAsia="Times New Roman" w:hAnsi="Courier New" w:cs="Courier New"/>
-      <w:sz w:val="20"/>
-      <w:szCs w:val="20"/>
-    </w:rPr>
-  </w:style>
-  <w:style w:type="character" w:customStyle="1" w:styleId="hljs-keyword">
-    <w:name w:val="hljs-keyword"/>
-    <w:basedOn w:val="DefaultParagraphFont"/>
-    <w:rsid w:val="004B5B56"/>
-  </w:style>
-  <w:style w:type="character" w:customStyle="1" w:styleId="hljs-title">
-    <w:name w:val="hljs-title"/>
-    <w:basedOn w:val="DefaultParagraphFont"/>
-    <w:rsid w:val="004B5B56"/>
-  </w:style>
-  <w:style w:type="character" w:customStyle="1" w:styleId="hljs-params">
-    <w:name w:val="hljs-params"/>
-    <w:basedOn w:val="DefaultParagraphFont"/>
-    <w:rsid w:val="004B5B56"/>
-  </w:style>
-  <w:style w:type="character" w:customStyle="1" w:styleId="hljs-type">
-    <w:name w:val="hljs-type"/>
-    <w:basedOn w:val="DefaultParagraphFont"/>
-    <w:rsid w:val="004B5B56"/>
-  </w:style>
-  <w:style w:type="character" w:customStyle="1" w:styleId="hljs-variable">
-    <w:name w:val="hljs-variable"/>
-    <w:basedOn w:val="DefaultParagraphFont"/>
-    <w:rsid w:val="004B5B56"/>
-  </w:style>
-  <w:style w:type="character" w:customStyle="1" w:styleId="hljs-operator">
-    <w:name w:val="hljs-operator"/>
-    <w:basedOn w:val="DefaultParagraphFont"/>
-    <w:rsid w:val="004B5B56"/>
-  </w:style>
-  <w:style w:type="character" w:customStyle="1" w:styleId="hljs-string">
-    <w:name w:val="hljs-string"/>
-    <w:basedOn w:val="DefaultParagraphFont"/>
-    <w:rsid w:val="004B5B56"/>
-  </w:style>
-  <w:style w:type="character" w:customStyle="1" w:styleId="hljs-comment">
-    <w:name w:val="hljs-comment"/>
-    <w:basedOn w:val="DefaultParagraphFont"/>
-    <w:rsid w:val="004B5B56"/>
+    <w:rsid w:val="00EC2BF4"/>
   </w:style>
 </w:styles>
 </file>

</xml_diff>

<commit_message>
Add class 11 notes
</commit_message>
<xml_diff>
--- a/pdf/class 9/Class 9 ch-3 _ Elementary concept of object and class.docx
+++ b/pdf/class 9/Class 9 ch-3 _ Elementary concept of object and class.docx
@@ -483,7 +483,6 @@
         <w:ind w:left="360"/>
       </w:pPr>
       <w:r>
-        <w:lastRenderedPageBreak/>
         <w:t xml:space="preserve">a. Data </w:t>
       </w:r>
       <w:proofErr w:type="gramStart"/>
@@ -497,6 +496,9 @@
       </w:r>
       <w:r>
         <w:br/>
+      </w:r>
+      <w:r>
+        <w:lastRenderedPageBreak/>
         <w:t xml:space="preserve">c. Both </w:t>
       </w:r>
       <w:proofErr w:type="gramStart"/>
@@ -561,7 +563,7 @@
       </w:pPr>
       <w:r>
         <w:pict>
-          <v:rect id="_x0000_i1028" style="width:0;height:1.5pt" o:hralign="center" o:hrstd="t" o:hr="t" fillcolor="#a0a0a0" stroked="f"/>
+          <v:rect id="_x0000_i1025" style="width:0;height:1.5pt" o:hralign="center" o:hrstd="t" o:hr="t" fillcolor="#a0a0a0" stroked="f"/>
         </w:pict>
       </w:r>
     </w:p>
@@ -832,7 +834,7 @@
       </w:pPr>
       <w:r>
         <w:pict>
-          <v:rect id="_x0000_i1029" style="width:0;height:1.5pt" o:hralign="center" o:hrstd="t" o:hr="t" fillcolor="#a0a0a0" stroked="f"/>
+          <v:rect id="_x0000_i1026" style="width:0;height:1.5pt" o:hralign="center" o:hrstd="t" o:hr="t" fillcolor="#a0a0a0" stroked="f"/>
         </w:pict>
       </w:r>
     </w:p>
@@ -957,7 +959,6 @@
         <w:br/>
       </w:r>
       <w:r>
-        <w:lastRenderedPageBreak/>
         <w:t> </w:t>
       </w:r>
       <w:r>
@@ -1025,6 +1026,7 @@
         <w:spacing w:after="0" w:afterAutospacing="0"/>
       </w:pPr>
       <w:r>
+        <w:lastRenderedPageBreak/>
         <w:t xml:space="preserve">Subject obj1 = new </w:t>
       </w:r>
       <w:proofErr w:type="gramStart"/>
@@ -1176,7 +1178,7 @@
       </w:pPr>
       <w:r>
         <w:pict>
-          <v:rect id="_x0000_i1030" style="width:0;height:1.5pt" o:hralign="center" o:hrstd="t" o:hr="t" fillcolor="#a0a0a0" stroked="f"/>
+          <v:rect id="_x0000_i1027" style="width:0;height:1.5pt" o:hralign="center" o:hrstd="t" o:hr="t" fillcolor="#a0a0a0" stroked="f"/>
         </w:pict>
       </w:r>
     </w:p>
@@ -1290,7 +1292,7 @@
       </w:pPr>
       <w:r>
         <w:pict>
-          <v:rect id="_x0000_i1031" style="width:0;height:1.5pt" o:hralign="center" o:hrstd="t" o:hr="t" fillcolor="#a0a0a0" stroked="f"/>
+          <v:rect id="_x0000_i1028" style="width:0;height:1.5pt" o:hralign="center" o:hrstd="t" o:hr="t" fillcolor="#a0a0a0" stroked="f"/>
         </w:pict>
       </w:r>
     </w:p>
@@ -1350,7 +1352,7 @@
       </w:pPr>
       <w:r>
         <w:pict>
-          <v:rect id="_x0000_i1032" style="width:0;height:1.5pt" o:hralign="center" o:hrstd="t" o:hr="t" fillcolor="#a0a0a0" stroked="f"/>
+          <v:rect id="_x0000_i1029" style="width:0;height:1.5pt" o:hralign="center" o:hrstd="t" o:hr="t" fillcolor="#a0a0a0" stroked="f"/>
         </w:pict>
       </w:r>
     </w:p>
@@ -1410,7 +1412,7 @@
       </w:pPr>
       <w:r>
         <w:pict>
-          <v:rect id="_x0000_i1033" style="width:0;height:1.5pt" o:hralign="center" o:hrstd="t" o:hr="t" fillcolor="#a0a0a0" stroked="f"/>
+          <v:rect id="_x0000_i1030" style="width:0;height:1.5pt" o:hralign="center" o:hrstd="t" o:hr="t" fillcolor="#a0a0a0" stroked="f"/>
         </w:pict>
       </w:r>
     </w:p>
@@ -1423,7 +1425,6 @@
           <w:color w:val="00B050"/>
         </w:rPr>
       </w:pPr>
-      <w:bookmarkStart w:id="0" w:name="_GoBack"/>
       <w:r>
         <w:rPr>
           <w:rStyle w:val="Strong"/>
@@ -1434,7 +1435,6 @@
         <w:t>f. To create the object computer, we use ______ keyword.</w:t>
       </w:r>
     </w:p>
-    <w:bookmarkEnd w:id="0"/>
     <w:p>
       <w:pPr>
         <w:pStyle w:val="NormalWeb"/>
@@ -1651,7 +1651,6 @@
           <w:rStyle w:val="Strong"/>
           <w:color w:val="FF0000"/>
         </w:rPr>
-        <w:lastRenderedPageBreak/>
         <w:t>Answer</w:t>
       </w:r>
       <w:proofErr w:type="gramStart"/>
@@ -1746,6 +1745,7 @@
         <w:spacing w:after="0" w:afterAutospacing="0"/>
       </w:pPr>
       <w:r>
+        <w:lastRenderedPageBreak/>
         <w:t>Example:</w:t>
       </w:r>
     </w:p>
@@ -2169,7 +2169,6 @@
         <w:ind w:left="450"/>
       </w:pPr>
       <w:r>
-        <w:lastRenderedPageBreak/>
         <w:t>a. Student</w:t>
       </w:r>
       <w:r>
@@ -2250,6 +2249,7 @@
       </w:pPr>
       <w:proofErr w:type="gramStart"/>
       <w:r>
+        <w:lastRenderedPageBreak/>
         <w:t>a</w:t>
       </w:r>
       <w:proofErr w:type="gramEnd"/>
@@ -2615,7 +2615,6 @@
           <w:bCs/>
           <w:color w:val="00B050"/>
         </w:rPr>
-        <w:lastRenderedPageBreak/>
         <w:t>2. Each class is made up of ______.</w:t>
       </w:r>
     </w:p>
@@ -2678,7 +2677,6 @@
     <w:p>
       <w:pPr>
         <w:spacing w:after="0"/>
-        <w:jc w:val="center"/>
         <w:rPr>
           <w:rFonts w:ascii="Times New Roman" w:hAnsi="Times New Roman" w:cs="Times New Roman"/>
           <w:b/>
@@ -2686,54 +2684,8 @@
           <w:sz w:val="48"/>
         </w:rPr>
       </w:pPr>
-    </w:p>
-    <w:p>
-      <w:pPr>
-        <w:spacing w:after="0"/>
-        <w:jc w:val="center"/>
-        <w:rPr>
-          <w:rFonts w:ascii="Times New Roman" w:hAnsi="Times New Roman" w:cs="Times New Roman"/>
-          <w:b/>
-          <w:color w:val="FF0000"/>
-          <w:sz w:val="48"/>
-        </w:rPr>
-      </w:pPr>
-    </w:p>
-    <w:p>
-      <w:pPr>
-        <w:spacing w:after="0"/>
-        <w:jc w:val="center"/>
-        <w:rPr>
-          <w:rFonts w:ascii="Times New Roman" w:hAnsi="Times New Roman" w:cs="Times New Roman"/>
-          <w:b/>
-          <w:color w:val="FF0000"/>
-          <w:sz w:val="48"/>
-        </w:rPr>
-      </w:pPr>
-    </w:p>
-    <w:p>
-      <w:pPr>
-        <w:spacing w:after="0"/>
-        <w:jc w:val="center"/>
-        <w:rPr>
-          <w:rFonts w:ascii="Times New Roman" w:hAnsi="Times New Roman" w:cs="Times New Roman"/>
-          <w:b/>
-          <w:color w:val="FF0000"/>
-          <w:sz w:val="48"/>
-        </w:rPr>
-      </w:pPr>
-    </w:p>
-    <w:p>
-      <w:pPr>
-        <w:spacing w:after="0"/>
-        <w:jc w:val="center"/>
-        <w:rPr>
-          <w:rFonts w:ascii="Times New Roman" w:hAnsi="Times New Roman" w:cs="Times New Roman"/>
-          <w:b/>
-          <w:color w:val="FF0000"/>
-          <w:sz w:val="48"/>
-        </w:rPr>
-      </w:pPr>
+      <w:bookmarkStart w:id="0" w:name="_GoBack"/>
+      <w:bookmarkEnd w:id="0"/>
     </w:p>
     <w:p>
       <w:pPr>
@@ -3311,7 +3263,6 @@
           <w:sz w:val="32"/>
           <w:szCs w:val="24"/>
         </w:rPr>
-        <w:lastRenderedPageBreak/>
         <w:t>d. All of these</w:t>
       </w:r>
       <w:r>
@@ -3360,7 +3311,7 @@
           <w:szCs w:val="24"/>
         </w:rPr>
         <w:pict>
-          <v:rect id="_x0000_i1025" style="width:0;height:1.5pt" o:hralign="center" o:hrstd="t" o:hr="t" fillcolor="#a0a0a0" stroked="f"/>
+          <v:rect id="_x0000_i1031" style="width:0;height:1.5pt" o:hralign="center" o:hrstd="t" o:hr="t" fillcolor="#a0a0a0" stroked="f"/>
         </w:pict>
       </w:r>
     </w:p>
@@ -3674,7 +3625,7 @@
           <w:szCs w:val="24"/>
         </w:rPr>
         <w:pict>
-          <v:rect id="_x0000_i1026" style="width:0;height:1.5pt" o:hralign="center" o:hrstd="t" o:hr="t" fillcolor="#a0a0a0" stroked="f"/>
+          <v:rect id="_x0000_i1032" style="width:0;height:1.5pt" o:hralign="center" o:hrstd="t" o:hr="t" fillcolor="#a0a0a0" stroked="f"/>
         </w:pict>
       </w:r>
     </w:p>
@@ -4136,6 +4087,7 @@
           <w:sz w:val="24"/>
           <w:szCs w:val="24"/>
         </w:rPr>
+        <w:lastRenderedPageBreak/>
         <w:t>b</w:t>
       </w:r>
       <w:proofErr w:type="gramEnd"/>
@@ -4463,7 +4415,7 @@
           <w:szCs w:val="24"/>
         </w:rPr>
         <w:pict>
-          <v:rect id="_x0000_i1027" style="width:0;height:1.5pt" o:hralign="center" o:hrstd="t" o:hr="t" fillcolor="#a0a0a0" stroked="f"/>
+          <v:rect id="_x0000_i1033" style="width:0;height:1.5pt" o:hralign="center" o:hrstd="t" o:hr="t" fillcolor="#a0a0a0" stroked="f"/>
         </w:pict>
       </w:r>
     </w:p>
@@ -4729,7 +4681,6 @@
           <w:sz w:val="24"/>
           <w:szCs w:val="24"/>
         </w:rPr>
-        <w:lastRenderedPageBreak/>
         <w:t>How do you define a class in Java?</w:t>
       </w:r>
     </w:p>
@@ -5666,6 +5617,7 @@
           <w:sz w:val="24"/>
           <w:szCs w:val="24"/>
         </w:rPr>
+        <w:lastRenderedPageBreak/>
         <w:t xml:space="preserve">Why </w:t>
       </w:r>
       <w:proofErr w:type="gramStart"/>
@@ -5875,7 +5827,7 @@
     </w:p>
     <w:sectPr>
       <w:pgSz w:w="12240" w:h="15840"/>
-      <w:pgMar w:top="1440" w:right="1440" w:bottom="1440" w:left="1440" w:header="720" w:footer="720" w:gutter="0"/>
+      <w:pgMar w:top="1080" w:right="1440" w:bottom="900" w:left="1440" w:header="720" w:footer="720" w:gutter="0"/>
       <w:pgBorders w:offsetFrom="page">
         <w:top w:val="palmsColor" w:sz="20" w:space="24" w:color="auto"/>
         <w:left w:val="palmsColor" w:sz="20" w:space="24" w:color="auto"/>
@@ -7159,6 +7111,36 @@
     <w:basedOn w:val="DefaultParagraphFont"/>
     <w:rsid w:val="00EC2BF4"/>
   </w:style>
+  <w:style w:type="paragraph" w:styleId="BalloonText">
+    <w:name w:val="Balloon Text"/>
+    <w:basedOn w:val="Normal"/>
+    <w:link w:val="BalloonTextChar"/>
+    <w:uiPriority w:val="99"/>
+    <w:semiHidden/>
+    <w:unhideWhenUsed/>
+    <w:rsid w:val="00656964"/>
+    <w:pPr>
+      <w:spacing w:after="0" w:line="240" w:lineRule="auto"/>
+    </w:pPr>
+    <w:rPr>
+      <w:rFonts w:ascii="Segoe UI" w:hAnsi="Segoe UI" w:cs="Segoe UI"/>
+      <w:sz w:val="18"/>
+      <w:szCs w:val="18"/>
+    </w:rPr>
+  </w:style>
+  <w:style w:type="character" w:customStyle="1" w:styleId="BalloonTextChar">
+    <w:name w:val="Balloon Text Char"/>
+    <w:basedOn w:val="DefaultParagraphFont"/>
+    <w:link w:val="BalloonText"/>
+    <w:uiPriority w:val="99"/>
+    <w:semiHidden/>
+    <w:rsid w:val="00656964"/>
+    <w:rPr>
+      <w:rFonts w:ascii="Segoe UI" w:hAnsi="Segoe UI" w:cs="Segoe UI"/>
+      <w:sz w:val="18"/>
+      <w:szCs w:val="18"/>
+    </w:rPr>
+  </w:style>
 </w:styles>
 </file>
 

</xml_diff>